<commit_message>
Git da clonare | 30.01.2026
</commit_message>
<xml_diff>
--- a/4_Diari/Diario di Lavoro.docx
+++ b/4_Diari/Diario di Lavoro.docx
@@ -5,9 +5,6 @@
     <w:p>
       <w:pPr>
         <w:pStyle w:val="Titolo"/>
-        <w:pBdr>
-          <w:bottom w:val="single" w:sz="4" w:space="4" w:color="auto"/>
-        </w:pBdr>
         <w:rPr>
           <w:rFonts w:ascii="Arial" w:hAnsi="Arial" w:cs="Arial"/>
           <w:color w:val="auto"/>
@@ -158,8 +155,8 @@
         <w:tblLook w:val="04A0" w:firstRow="1" w:lastRow="0" w:firstColumn="1" w:lastColumn="0" w:noHBand="0" w:noVBand="1"/>
       </w:tblPr>
       <w:tblGrid>
-        <w:gridCol w:w="4607"/>
-        <w:gridCol w:w="5021"/>
+        <w:gridCol w:w="1555"/>
+        <w:gridCol w:w="8073"/>
       </w:tblGrid>
       <w:tr>
         <w:tc>
@@ -186,10 +183,12 @@
       <w:tr>
         <w:tc>
           <w:tcPr>
-            <w:tcW w:w="4607" w:type="dxa"/>
+            <w:tcW w:w="1555" w:type="dxa"/>
+            <w:vAlign w:val="center"/>
           </w:tcPr>
           <w:p>
             <w:pPr>
+              <w:jc w:val="center"/>
               <w:rPr>
                 <w:rFonts w:ascii="Arial" w:hAnsi="Arial" w:cs="Arial"/>
               </w:rPr>
@@ -207,7 +206,7 @@
         </w:tc>
         <w:tc>
           <w:tcPr>
-            <w:tcW w:w="5021" w:type="dxa"/>
+            <w:tcW w:w="8073" w:type="dxa"/>
           </w:tcPr>
           <w:p>
             <w:pPr>
@@ -246,7 +245,8 @@
       <w:tr>
         <w:tc>
           <w:tcPr>
-            <w:tcW w:w="4607" w:type="dxa"/>
+            <w:tcW w:w="1555" w:type="dxa"/>
+            <w:vAlign w:val="center"/>
           </w:tcPr>
           <w:p>
             <w:pPr>
@@ -270,7 +270,7 @@
         </w:tc>
         <w:tc>
           <w:tcPr>
-            <w:tcW w:w="5021" w:type="dxa"/>
+            <w:tcW w:w="8073" w:type="dxa"/>
           </w:tcPr>
           <w:p>
             <w:pPr>
@@ -290,7 +290,8 @@
       <w:tr>
         <w:tc>
           <w:tcPr>
-            <w:tcW w:w="4607" w:type="dxa"/>
+            <w:tcW w:w="1555" w:type="dxa"/>
+            <w:vAlign w:val="center"/>
           </w:tcPr>
           <w:p>
             <w:pPr>
@@ -308,7 +309,7 @@
         </w:tc>
         <w:tc>
           <w:tcPr>
-            <w:tcW w:w="5021" w:type="dxa"/>
+            <w:tcW w:w="8073" w:type="dxa"/>
           </w:tcPr>
           <w:p>
             <w:pPr>
@@ -416,7 +417,8 @@
       <w:tr>
         <w:tc>
           <w:tcPr>
-            <w:tcW w:w="4607" w:type="dxa"/>
+            <w:tcW w:w="1555" w:type="dxa"/>
+            <w:vAlign w:val="center"/>
           </w:tcPr>
           <w:p>
             <w:pPr>
@@ -434,7 +436,7 @@
         </w:tc>
         <w:tc>
           <w:tcPr>
-            <w:tcW w:w="5021" w:type="dxa"/>
+            <w:tcW w:w="8073" w:type="dxa"/>
           </w:tcPr>
           <w:p>
             <w:pPr>
@@ -618,6 +620,23 @@
           </w:p>
         </w:tc>
       </w:tr>
+    </w:tbl>
+    <w:p>
+      <w:pPr>
+        <w:rPr>
+          <w:rFonts w:ascii="Arial" w:hAnsi="Arial" w:cs="Arial"/>
+        </w:rPr>
+      </w:pPr>
+    </w:p>
+    <w:tbl>
+      <w:tblPr>
+        <w:tblStyle w:val="Grigliatabella"/>
+        <w:tblW w:w="0" w:type="auto"/>
+        <w:tblLook w:val="04A0" w:firstRow="1" w:lastRow="0" w:firstColumn="1" w:lastColumn="0" w:noHBand="0" w:noVBand="1"/>
+      </w:tblPr>
+      <w:tblGrid>
+        <w:gridCol w:w="9628"/>
+      </w:tblGrid>
       <w:tr>
         <w:tc>
           <w:tcPr>
@@ -653,6 +672,23 @@
           </w:p>
         </w:tc>
       </w:tr>
+    </w:tbl>
+    <w:p>
+      <w:pPr>
+        <w:rPr>
+          <w:rFonts w:ascii="Arial" w:hAnsi="Arial" w:cs="Arial"/>
+        </w:rPr>
+      </w:pPr>
+    </w:p>
+    <w:tbl>
+      <w:tblPr>
+        <w:tblStyle w:val="Grigliatabella"/>
+        <w:tblW w:w="0" w:type="auto"/>
+        <w:tblLook w:val="04A0" w:firstRow="1" w:lastRow="0" w:firstColumn="1" w:lastColumn="0" w:noHBand="0" w:noVBand="1"/>
+      </w:tblPr>
+      <w:tblGrid>
+        <w:gridCol w:w="9628"/>
+      </w:tblGrid>
       <w:tr>
         <w:tc>
           <w:tcPr>
@@ -689,21 +725,672 @@
               <w:rPr>
                 <w:rFonts w:ascii="Arial" w:hAnsi="Arial" w:cs="Arial"/>
               </w:rPr>
-              <w:t xml:space="preserve">Finire diagramma di flusso, fare il </w:t>
+              <w:t>Finire diagramma di flusso, finire la fase di progettazione.</w:t>
+            </w:r>
+          </w:p>
+        </w:tc>
+      </w:tr>
+    </w:tbl>
+    <w:p>
+      <w:pPr>
+        <w:rPr>
+          <w:rFonts w:ascii="Arial" w:hAnsi="Arial" w:cs="Arial"/>
+        </w:rPr>
+      </w:pPr>
+    </w:p>
+    <w:p>
+      <w:pPr>
+        <w:rPr>
+          <w:rFonts w:ascii="Arial" w:hAnsi="Arial" w:cs="Arial"/>
+        </w:rPr>
+      </w:pPr>
+      <w:r>
+        <w:rPr>
+          <w:rFonts w:ascii="Arial" w:hAnsi="Arial" w:cs="Arial"/>
+        </w:rPr>
+        <w:br w:type="page"/>
+      </w:r>
+    </w:p>
+    <w:tbl>
+      <w:tblPr>
+        <w:tblStyle w:val="Grigliatabella"/>
+        <w:tblW w:w="9634" w:type="dxa"/>
+        <w:tblLook w:val="04A0" w:firstRow="1" w:lastRow="0" w:firstColumn="1" w:lastColumn="0" w:noHBand="0" w:noVBand="1"/>
+      </w:tblPr>
+      <w:tblGrid>
+        <w:gridCol w:w="4803"/>
+        <w:gridCol w:w="4831"/>
+      </w:tblGrid>
+      <w:tr>
+        <w:trPr>
+          <w:trHeight w:hRule="exact" w:val="397"/>
+        </w:trPr>
+        <w:tc>
+          <w:tcPr>
+            <w:tcW w:w="4803" w:type="dxa"/>
+            <w:vAlign w:val="center"/>
+          </w:tcPr>
+          <w:p>
+            <w:pPr>
+              <w:rPr>
+                <w:rFonts w:ascii="Arial" w:hAnsi="Arial" w:cs="Arial"/>
+              </w:rPr>
+            </w:pPr>
+            <w:r>
+              <w:rPr>
+                <w:rFonts w:ascii="Arial" w:hAnsi="Arial" w:cs="Arial"/>
+              </w:rPr>
+              <w:lastRenderedPageBreak/>
+              <w:t>Luogo</w:t>
+            </w:r>
+          </w:p>
+        </w:tc>
+        <w:tc>
+          <w:tcPr>
+            <w:tcW w:w="4831" w:type="dxa"/>
+            <w:vAlign w:val="center"/>
+          </w:tcPr>
+          <w:p>
+            <w:pPr>
+              <w:pStyle w:val="Nessunaspaziatura"/>
+              <w:spacing w:line="360" w:lineRule="auto"/>
+              <w:rPr>
+                <w:rFonts w:ascii="Arial" w:hAnsi="Arial" w:cs="Arial"/>
+              </w:rPr>
+            </w:pPr>
+            <w:r>
+              <w:rPr>
+                <w:rFonts w:ascii="Arial" w:hAnsi="Arial" w:cs="Arial"/>
+              </w:rPr>
+              <w:t>Canobbio</w:t>
+            </w:r>
+          </w:p>
+        </w:tc>
+      </w:tr>
+      <w:tr>
+        <w:trPr>
+          <w:trHeight w:hRule="exact" w:val="397"/>
+        </w:trPr>
+        <w:tc>
+          <w:tcPr>
+            <w:tcW w:w="4803" w:type="dxa"/>
+            <w:vAlign w:val="center"/>
+          </w:tcPr>
+          <w:p>
+            <w:pPr>
+              <w:rPr>
+                <w:rFonts w:ascii="Arial" w:hAnsi="Arial" w:cs="Arial"/>
+              </w:rPr>
+            </w:pPr>
+            <w:r>
+              <w:rPr>
+                <w:rFonts w:ascii="Arial" w:hAnsi="Arial" w:cs="Arial"/>
+              </w:rPr>
+              <w:t>Data</w:t>
+            </w:r>
+          </w:p>
+        </w:tc>
+        <w:tc>
+          <w:tcPr>
+            <w:tcW w:w="4831" w:type="dxa"/>
+            <w:vAlign w:val="center"/>
+          </w:tcPr>
+          <w:p>
+            <w:pPr>
+              <w:rPr>
+                <w:rFonts w:ascii="Arial" w:hAnsi="Arial" w:cs="Arial"/>
+              </w:rPr>
+            </w:pPr>
+            <w:r>
+              <w:rPr>
+                <w:rFonts w:ascii="Arial" w:hAnsi="Arial" w:cs="Arial"/>
+              </w:rPr>
+              <w:t>30</w:t>
+            </w:r>
+            <w:r>
+              <w:rPr>
+                <w:rFonts w:ascii="Arial" w:hAnsi="Arial" w:cs="Arial"/>
+              </w:rPr>
+              <w:t>.01.2026</w:t>
+            </w:r>
+          </w:p>
+        </w:tc>
+      </w:tr>
+    </w:tbl>
+    <w:p>
+      <w:pPr>
+        <w:rPr>
+          <w:rFonts w:ascii="Arial" w:hAnsi="Arial" w:cs="Arial"/>
+        </w:rPr>
+      </w:pPr>
+    </w:p>
+    <w:tbl>
+      <w:tblPr>
+        <w:tblStyle w:val="Grigliatabella"/>
+        <w:tblW w:w="0" w:type="auto"/>
+        <w:tblLook w:val="04A0" w:firstRow="1" w:lastRow="0" w:firstColumn="1" w:lastColumn="0" w:noHBand="0" w:noVBand="1"/>
+      </w:tblPr>
+      <w:tblGrid>
+        <w:gridCol w:w="1555"/>
+        <w:gridCol w:w="8073"/>
+      </w:tblGrid>
+      <w:tr>
+        <w:tc>
+          <w:tcPr>
+            <w:tcW w:w="9628" w:type="dxa"/>
+            <w:gridSpan w:val="2"/>
+            <w:shd w:val="clear" w:color="auto" w:fill="D9D9D9" w:themeFill="background1" w:themeFillShade="D9"/>
+          </w:tcPr>
+          <w:p>
+            <w:pPr>
+              <w:rPr>
+                <w:rFonts w:ascii="Arial" w:hAnsi="Arial" w:cs="Arial"/>
+              </w:rPr>
+            </w:pPr>
+            <w:r>
+              <w:rPr>
+                <w:rFonts w:ascii="Arial" w:hAnsi="Arial" w:cs="Arial"/>
+              </w:rPr>
+              <w:t>Lavori svolti</w:t>
+            </w:r>
+          </w:p>
+        </w:tc>
+      </w:tr>
+      <w:tr>
+        <w:tc>
+          <w:tcPr>
+            <w:tcW w:w="1555" w:type="dxa"/>
+            <w:vAlign w:val="center"/>
+          </w:tcPr>
+          <w:p>
+            <w:pPr>
+              <w:jc w:val="center"/>
+              <w:rPr>
+                <w:rFonts w:ascii="Arial" w:hAnsi="Arial" w:cs="Arial"/>
+              </w:rPr>
+            </w:pPr>
+            <w:r>
+              <w:rPr>
+                <w:rFonts w:ascii="Arial" w:hAnsi="Arial" w:cs="Arial"/>
+              </w:rPr>
+              <w:t>8:20-9:35</w:t>
+            </w:r>
+          </w:p>
+        </w:tc>
+        <w:tc>
+          <w:tcPr>
+            <w:tcW w:w="8073" w:type="dxa"/>
+          </w:tcPr>
+          <w:p>
+            <w:pPr>
+              <w:jc w:val="both"/>
+              <w:rPr>
+                <w:rFonts w:ascii="Arial" w:hAnsi="Arial" w:cs="Arial"/>
+              </w:rPr>
+            </w:pPr>
+            <w:r>
+              <w:rPr>
+                <w:rFonts w:ascii="Arial" w:hAnsi="Arial" w:cs="Arial"/>
+              </w:rPr>
+              <w:t>Tutti: Lavoro di valutazione incrociata dei progetti individuali.</w:t>
+            </w:r>
+          </w:p>
+        </w:tc>
+      </w:tr>
+      <w:tr>
+        <w:tc>
+          <w:tcPr>
+            <w:tcW w:w="1555" w:type="dxa"/>
+            <w:vAlign w:val="center"/>
+          </w:tcPr>
+          <w:p>
+            <w:pPr>
+              <w:rPr>
+                <w:rFonts w:ascii="Arial" w:hAnsi="Arial" w:cs="Arial"/>
+              </w:rPr>
+            </w:pPr>
+            <w:r>
+              <w:rPr>
+                <w:rFonts w:ascii="Arial" w:hAnsi="Arial" w:cs="Arial"/>
+              </w:rPr>
+              <w:t xml:space="preserve"> 9:50-11:35</w:t>
+            </w:r>
+          </w:p>
+        </w:tc>
+        <w:tc>
+          <w:tcPr>
+            <w:tcW w:w="8073" w:type="dxa"/>
+          </w:tcPr>
+          <w:p>
+            <w:pPr>
+              <w:rPr>
+                <w:rFonts w:ascii="Arial" w:hAnsi="Arial" w:cs="Arial"/>
+              </w:rPr>
+            </w:pPr>
+            <w:r>
+              <w:rPr>
+                <w:rFonts w:ascii="Arial" w:hAnsi="Arial" w:cs="Arial"/>
+              </w:rPr>
+              <w:t>Tutti: Conclusione del lavoro di valutazione e ricevimento delle note del primo semestre.</w:t>
+            </w:r>
+          </w:p>
+          <w:p>
+            <w:pPr>
+              <w:rPr>
+                <w:rFonts w:ascii="Arial" w:hAnsi="Arial" w:cs="Arial"/>
+              </w:rPr>
+            </w:pPr>
+            <w:r>
+              <w:rPr>
+                <w:rFonts w:ascii="Arial" w:hAnsi="Arial" w:cs="Arial"/>
+              </w:rPr>
+              <w:t xml:space="preserve">Ivan, Yasser, Quan: Modifiche finali al </w:t>
             </w:r>
             <w:proofErr w:type="spellStart"/>
             <w:r>
               <w:rPr>
                 <w:rFonts w:ascii="Arial" w:hAnsi="Arial" w:cs="Arial"/>
               </w:rPr>
-              <w:t>gantt</w:t>
+              <w:t>QdC</w:t>
             </w:r>
             <w:proofErr w:type="spellEnd"/>
-            <w:r>
-              <w:rPr>
-                <w:rFonts w:ascii="Arial" w:hAnsi="Arial" w:cs="Arial"/>
-              </w:rPr>
-              <w:t>, finire la fase di progettazione.</w:t>
+          </w:p>
+          <w:p>
+            <w:pPr>
+              <w:rPr>
+                <w:rFonts w:ascii="Arial" w:hAnsi="Arial" w:cs="Arial"/>
+              </w:rPr>
+            </w:pPr>
+            <w:r>
+              <w:rPr>
+                <w:rFonts w:ascii="Arial" w:hAnsi="Arial" w:cs="Arial"/>
+              </w:rPr>
+              <w:t>Quan: Dialogo con il professore sul proprio progetto personale</w:t>
+            </w:r>
+          </w:p>
+        </w:tc>
+      </w:tr>
+      <w:tr>
+        <w:tc>
+          <w:tcPr>
+            <w:tcW w:w="1555" w:type="dxa"/>
+            <w:vAlign w:val="center"/>
+          </w:tcPr>
+          <w:p>
+            <w:pPr>
+              <w:rPr>
+                <w:rFonts w:ascii="Arial" w:hAnsi="Arial" w:cs="Arial"/>
+              </w:rPr>
+            </w:pPr>
+            <w:r>
+              <w:rPr>
+                <w:rFonts w:ascii="Arial" w:hAnsi="Arial" w:cs="Arial"/>
+              </w:rPr>
+              <w:t>12:30-14:00</w:t>
+            </w:r>
+          </w:p>
+        </w:tc>
+        <w:tc>
+          <w:tcPr>
+            <w:tcW w:w="8073" w:type="dxa"/>
+          </w:tcPr>
+          <w:p>
+            <w:pPr>
+              <w:jc w:val="both"/>
+              <w:rPr>
+                <w:rFonts w:ascii="Arial" w:hAnsi="Arial" w:cs="Arial"/>
+              </w:rPr>
+            </w:pPr>
+            <w:r>
+              <w:rPr>
+                <w:rFonts w:ascii="Arial" w:hAnsi="Arial" w:cs="Arial"/>
+              </w:rPr>
+              <w:t xml:space="preserve">Discussione del </w:t>
+            </w:r>
+            <w:proofErr w:type="spellStart"/>
+            <w:r>
+              <w:rPr>
+                <w:rFonts w:ascii="Arial" w:hAnsi="Arial" w:cs="Arial"/>
+              </w:rPr>
+              <w:t>QdC</w:t>
+            </w:r>
+            <w:proofErr w:type="spellEnd"/>
+            <w:r>
+              <w:rPr>
+                <w:rFonts w:ascii="Arial" w:hAnsi="Arial" w:cs="Arial"/>
+              </w:rPr>
+              <w:t xml:space="preserve"> e del progetto con il professore</w:t>
+            </w:r>
+            <w:r>
+              <w:rPr>
+                <w:rFonts w:ascii="Arial" w:hAnsi="Arial" w:cs="Arial"/>
+              </w:rPr>
+              <w:t>.</w:t>
+            </w:r>
+          </w:p>
+          <w:p>
+            <w:pPr>
+              <w:jc w:val="both"/>
+              <w:rPr>
+                <w:rFonts w:ascii="Arial" w:hAnsi="Arial" w:cs="Arial"/>
+              </w:rPr>
+            </w:pPr>
+            <w:r>
+              <w:rPr>
+                <w:rFonts w:ascii="Arial" w:hAnsi="Arial" w:cs="Arial"/>
+              </w:rPr>
+              <w:t xml:space="preserve">Dopodiché discussione tra il gruppo di come fare cosa. </w:t>
+            </w:r>
+          </w:p>
+          <w:p>
+            <w:pPr>
+              <w:jc w:val="both"/>
+              <w:rPr>
+                <w:rFonts w:ascii="Arial" w:hAnsi="Arial" w:cs="Arial"/>
+              </w:rPr>
+            </w:pPr>
+            <w:r>
+              <w:rPr>
+                <w:rFonts w:ascii="Arial" w:hAnsi="Arial" w:cs="Arial"/>
+              </w:rPr>
+              <w:t xml:space="preserve">Abbiamo giunto la conclusione che </w:t>
+            </w:r>
+            <w:r>
+              <w:rPr>
+                <w:rFonts w:ascii="Arial" w:hAnsi="Arial" w:cs="Arial"/>
+                <w:color w:val="FF0000"/>
+              </w:rPr>
+              <w:t>facciamo</w:t>
+            </w:r>
+          </w:p>
+          <w:p>
+            <w:pPr>
+              <w:jc w:val="both"/>
+              <w:rPr>
+                <w:rFonts w:ascii="Arial" w:hAnsi="Arial" w:cs="Arial"/>
+              </w:rPr>
+            </w:pPr>
+            <w:r>
+              <w:rPr>
+                <w:rFonts w:ascii="Arial" w:hAnsi="Arial" w:cs="Arial"/>
+              </w:rPr>
+              <w:t xml:space="preserve">Abbiamo pensato all’ordine di come faremo ogni </w:t>
+            </w:r>
+            <w:r>
+              <w:rPr>
+                <w:rFonts w:ascii="Arial" w:hAnsi="Arial" w:cs="Arial"/>
+              </w:rPr>
+              <w:t>aspetto del gioco -&gt; preparato i milestone.</w:t>
+            </w:r>
+          </w:p>
+        </w:tc>
+      </w:tr>
+      <w:tr>
+        <w:tc>
+          <w:tcPr>
+            <w:tcW w:w="1555" w:type="dxa"/>
+            <w:vAlign w:val="center"/>
+          </w:tcPr>
+          <w:p>
+            <w:pPr>
+              <w:rPr>
+                <w:rFonts w:ascii="Arial" w:hAnsi="Arial" w:cs="Arial"/>
+              </w:rPr>
+            </w:pPr>
+            <w:r>
+              <w:rPr>
+                <w:rFonts w:ascii="Arial" w:hAnsi="Arial" w:cs="Arial"/>
+              </w:rPr>
+              <w:t>14:15-15:45</w:t>
+            </w:r>
+          </w:p>
+        </w:tc>
+        <w:tc>
+          <w:tcPr>
+            <w:tcW w:w="8073" w:type="dxa"/>
+          </w:tcPr>
+          <w:p>
+            <w:pPr>
+              <w:rPr>
+                <w:rFonts w:ascii="Arial" w:hAnsi="Arial" w:cs="Arial"/>
+              </w:rPr>
+            </w:pPr>
+            <w:r>
+              <w:rPr>
+                <w:rFonts w:ascii="Arial" w:hAnsi="Arial" w:cs="Arial"/>
+              </w:rPr>
+              <w:t xml:space="preserve">Ci siamo andati a informare su come funziona </w:t>
+            </w:r>
+            <w:proofErr w:type="spellStart"/>
+            <w:r>
+              <w:rPr>
+                <w:rFonts w:ascii="Arial" w:hAnsi="Arial" w:cs="Arial"/>
+              </w:rPr>
+              <w:t>github</w:t>
+            </w:r>
+            <w:proofErr w:type="spellEnd"/>
+            <w:r>
+              <w:rPr>
+                <w:rFonts w:ascii="Arial" w:hAnsi="Arial" w:cs="Arial"/>
+              </w:rPr>
+              <w:t xml:space="preserve"> e poi ognuno a continuato quello che stava facendo fino alla fine della lezione:</w:t>
+            </w:r>
+          </w:p>
+          <w:p>
+            <w:pPr>
+              <w:rPr>
+                <w:rFonts w:ascii="Arial" w:hAnsi="Arial" w:cs="Arial"/>
+              </w:rPr>
+            </w:pPr>
+            <w:r>
+              <w:rPr>
+                <w:rFonts w:ascii="Arial" w:hAnsi="Arial" w:cs="Arial"/>
+              </w:rPr>
+              <w:t>Yasser: Requisiti</w:t>
+            </w:r>
+          </w:p>
+          <w:p>
+            <w:pPr>
+              <w:rPr>
+                <w:rFonts w:ascii="Arial" w:hAnsi="Arial" w:cs="Arial"/>
+              </w:rPr>
+            </w:pPr>
+            <w:proofErr w:type="spellStart"/>
+            <w:r>
+              <w:rPr>
+                <w:rFonts w:ascii="Arial" w:hAnsi="Arial" w:cs="Arial"/>
+              </w:rPr>
+              <w:t>Sidon</w:t>
+            </w:r>
+            <w:proofErr w:type="spellEnd"/>
+            <w:r>
+              <w:rPr>
+                <w:rFonts w:ascii="Arial" w:hAnsi="Arial" w:cs="Arial"/>
+              </w:rPr>
+              <w:t xml:space="preserve"> e Ivan: Diagramma delle classi</w:t>
+            </w:r>
+          </w:p>
+          <w:p>
+            <w:pPr>
+              <w:rPr>
+                <w:rFonts w:ascii="Arial" w:hAnsi="Arial" w:cs="Arial"/>
+              </w:rPr>
+            </w:pPr>
+            <w:r>
+              <w:rPr>
+                <w:rFonts w:ascii="Arial" w:hAnsi="Arial" w:cs="Arial"/>
+              </w:rPr>
+              <w:t xml:space="preserve">Quan: </w:t>
+            </w:r>
+            <w:proofErr w:type="spellStart"/>
+            <w:r>
+              <w:rPr>
+                <w:rFonts w:ascii="Arial" w:hAnsi="Arial" w:cs="Arial"/>
+              </w:rPr>
+              <w:t>Swimlanes</w:t>
+            </w:r>
+            <w:proofErr w:type="spellEnd"/>
+          </w:p>
+        </w:tc>
+      </w:tr>
+    </w:tbl>
+    <w:p>
+      <w:pPr>
+        <w:rPr>
+          <w:rFonts w:ascii="Arial" w:hAnsi="Arial" w:cs="Arial"/>
+        </w:rPr>
+      </w:pPr>
+    </w:p>
+    <w:tbl>
+      <w:tblPr>
+        <w:tblStyle w:val="Grigliatabella"/>
+        <w:tblW w:w="0" w:type="auto"/>
+        <w:tblLook w:val="04A0" w:firstRow="1" w:lastRow="0" w:firstColumn="1" w:lastColumn="0" w:noHBand="0" w:noVBand="1"/>
+      </w:tblPr>
+      <w:tblGrid>
+        <w:gridCol w:w="9628"/>
+      </w:tblGrid>
+      <w:tr>
+        <w:tc>
+          <w:tcPr>
+            <w:tcW w:w="9628" w:type="dxa"/>
+            <w:shd w:val="clear" w:color="auto" w:fill="D9D9D9" w:themeFill="background1" w:themeFillShade="D9"/>
+          </w:tcPr>
+          <w:p>
+            <w:pPr>
+              <w:rPr>
+                <w:rFonts w:ascii="Arial" w:hAnsi="Arial" w:cs="Arial"/>
+              </w:rPr>
+            </w:pPr>
+            <w:r>
+              <w:rPr>
+                <w:rFonts w:ascii="Arial" w:hAnsi="Arial" w:cs="Arial"/>
+              </w:rPr>
+              <w:t>Problemi riscontrati e soluzioni adottate</w:t>
+            </w:r>
+          </w:p>
+        </w:tc>
+      </w:tr>
+      <w:tr>
+        <w:tc>
+          <w:tcPr>
+            <w:tcW w:w="9628" w:type="dxa"/>
+          </w:tcPr>
+          <w:p>
+            <w:pPr>
+              <w:rPr>
+                <w:rFonts w:ascii="Arial" w:hAnsi="Arial" w:cs="Arial"/>
+              </w:rPr>
+            </w:pPr>
+          </w:p>
+        </w:tc>
+      </w:tr>
+    </w:tbl>
+    <w:p>
+      <w:pPr>
+        <w:rPr>
+          <w:rFonts w:ascii="Arial" w:hAnsi="Arial" w:cs="Arial"/>
+        </w:rPr>
+      </w:pPr>
+    </w:p>
+    <w:tbl>
+      <w:tblPr>
+        <w:tblStyle w:val="Grigliatabella"/>
+        <w:tblW w:w="0" w:type="auto"/>
+        <w:tblLook w:val="04A0" w:firstRow="1" w:lastRow="0" w:firstColumn="1" w:lastColumn="0" w:noHBand="0" w:noVBand="1"/>
+      </w:tblPr>
+      <w:tblGrid>
+        <w:gridCol w:w="9628"/>
+      </w:tblGrid>
+      <w:tr>
+        <w:tc>
+          <w:tcPr>
+            <w:tcW w:w="9628" w:type="dxa"/>
+            <w:shd w:val="clear" w:color="auto" w:fill="D9D9D9" w:themeFill="background1" w:themeFillShade="D9"/>
+          </w:tcPr>
+          <w:p>
+            <w:pPr>
+              <w:rPr>
+                <w:rFonts w:ascii="Arial" w:hAnsi="Arial" w:cs="Arial"/>
+              </w:rPr>
+            </w:pPr>
+            <w:r>
+              <w:rPr>
+                <w:rFonts w:ascii="Arial" w:hAnsi="Arial" w:cs="Arial"/>
+              </w:rPr>
+              <w:t>Punto della situazione rispetto alla pianificazione</w:t>
+            </w:r>
+          </w:p>
+        </w:tc>
+      </w:tr>
+      <w:tr>
+        <w:tc>
+          <w:tcPr>
+            <w:tcW w:w="9628" w:type="dxa"/>
+          </w:tcPr>
+          <w:p>
+            <w:pPr>
+              <w:rPr>
+                <w:rFonts w:ascii="Arial" w:hAnsi="Arial" w:cs="Arial"/>
+              </w:rPr>
+            </w:pPr>
+          </w:p>
+        </w:tc>
+      </w:tr>
+    </w:tbl>
+    <w:p>
+      <w:pPr>
+        <w:rPr>
+          <w:rFonts w:ascii="Arial" w:hAnsi="Arial" w:cs="Arial"/>
+        </w:rPr>
+      </w:pPr>
+    </w:p>
+    <w:tbl>
+      <w:tblPr>
+        <w:tblStyle w:val="Grigliatabella"/>
+        <w:tblW w:w="0" w:type="auto"/>
+        <w:tblLook w:val="04A0" w:firstRow="1" w:lastRow="0" w:firstColumn="1" w:lastColumn="0" w:noHBand="0" w:noVBand="1"/>
+      </w:tblPr>
+      <w:tblGrid>
+        <w:gridCol w:w="9628"/>
+      </w:tblGrid>
+      <w:tr>
+        <w:tc>
+          <w:tcPr>
+            <w:tcW w:w="9628" w:type="dxa"/>
+            <w:shd w:val="clear" w:color="auto" w:fill="D9D9D9" w:themeFill="background1" w:themeFillShade="D9"/>
+          </w:tcPr>
+          <w:p>
+            <w:pPr>
+              <w:rPr>
+                <w:rFonts w:ascii="Arial" w:hAnsi="Arial" w:cs="Arial"/>
+              </w:rPr>
+            </w:pPr>
+            <w:r>
+              <w:rPr>
+                <w:rFonts w:ascii="Arial" w:hAnsi="Arial" w:cs="Arial"/>
+              </w:rPr>
+              <w:t>Programma di massima per la prossima giornata di lavoro</w:t>
+            </w:r>
+          </w:p>
+        </w:tc>
+      </w:tr>
+      <w:tr>
+        <w:tc>
+          <w:tcPr>
+            <w:tcW w:w="9628" w:type="dxa"/>
+          </w:tcPr>
+          <w:p>
+            <w:pPr>
+              <w:rPr>
+                <w:rFonts w:ascii="Arial" w:hAnsi="Arial" w:cs="Arial"/>
+              </w:rPr>
+            </w:pPr>
+            <w:r>
+              <w:rPr>
+                <w:rFonts w:ascii="Arial" w:hAnsi="Arial" w:cs="Arial"/>
+              </w:rPr>
+              <w:t>Finire diagramma di flusso, finire la fase di progettazione.</w:t>
             </w:r>
           </w:p>
         </w:tc>
@@ -965,7 +1652,21 @@
       <w:rPr>
         <w:rFonts w:ascii="Arial" w:hAnsi="Arial" w:cs="Arial"/>
       </w:rPr>
-      <w:t>, Ivan Ostroumov I3BD</w:t>
+      <w:t xml:space="preserve">, Ivan </w:t>
+    </w:r>
+    <w:proofErr w:type="spellStart"/>
+    <w:r>
+      <w:rPr>
+        <w:rFonts w:ascii="Arial" w:hAnsi="Arial" w:cs="Arial"/>
+      </w:rPr>
+      <w:t>Ostroumov</w:t>
+    </w:r>
+    <w:proofErr w:type="spellEnd"/>
+    <w:r>
+      <w:rPr>
+        <w:rFonts w:ascii="Arial" w:hAnsi="Arial" w:cs="Arial"/>
+      </w:rPr>
+      <w:t xml:space="preserve"> I3BD</w:t>
     </w:r>
   </w:p>
 </w:hdr>
@@ -4997,10 +5698,23 @@
 </file>
 
 <file path=customXml/item1.xml><?xml version="1.0" encoding="utf-8"?>
-<b:Sources xmlns:b="http://schemas.openxmlformats.org/officeDocument/2006/bibliography" xmlns="http://schemas.openxmlformats.org/officeDocument/2006/bibliography" SelectedStyle="\APA.XSL" StyleName="APA"/>
+<p:properties xmlns:p="http://schemas.microsoft.com/office/2006/metadata/properties" xmlns:xsi="http://www.w3.org/2001/XMLSchema-instance" xmlns:pc="http://schemas.microsoft.com/office/infopath/2007/PartnerControls">
+  <documentManagement>
+    <_activity xmlns="9a5989ba-1f3a-4074-8e62-988f1f5a6d91" xsi:nil="true"/>
+  </documentManagement>
+</p:properties>
 </file>
 
 <file path=customXml/item2.xml><?xml version="1.0" encoding="utf-8"?>
+<?mso-contentType ?>
+<FormTemplates xmlns="http://schemas.microsoft.com/sharepoint/v3/contenttype/forms">
+  <Display>DocumentLibraryForm</Display>
+  <Edit>DocumentLibraryForm</Edit>
+  <New>DocumentLibraryForm</New>
+</FormTemplates>
+</file>
+
+<file path=customXml/item3.xml><?xml version="1.0" encoding="utf-8"?>
 <ct:contentTypeSchema xmlns:ct="http://schemas.microsoft.com/office/2006/metadata/contentType" xmlns:ma="http://schemas.microsoft.com/office/2006/metadata/properties/metaAttributes" ct:_="" ma:_="" ma:contentTypeName="Documento" ma:contentTypeID="0x0101001D68984F87EC994ABE7B851987432E7B" ma:contentTypeVersion="13" ma:contentTypeDescription="Creare un nuovo documento." ma:contentTypeScope="" ma:versionID="9735a29966f8059e51308ea1cecd41eb">
   <xsd:schema xmlns:xsd="http://www.w3.org/2001/XMLSchema" xmlns:xs="http://www.w3.org/2001/XMLSchema" xmlns:p="http://schemas.microsoft.com/office/2006/metadata/properties" xmlns:ns3="d8eed4e0-1c4d-4eb7-9d5a-8c6be5a7f7cc" xmlns:ns4="9a5989ba-1f3a-4074-8e62-988f1f5a6d91" targetNamespace="http://schemas.microsoft.com/office/2006/metadata/properties" ma:root="true" ma:fieldsID="10fd3cb04b3c10d561cc1ece84de1cfd" ns3:_="" ns4:_="">
     <xsd:import namespace="d8eed4e0-1c4d-4eb7-9d5a-8c6be5a7f7cc"/>
@@ -5221,32 +5935,29 @@
 </ct:contentTypeSchema>
 </file>
 
-<file path=customXml/item3.xml><?xml version="1.0" encoding="utf-8"?>
-<?mso-contentType ?>
-<FormTemplates xmlns="http://schemas.microsoft.com/sharepoint/v3/contenttype/forms">
-  <Display>DocumentLibraryForm</Display>
-  <Edit>DocumentLibraryForm</Edit>
-  <New>DocumentLibraryForm</New>
-</FormTemplates>
-</file>
-
 <file path=customXml/item4.xml><?xml version="1.0" encoding="utf-8"?>
-<p:properties xmlns:p="http://schemas.microsoft.com/office/2006/metadata/properties" xmlns:xsi="http://www.w3.org/2001/XMLSchema-instance" xmlns:pc="http://schemas.microsoft.com/office/infopath/2007/PartnerControls">
-  <documentManagement>
-    <_activity xmlns="9a5989ba-1f3a-4074-8e62-988f1f5a6d91" xsi:nil="true"/>
-  </documentManagement>
-</p:properties>
+<b:Sources xmlns:b="http://schemas.openxmlformats.org/officeDocument/2006/bibliography" xmlns="http://schemas.openxmlformats.org/officeDocument/2006/bibliography" SelectedStyle="\APA.XSL" StyleName="APA"/>
 </file>
 
 <file path=customXml/itemProps1.xml><?xml version="1.0" encoding="utf-8"?>
-<ds:datastoreItem xmlns:ds="http://schemas.openxmlformats.org/officeDocument/2006/customXml" ds:itemID="{A4D352A7-3801-4E51-8ED0-E5F8E4A7EC31}">
+<ds:datastoreItem xmlns:ds="http://schemas.openxmlformats.org/officeDocument/2006/customXml" ds:itemID="{4C5564E7-A054-43C4-BF74-7A145474E87C}">
   <ds:schemaRefs>
-    <ds:schemaRef ds:uri="http://schemas.openxmlformats.org/officeDocument/2006/bibliography"/>
+    <ds:schemaRef ds:uri="http://schemas.microsoft.com/office/2006/metadata/properties"/>
+    <ds:schemaRef ds:uri="http://schemas.microsoft.com/office/infopath/2007/PartnerControls"/>
+    <ds:schemaRef ds:uri="9a5989ba-1f3a-4074-8e62-988f1f5a6d91"/>
   </ds:schemaRefs>
 </ds:datastoreItem>
 </file>
 
 <file path=customXml/itemProps2.xml><?xml version="1.0" encoding="utf-8"?>
+<ds:datastoreItem xmlns:ds="http://schemas.openxmlformats.org/officeDocument/2006/customXml" ds:itemID="{F88632BD-6596-4D41-8033-40DE95A98259}">
+  <ds:schemaRefs>
+    <ds:schemaRef ds:uri="http://schemas.microsoft.com/sharepoint/v3/contenttype/forms"/>
+  </ds:schemaRefs>
+</ds:datastoreItem>
+</file>
+
+<file path=customXml/itemProps3.xml><?xml version="1.0" encoding="utf-8"?>
 <ds:datastoreItem xmlns:ds="http://schemas.openxmlformats.org/officeDocument/2006/customXml" ds:itemID="{DF47FB3B-BE2E-4282-A583-D09F8A90D7A9}">
   <ds:schemaRefs>
     <ds:schemaRef ds:uri="http://schemas.microsoft.com/office/2006/metadata/contentType"/>
@@ -5265,20 +5976,10 @@
 </ds:datastoreItem>
 </file>
 
-<file path=customXml/itemProps3.xml><?xml version="1.0" encoding="utf-8"?>
-<ds:datastoreItem xmlns:ds="http://schemas.openxmlformats.org/officeDocument/2006/customXml" ds:itemID="{F88632BD-6596-4D41-8033-40DE95A98259}">
+<file path=customXml/itemProps4.xml><?xml version="1.0" encoding="utf-8"?>
+<ds:datastoreItem xmlns:ds="http://schemas.openxmlformats.org/officeDocument/2006/customXml" ds:itemID="{A4D352A7-3801-4E51-8ED0-E5F8E4A7EC31}">
   <ds:schemaRefs>
-    <ds:schemaRef ds:uri="http://schemas.microsoft.com/sharepoint/v3/contenttype/forms"/>
-  </ds:schemaRefs>
-</ds:datastoreItem>
-</file>
-
-<file path=customXml/itemProps4.xml><?xml version="1.0" encoding="utf-8"?>
-<ds:datastoreItem xmlns:ds="http://schemas.openxmlformats.org/officeDocument/2006/customXml" ds:itemID="{4C5564E7-A054-43C4-BF74-7A145474E87C}">
-  <ds:schemaRefs>
-    <ds:schemaRef ds:uri="http://schemas.microsoft.com/office/2006/metadata/properties"/>
-    <ds:schemaRef ds:uri="http://schemas.microsoft.com/office/infopath/2007/PartnerControls"/>
-    <ds:schemaRef ds:uri="9a5989ba-1f3a-4074-8e62-988f1f5a6d91"/>
+    <ds:schemaRef ds:uri="http://schemas.openxmlformats.org/officeDocument/2006/bibliography"/>
   </ds:schemaRefs>
 </ds:datastoreItem>
 </file>
</xml_diff>

<commit_message>
Finito doc fino a punto 4 escluso | 06.02.2026
</commit_message>
<xml_diff>
--- a/4_Diari/Diario di Lavoro.docx
+++ b/4_Diari/Diario di Lavoro.docx
@@ -250,16 +250,11 @@
           </w:tcPr>
           <w:p>
             <w:pPr>
-              <w:rPr>
-                <w:rFonts w:ascii="Arial" w:hAnsi="Arial" w:cs="Arial"/>
-              </w:rPr>
-            </w:pPr>
-            <w:r>
-              <w:rPr>
-                <w:rFonts w:ascii="Arial" w:hAnsi="Arial" w:cs="Arial"/>
-              </w:rPr>
-              <w:t xml:space="preserve"> </w:t>
-            </w:r>
+              <w:jc w:val="center"/>
+              <w:rPr>
+                <w:rFonts w:ascii="Arial" w:hAnsi="Arial" w:cs="Arial"/>
+              </w:rPr>
+            </w:pPr>
             <w:r>
               <w:rPr>
                 <w:rFonts w:ascii="Arial" w:hAnsi="Arial" w:cs="Arial"/>
@@ -295,6 +290,7 @@
           </w:tcPr>
           <w:p>
             <w:pPr>
+              <w:jc w:val="center"/>
               <w:rPr>
                 <w:rFonts w:ascii="Arial" w:hAnsi="Arial" w:cs="Arial"/>
               </w:rPr>
@@ -397,19 +393,11 @@
                 <w:rFonts w:ascii="Arial" w:hAnsi="Arial" w:cs="Arial"/>
               </w:rPr>
             </w:pPr>
-            <w:proofErr w:type="spellStart"/>
-            <w:r>
-              <w:rPr>
-                <w:rFonts w:ascii="Arial" w:hAnsi="Arial" w:cs="Arial"/>
-              </w:rPr>
-              <w:t>Sidon</w:t>
-            </w:r>
-            <w:proofErr w:type="spellEnd"/>
-            <w:r>
-              <w:rPr>
-                <w:rFonts w:ascii="Arial" w:hAnsi="Arial" w:cs="Arial"/>
-              </w:rPr>
-              <w:t>: Diagrammi</w:t>
+            <w:r>
+              <w:rPr>
+                <w:rFonts w:ascii="Arial" w:hAnsi="Arial" w:cs="Arial"/>
+              </w:rPr>
+              <w:t>Sidon: Diagrammi</w:t>
             </w:r>
           </w:p>
         </w:tc>
@@ -422,6 +410,7 @@
           </w:tcPr>
           <w:p>
             <w:pPr>
+              <w:jc w:val="center"/>
               <w:rPr>
                 <w:rFonts w:ascii="Arial" w:hAnsi="Arial" w:cs="Arial"/>
               </w:rPr>
@@ -482,19 +471,11 @@
                 <w:rFonts w:ascii="Arial" w:hAnsi="Arial" w:cs="Arial"/>
               </w:rPr>
             </w:pPr>
-            <w:proofErr w:type="spellStart"/>
-            <w:r>
-              <w:rPr>
-                <w:rFonts w:ascii="Arial" w:hAnsi="Arial" w:cs="Arial"/>
-              </w:rPr>
-              <w:t>Sidon</w:t>
-            </w:r>
-            <w:proofErr w:type="spellEnd"/>
-            <w:r>
-              <w:rPr>
-                <w:rFonts w:ascii="Arial" w:hAnsi="Arial" w:cs="Arial"/>
-              </w:rPr>
-              <w:t xml:space="preserve">: </w:t>
+            <w:r>
+              <w:rPr>
+                <w:rFonts w:ascii="Arial" w:hAnsi="Arial" w:cs="Arial"/>
+              </w:rPr>
+              <w:t xml:space="preserve">Sidon: </w:t>
             </w:r>
             <w:r>
               <w:rPr>
@@ -532,35 +513,7 @@
               <w:rPr>
                 <w:rFonts w:ascii="Arial" w:hAnsi="Arial" w:cs="Arial"/>
               </w:rPr>
-              <w:t xml:space="preserve">Messo tutto insieme e </w:t>
-            </w:r>
-            <w:proofErr w:type="spellStart"/>
-            <w:r>
-              <w:rPr>
-                <w:rFonts w:ascii="Arial" w:hAnsi="Arial" w:cs="Arial"/>
-              </w:rPr>
-              <w:t>commit</w:t>
-            </w:r>
-            <w:proofErr w:type="spellEnd"/>
-            <w:r>
-              <w:rPr>
-                <w:rFonts w:ascii="Arial" w:hAnsi="Arial" w:cs="Arial"/>
-              </w:rPr>
-              <w:t xml:space="preserve"> </w:t>
-            </w:r>
-            <w:proofErr w:type="spellStart"/>
-            <w:r>
-              <w:rPr>
-                <w:rFonts w:ascii="Arial" w:hAnsi="Arial" w:cs="Arial"/>
-              </w:rPr>
-              <w:t>github</w:t>
-            </w:r>
-            <w:proofErr w:type="spellEnd"/>
-            <w:r>
-              <w:rPr>
-                <w:rFonts w:ascii="Arial" w:hAnsi="Arial" w:cs="Arial"/>
-              </w:rPr>
-              <w:t>.</w:t>
+              <w:t>Messo tutto insieme e commit github.</w:t>
             </w:r>
           </w:p>
         </w:tc>
@@ -945,15 +898,16 @@
           </w:tcPr>
           <w:p>
             <w:pPr>
-              <w:rPr>
-                <w:rFonts w:ascii="Arial" w:hAnsi="Arial" w:cs="Arial"/>
-              </w:rPr>
-            </w:pPr>
-            <w:r>
-              <w:rPr>
-                <w:rFonts w:ascii="Arial" w:hAnsi="Arial" w:cs="Arial"/>
-              </w:rPr>
-              <w:t xml:space="preserve"> 9:50-11:35</w:t>
+              <w:jc w:val="center"/>
+              <w:rPr>
+                <w:rFonts w:ascii="Arial" w:hAnsi="Arial" w:cs="Arial"/>
+              </w:rPr>
+            </w:pPr>
+            <w:r>
+              <w:rPr>
+                <w:rFonts w:ascii="Arial" w:hAnsi="Arial" w:cs="Arial"/>
+              </w:rPr>
+              <w:t>9:50-11:35</w:t>
             </w:r>
           </w:p>
         </w:tc>
@@ -984,16 +938,8 @@
               <w:rPr>
                 <w:rFonts w:ascii="Arial" w:hAnsi="Arial" w:cs="Arial"/>
               </w:rPr>
-              <w:t xml:space="preserve">Ivan, Yasser, Quan: Modifiche finali al </w:t>
-            </w:r>
-            <w:proofErr w:type="spellStart"/>
-            <w:r>
-              <w:rPr>
-                <w:rFonts w:ascii="Arial" w:hAnsi="Arial" w:cs="Arial"/>
-              </w:rPr>
-              <w:t>QdC</w:t>
-            </w:r>
-            <w:proofErr w:type="spellEnd"/>
+              <w:t>Ivan, Yasser, Quan: Modifiche finali al QdC</w:t>
+            </w:r>
           </w:p>
           <w:p>
             <w:pPr>
@@ -1018,6 +964,7 @@
           </w:tcPr>
           <w:p>
             <w:pPr>
+              <w:jc w:val="center"/>
               <w:rPr>
                 <w:rFonts w:ascii="Arial" w:hAnsi="Arial" w:cs="Arial"/>
               </w:rPr>
@@ -1045,21 +992,7 @@
               <w:rPr>
                 <w:rFonts w:ascii="Arial" w:hAnsi="Arial" w:cs="Arial"/>
               </w:rPr>
-              <w:t xml:space="preserve">Discussione del </w:t>
-            </w:r>
-            <w:proofErr w:type="spellStart"/>
-            <w:r>
-              <w:rPr>
-                <w:rFonts w:ascii="Arial" w:hAnsi="Arial" w:cs="Arial"/>
-              </w:rPr>
-              <w:t>QdC</w:t>
-            </w:r>
-            <w:proofErr w:type="spellEnd"/>
-            <w:r>
-              <w:rPr>
-                <w:rFonts w:ascii="Arial" w:hAnsi="Arial" w:cs="Arial"/>
-              </w:rPr>
-              <w:t xml:space="preserve"> e del progetto con il professore</w:t>
+              <w:t>Discussione del QdC e del progetto con il professore</w:t>
             </w:r>
             <w:r>
               <w:rPr>
@@ -1105,35 +1038,7 @@
               <w:rPr>
                 <w:rFonts w:ascii="Arial" w:hAnsi="Arial" w:cs="Arial"/>
               </w:rPr>
-              <w:t xml:space="preserve">are a usare </w:t>
-            </w:r>
-            <w:proofErr w:type="spellStart"/>
-            <w:r>
-              <w:rPr>
-                <w:rFonts w:ascii="Arial" w:hAnsi="Arial" w:cs="Arial"/>
-              </w:rPr>
-              <w:t>unity</w:t>
-            </w:r>
-            <w:proofErr w:type="spellEnd"/>
-            <w:r>
-              <w:rPr>
-                <w:rFonts w:ascii="Arial" w:hAnsi="Arial" w:cs="Arial"/>
-              </w:rPr>
-              <w:t xml:space="preserve"> e documentare bene come creare un picchia duro su </w:t>
-            </w:r>
-            <w:proofErr w:type="spellStart"/>
-            <w:r>
-              <w:rPr>
-                <w:rFonts w:ascii="Arial" w:hAnsi="Arial" w:cs="Arial"/>
-              </w:rPr>
-              <w:t>unity</w:t>
-            </w:r>
-            <w:proofErr w:type="spellEnd"/>
-            <w:r>
-              <w:rPr>
-                <w:rFonts w:ascii="Arial" w:hAnsi="Arial" w:cs="Arial"/>
-              </w:rPr>
-              <w:t>.</w:t>
+              <w:t>are a usare unity e documentare bene come creare un picchia duro su unity.</w:t>
             </w:r>
           </w:p>
           <w:p>
@@ -1166,6 +1071,7 @@
           </w:tcPr>
           <w:p>
             <w:pPr>
+              <w:jc w:val="center"/>
               <w:rPr>
                 <w:rFonts w:ascii="Arial" w:hAnsi="Arial" w:cs="Arial"/>
               </w:rPr>
@@ -1192,21 +1098,19 @@
               <w:rPr>
                 <w:rFonts w:ascii="Arial" w:hAnsi="Arial" w:cs="Arial"/>
               </w:rPr>
-              <w:t xml:space="preserve">Ci siamo andati a informare su come funziona </w:t>
-            </w:r>
-            <w:proofErr w:type="spellStart"/>
-            <w:r>
-              <w:rPr>
-                <w:rFonts w:ascii="Arial" w:hAnsi="Arial" w:cs="Arial"/>
-              </w:rPr>
-              <w:t>github</w:t>
-            </w:r>
-            <w:proofErr w:type="spellEnd"/>
-            <w:r>
-              <w:rPr>
-                <w:rFonts w:ascii="Arial" w:hAnsi="Arial" w:cs="Arial"/>
-              </w:rPr>
-              <w:t xml:space="preserve"> e poi ognuno a continuato quello che stava facendo fino alla fine della lezione:</w:t>
+              <w:t xml:space="preserve">Ci siamo andati a informare su come funziona github e poi ognuno </w:t>
+            </w:r>
+            <w:r>
+              <w:rPr>
+                <w:rFonts w:ascii="Arial" w:hAnsi="Arial" w:cs="Arial"/>
+              </w:rPr>
+              <w:t>h</w:t>
+            </w:r>
+            <w:r>
+              <w:rPr>
+                <w:rFonts w:ascii="Arial" w:hAnsi="Arial" w:cs="Arial"/>
+              </w:rPr>
+              <w:t>a continuato quello che stava facendo fino alla fine della lezione:</w:t>
             </w:r>
           </w:p>
           <w:p>
@@ -1228,41 +1132,25 @@
                 <w:rFonts w:ascii="Arial" w:hAnsi="Arial" w:cs="Arial"/>
               </w:rPr>
             </w:pPr>
-            <w:proofErr w:type="spellStart"/>
-            <w:r>
-              <w:rPr>
-                <w:rFonts w:ascii="Arial" w:hAnsi="Arial" w:cs="Arial"/>
-              </w:rPr>
-              <w:t>Sidon</w:t>
-            </w:r>
-            <w:proofErr w:type="spellEnd"/>
-            <w:r>
-              <w:rPr>
-                <w:rFonts w:ascii="Arial" w:hAnsi="Arial" w:cs="Arial"/>
-              </w:rPr>
-              <w:t xml:space="preserve"> e Ivan: Diagramma delle classi</w:t>
-            </w:r>
-          </w:p>
-          <w:p>
-            <w:pPr>
-              <w:rPr>
-                <w:rFonts w:ascii="Arial" w:hAnsi="Arial" w:cs="Arial"/>
-              </w:rPr>
-            </w:pPr>
-            <w:r>
-              <w:rPr>
-                <w:rFonts w:ascii="Arial" w:hAnsi="Arial" w:cs="Arial"/>
-              </w:rPr>
-              <w:t xml:space="preserve">Quan: </w:t>
-            </w:r>
-            <w:proofErr w:type="spellStart"/>
-            <w:r>
-              <w:rPr>
-                <w:rFonts w:ascii="Arial" w:hAnsi="Arial" w:cs="Arial"/>
-              </w:rPr>
-              <w:t>Swimlanes</w:t>
-            </w:r>
-            <w:proofErr w:type="spellEnd"/>
+            <w:r>
+              <w:rPr>
+                <w:rFonts w:ascii="Arial" w:hAnsi="Arial" w:cs="Arial"/>
+              </w:rPr>
+              <w:t>Sidon e Ivan: Diagramma delle classi</w:t>
+            </w:r>
+          </w:p>
+          <w:p>
+            <w:pPr>
+              <w:rPr>
+                <w:rFonts w:ascii="Arial" w:hAnsi="Arial" w:cs="Arial"/>
+              </w:rPr>
+            </w:pPr>
+            <w:r>
+              <w:rPr>
+                <w:rFonts w:ascii="Arial" w:hAnsi="Arial" w:cs="Arial"/>
+              </w:rPr>
+              <w:t>Quan: Swimlanes</w:t>
+            </w:r>
           </w:p>
         </w:tc>
       </w:tr>
@@ -1462,16 +1350,14 @@
               <w:rPr>
                 <w:rFonts w:ascii="Arial" w:hAnsi="Arial" w:cs="Arial"/>
               </w:rPr>
-              <w:t xml:space="preserve"> - Fare </w:t>
-            </w:r>
-            <w:proofErr w:type="spellStart"/>
-            <w:r>
-              <w:rPr>
-                <w:rFonts w:ascii="Arial" w:hAnsi="Arial" w:cs="Arial"/>
-              </w:rPr>
-              <w:t>Gantt</w:t>
-            </w:r>
-            <w:proofErr w:type="spellEnd"/>
+              <w:t xml:space="preserve"> - Fare Ga</w:t>
+            </w:r>
+            <w:r>
+              <w:rPr>
+                <w:rFonts w:ascii="Arial" w:hAnsi="Arial" w:cs="Arial"/>
+              </w:rPr>
+              <w:t>ntt</w:t>
+            </w:r>
           </w:p>
           <w:p>
             <w:pPr>
@@ -1484,6 +1370,632 @@
                 <w:rFonts w:ascii="Arial" w:hAnsi="Arial" w:cs="Arial"/>
               </w:rPr>
               <w:t xml:space="preserve"> - Finire e discutere sul diagramma delle classi</w:t>
+            </w:r>
+          </w:p>
+        </w:tc>
+      </w:tr>
+    </w:tbl>
+    <w:p>
+      <w:pPr>
+        <w:rPr>
+          <w:rFonts w:ascii="Arial" w:hAnsi="Arial" w:cs="Arial"/>
+        </w:rPr>
+      </w:pPr>
+    </w:p>
+    <w:p>
+      <w:pPr>
+        <w:rPr>
+          <w:rFonts w:ascii="Arial" w:hAnsi="Arial" w:cs="Arial"/>
+        </w:rPr>
+      </w:pPr>
+      <w:r>
+        <w:rPr>
+          <w:rFonts w:ascii="Arial" w:hAnsi="Arial" w:cs="Arial"/>
+        </w:rPr>
+        <w:br w:type="page"/>
+      </w:r>
+    </w:p>
+    <w:tbl>
+      <w:tblPr>
+        <w:tblStyle w:val="Grigliatabella"/>
+        <w:tblW w:w="9634" w:type="dxa"/>
+        <w:tblLook w:val="04A0" w:firstRow="1" w:lastRow="0" w:firstColumn="1" w:lastColumn="0" w:noHBand="0" w:noVBand="1"/>
+      </w:tblPr>
+      <w:tblGrid>
+        <w:gridCol w:w="4803"/>
+        <w:gridCol w:w="4831"/>
+      </w:tblGrid>
+      <w:tr>
+        <w:trPr>
+          <w:trHeight w:hRule="exact" w:val="397"/>
+        </w:trPr>
+        <w:tc>
+          <w:tcPr>
+            <w:tcW w:w="4803" w:type="dxa"/>
+            <w:vAlign w:val="center"/>
+          </w:tcPr>
+          <w:p>
+            <w:pPr>
+              <w:rPr>
+                <w:rFonts w:ascii="Arial" w:hAnsi="Arial" w:cs="Arial"/>
+              </w:rPr>
+            </w:pPr>
+            <w:r>
+              <w:rPr>
+                <w:rFonts w:ascii="Arial" w:hAnsi="Arial" w:cs="Arial"/>
+              </w:rPr>
+              <w:lastRenderedPageBreak/>
+              <w:t>Luogo</w:t>
+            </w:r>
+          </w:p>
+        </w:tc>
+        <w:tc>
+          <w:tcPr>
+            <w:tcW w:w="4831" w:type="dxa"/>
+            <w:vAlign w:val="center"/>
+          </w:tcPr>
+          <w:p>
+            <w:pPr>
+              <w:pStyle w:val="Nessunaspaziatura"/>
+              <w:spacing w:line="360" w:lineRule="auto"/>
+              <w:rPr>
+                <w:rFonts w:ascii="Arial" w:hAnsi="Arial" w:cs="Arial"/>
+              </w:rPr>
+            </w:pPr>
+            <w:r>
+              <w:rPr>
+                <w:rFonts w:ascii="Arial" w:hAnsi="Arial" w:cs="Arial"/>
+              </w:rPr>
+              <w:t>Canobbio</w:t>
+            </w:r>
+          </w:p>
+        </w:tc>
+      </w:tr>
+      <w:tr>
+        <w:trPr>
+          <w:trHeight w:hRule="exact" w:val="397"/>
+        </w:trPr>
+        <w:tc>
+          <w:tcPr>
+            <w:tcW w:w="4803" w:type="dxa"/>
+            <w:vAlign w:val="center"/>
+          </w:tcPr>
+          <w:p>
+            <w:pPr>
+              <w:rPr>
+                <w:rFonts w:ascii="Arial" w:hAnsi="Arial" w:cs="Arial"/>
+              </w:rPr>
+            </w:pPr>
+            <w:r>
+              <w:rPr>
+                <w:rFonts w:ascii="Arial" w:hAnsi="Arial" w:cs="Arial"/>
+              </w:rPr>
+              <w:t>Data</w:t>
+            </w:r>
+          </w:p>
+        </w:tc>
+        <w:tc>
+          <w:tcPr>
+            <w:tcW w:w="4831" w:type="dxa"/>
+            <w:vAlign w:val="center"/>
+          </w:tcPr>
+          <w:p>
+            <w:pPr>
+              <w:rPr>
+                <w:rFonts w:ascii="Arial" w:hAnsi="Arial" w:cs="Arial"/>
+              </w:rPr>
+            </w:pPr>
+            <w:r>
+              <w:rPr>
+                <w:rFonts w:ascii="Arial" w:hAnsi="Arial" w:cs="Arial"/>
+              </w:rPr>
+              <w:t>06.02.2026</w:t>
+            </w:r>
+          </w:p>
+        </w:tc>
+      </w:tr>
+    </w:tbl>
+    <w:p>
+      <w:pPr>
+        <w:rPr>
+          <w:rFonts w:ascii="Arial" w:hAnsi="Arial" w:cs="Arial"/>
+        </w:rPr>
+      </w:pPr>
+    </w:p>
+    <w:tbl>
+      <w:tblPr>
+        <w:tblStyle w:val="Grigliatabella"/>
+        <w:tblW w:w="0" w:type="auto"/>
+        <w:tblLook w:val="04A0" w:firstRow="1" w:lastRow="0" w:firstColumn="1" w:lastColumn="0" w:noHBand="0" w:noVBand="1"/>
+      </w:tblPr>
+      <w:tblGrid>
+        <w:gridCol w:w="1555"/>
+        <w:gridCol w:w="8073"/>
+      </w:tblGrid>
+      <w:tr>
+        <w:tc>
+          <w:tcPr>
+            <w:tcW w:w="9628" w:type="dxa"/>
+            <w:gridSpan w:val="2"/>
+            <w:shd w:val="clear" w:color="auto" w:fill="D9D9D9" w:themeFill="background1" w:themeFillShade="D9"/>
+          </w:tcPr>
+          <w:p>
+            <w:pPr>
+              <w:rPr>
+                <w:rFonts w:ascii="Arial" w:hAnsi="Arial" w:cs="Arial"/>
+              </w:rPr>
+            </w:pPr>
+            <w:r>
+              <w:rPr>
+                <w:rFonts w:ascii="Arial" w:hAnsi="Arial" w:cs="Arial"/>
+              </w:rPr>
+              <w:t>Lavori svolti</w:t>
+            </w:r>
+          </w:p>
+        </w:tc>
+      </w:tr>
+      <w:tr>
+        <w:tc>
+          <w:tcPr>
+            <w:tcW w:w="1555" w:type="dxa"/>
+            <w:vAlign w:val="center"/>
+          </w:tcPr>
+          <w:p>
+            <w:pPr>
+              <w:jc w:val="center"/>
+              <w:rPr>
+                <w:rFonts w:ascii="Arial" w:hAnsi="Arial" w:cs="Arial"/>
+              </w:rPr>
+            </w:pPr>
+            <w:r>
+              <w:rPr>
+                <w:rFonts w:ascii="Arial" w:hAnsi="Arial" w:cs="Arial"/>
+              </w:rPr>
+              <w:t>8:20-9:35</w:t>
+            </w:r>
+          </w:p>
+        </w:tc>
+        <w:tc>
+          <w:tcPr>
+            <w:tcW w:w="8073" w:type="dxa"/>
+          </w:tcPr>
+          <w:p>
+            <w:pPr>
+              <w:jc w:val="both"/>
+              <w:rPr>
+                <w:rFonts w:ascii="Arial" w:hAnsi="Arial" w:cs="Arial"/>
+              </w:rPr>
+            </w:pPr>
+            <w:r>
+              <w:rPr>
+                <w:rFonts w:ascii="Arial" w:hAnsi="Arial" w:cs="Arial"/>
+              </w:rPr>
+              <w:t>Il gruppo ha svolto la prima parte della teoria sull’ agile e l’attività pratica con gli aeroplanini</w:t>
+            </w:r>
+          </w:p>
+        </w:tc>
+      </w:tr>
+      <w:tr>
+        <w:tc>
+          <w:tcPr>
+            <w:tcW w:w="1555" w:type="dxa"/>
+            <w:vAlign w:val="center"/>
+          </w:tcPr>
+          <w:p>
+            <w:pPr>
+              <w:jc w:val="center"/>
+              <w:rPr>
+                <w:rFonts w:ascii="Arial" w:hAnsi="Arial" w:cs="Arial"/>
+              </w:rPr>
+            </w:pPr>
+            <w:r>
+              <w:rPr>
+                <w:rFonts w:ascii="Arial" w:hAnsi="Arial" w:cs="Arial"/>
+              </w:rPr>
+              <w:t>9:50-11:35</w:t>
+            </w:r>
+          </w:p>
+        </w:tc>
+        <w:tc>
+          <w:tcPr>
+            <w:tcW w:w="8073" w:type="dxa"/>
+          </w:tcPr>
+          <w:p>
+            <w:pPr>
+              <w:rPr>
+                <w:rFonts w:ascii="Arial" w:hAnsi="Arial" w:cs="Arial"/>
+              </w:rPr>
+            </w:pPr>
+            <w:r>
+              <w:rPr>
+                <w:rFonts w:ascii="Arial" w:hAnsi="Arial" w:cs="Arial"/>
+              </w:rPr>
+              <w:t>Fine attività pratica</w:t>
+            </w:r>
+            <w:r>
+              <w:rPr>
+                <w:rFonts w:ascii="Arial" w:hAnsi="Arial" w:cs="Arial"/>
+              </w:rPr>
+              <w:t xml:space="preserve">, </w:t>
+            </w:r>
+          </w:p>
+          <w:p>
+            <w:pPr>
+              <w:rPr>
+                <w:rFonts w:ascii="Arial" w:hAnsi="Arial" w:cs="Arial"/>
+              </w:rPr>
+            </w:pPr>
+            <w:r>
+              <w:rPr>
+                <w:rFonts w:ascii="Arial" w:hAnsi="Arial" w:cs="Arial"/>
+              </w:rPr>
+              <w:t>Yasser e Ivan: Continuazione requisiti</w:t>
+            </w:r>
+          </w:p>
+          <w:p>
+            <w:pPr>
+              <w:rPr>
+                <w:rFonts w:ascii="Arial" w:hAnsi="Arial" w:cs="Arial"/>
+              </w:rPr>
+            </w:pPr>
+            <w:r>
+              <w:rPr>
+                <w:rFonts w:ascii="Arial" w:hAnsi="Arial" w:cs="Arial"/>
+              </w:rPr>
+              <w:t>Sidon: Fa l’elenco delle attività</w:t>
+            </w:r>
+          </w:p>
+          <w:p>
+            <w:pPr>
+              <w:rPr>
+                <w:rFonts w:ascii="Arial" w:hAnsi="Arial" w:cs="Arial"/>
+              </w:rPr>
+            </w:pPr>
+            <w:r>
+              <w:rPr>
+                <w:rFonts w:ascii="Arial" w:hAnsi="Arial" w:cs="Arial"/>
+              </w:rPr>
+              <w:t>Quan: Fa il mockup della schermata principale e delle impostazioni (salvando tutte le sprite).</w:t>
+            </w:r>
+          </w:p>
+        </w:tc>
+      </w:tr>
+      <w:tr>
+        <w:tc>
+          <w:tcPr>
+            <w:tcW w:w="1555" w:type="dxa"/>
+            <w:vAlign w:val="center"/>
+          </w:tcPr>
+          <w:p>
+            <w:pPr>
+              <w:jc w:val="center"/>
+              <w:rPr>
+                <w:rFonts w:ascii="Arial" w:hAnsi="Arial" w:cs="Arial"/>
+              </w:rPr>
+            </w:pPr>
+            <w:r>
+              <w:rPr>
+                <w:rFonts w:ascii="Arial" w:hAnsi="Arial" w:cs="Arial"/>
+              </w:rPr>
+              <w:t>12:30-14:00</w:t>
+            </w:r>
+          </w:p>
+        </w:tc>
+        <w:tc>
+          <w:tcPr>
+            <w:tcW w:w="8073" w:type="dxa"/>
+          </w:tcPr>
+          <w:p>
+            <w:pPr>
+              <w:jc w:val="both"/>
+              <w:rPr>
+                <w:rFonts w:ascii="Arial" w:hAnsi="Arial" w:cs="Arial"/>
+              </w:rPr>
+            </w:pPr>
+            <w:r>
+              <w:rPr>
+                <w:rFonts w:ascii="Arial" w:hAnsi="Arial" w:cs="Arial"/>
+              </w:rPr>
+              <w:t>Yasser e Ivan: finito requisiti e iniziato i test case</w:t>
+            </w:r>
+          </w:p>
+          <w:p>
+            <w:pPr>
+              <w:jc w:val="both"/>
+              <w:rPr>
+                <w:rFonts w:ascii="Arial" w:hAnsi="Arial" w:cs="Arial"/>
+              </w:rPr>
+            </w:pPr>
+            <w:r>
+              <w:rPr>
+                <w:rFonts w:ascii="Arial" w:hAnsi="Arial" w:cs="Arial"/>
+              </w:rPr>
+              <w:t xml:space="preserve">Sidon: finito elenco delle attività </w:t>
+            </w:r>
+          </w:p>
+          <w:p>
+            <w:pPr>
+              <w:jc w:val="both"/>
+              <w:rPr>
+                <w:rFonts w:ascii="Arial" w:hAnsi="Arial" w:cs="Arial"/>
+              </w:rPr>
+            </w:pPr>
+            <w:r>
+              <w:rPr>
+                <w:rFonts w:ascii="Arial" w:hAnsi="Arial" w:cs="Arial"/>
+              </w:rPr>
+              <w:t>Quan: continuazione sprite e mockup</w:t>
+            </w:r>
+          </w:p>
+        </w:tc>
+      </w:tr>
+      <w:tr>
+        <w:tc>
+          <w:tcPr>
+            <w:tcW w:w="1555" w:type="dxa"/>
+            <w:vAlign w:val="center"/>
+          </w:tcPr>
+          <w:p>
+            <w:pPr>
+              <w:jc w:val="center"/>
+              <w:rPr>
+                <w:rFonts w:ascii="Arial" w:hAnsi="Arial" w:cs="Arial"/>
+              </w:rPr>
+            </w:pPr>
+            <w:r>
+              <w:rPr>
+                <w:rFonts w:ascii="Arial" w:hAnsi="Arial" w:cs="Arial"/>
+              </w:rPr>
+              <w:t>14:15-15:45</w:t>
+            </w:r>
+          </w:p>
+        </w:tc>
+        <w:tc>
+          <w:tcPr>
+            <w:tcW w:w="8073" w:type="dxa"/>
+          </w:tcPr>
+          <w:p>
+            <w:pPr>
+              <w:rPr>
+                <w:rFonts w:ascii="Arial" w:hAnsi="Arial" w:cs="Arial"/>
+              </w:rPr>
+            </w:pPr>
+            <w:r>
+              <w:rPr>
+                <w:rFonts w:ascii="Arial" w:hAnsi="Arial" w:cs="Arial"/>
+              </w:rPr>
+              <w:t>Yasser e Ivan: finito i test case</w:t>
+            </w:r>
+          </w:p>
+          <w:p>
+            <w:pPr>
+              <w:rPr>
+                <w:rFonts w:ascii="Arial" w:hAnsi="Arial" w:cs="Arial"/>
+              </w:rPr>
+            </w:pPr>
+            <w:r>
+              <w:rPr>
+                <w:rFonts w:ascii="Arial" w:hAnsi="Arial" w:cs="Arial"/>
+              </w:rPr>
+              <w:t xml:space="preserve">Sidon: aggiustato il diagramma delle classi e </w:t>
+            </w:r>
+            <w:r>
+              <w:rPr>
+                <w:rFonts w:ascii="Arial" w:hAnsi="Arial" w:cs="Arial"/>
+              </w:rPr>
+              <w:t>iniziato a fare i mockup</w:t>
+            </w:r>
+          </w:p>
+          <w:p>
+            <w:pPr>
+              <w:rPr>
+                <w:rFonts w:ascii="Arial" w:hAnsi="Arial" w:cs="Arial"/>
+              </w:rPr>
+            </w:pPr>
+            <w:r>
+              <w:rPr>
+                <w:rFonts w:ascii="Arial" w:hAnsi="Arial" w:cs="Arial"/>
+              </w:rPr>
+              <w:t>Quan: continuato i mockup</w:t>
+            </w:r>
+            <w:r>
+              <w:rPr>
+                <w:rFonts w:ascii="Arial" w:hAnsi="Arial" w:cs="Arial"/>
+              </w:rPr>
+              <w:t xml:space="preserve"> </w:t>
+            </w:r>
+          </w:p>
+          <w:p>
+            <w:pPr>
+              <w:rPr>
+                <w:rFonts w:ascii="Arial" w:hAnsi="Arial" w:cs="Arial"/>
+              </w:rPr>
+            </w:pPr>
+            <w:r>
+              <w:rPr>
+                <w:rFonts w:ascii="Arial" w:hAnsi="Arial" w:cs="Arial"/>
+              </w:rPr>
+              <w:t xml:space="preserve">Ivan: messo </w:t>
+            </w:r>
+            <w:r>
+              <w:rPr>
+                <w:rFonts w:ascii="Arial" w:hAnsi="Arial" w:cs="Arial"/>
+              </w:rPr>
+              <w:t xml:space="preserve">doc insieme e </w:t>
+            </w:r>
+            <w:r>
+              <w:rPr>
+                <w:rFonts w:ascii="Arial" w:hAnsi="Arial" w:cs="Arial"/>
+              </w:rPr>
+              <w:t>iniziato a documentare i use case e i diagrammi</w:t>
+            </w:r>
+          </w:p>
+        </w:tc>
+      </w:tr>
+    </w:tbl>
+    <w:p>
+      <w:pPr>
+        <w:rPr>
+          <w:rFonts w:ascii="Arial" w:hAnsi="Arial" w:cs="Arial"/>
+        </w:rPr>
+      </w:pPr>
+    </w:p>
+    <w:tbl>
+      <w:tblPr>
+        <w:tblStyle w:val="Grigliatabella"/>
+        <w:tblW w:w="0" w:type="auto"/>
+        <w:tblLook w:val="04A0" w:firstRow="1" w:lastRow="0" w:firstColumn="1" w:lastColumn="0" w:noHBand="0" w:noVBand="1"/>
+      </w:tblPr>
+      <w:tblGrid>
+        <w:gridCol w:w="9628"/>
+      </w:tblGrid>
+      <w:tr>
+        <w:tc>
+          <w:tcPr>
+            <w:tcW w:w="9628" w:type="dxa"/>
+            <w:shd w:val="clear" w:color="auto" w:fill="D9D9D9" w:themeFill="background1" w:themeFillShade="D9"/>
+          </w:tcPr>
+          <w:p>
+            <w:pPr>
+              <w:rPr>
+                <w:rFonts w:ascii="Arial" w:hAnsi="Arial" w:cs="Arial"/>
+              </w:rPr>
+            </w:pPr>
+            <w:r>
+              <w:rPr>
+                <w:rFonts w:ascii="Arial" w:hAnsi="Arial" w:cs="Arial"/>
+              </w:rPr>
+              <w:t>Problemi riscontrati e soluzioni adottate</w:t>
+            </w:r>
+          </w:p>
+        </w:tc>
+      </w:tr>
+      <w:tr>
+        <w:tc>
+          <w:tcPr>
+            <w:tcW w:w="9628" w:type="dxa"/>
+          </w:tcPr>
+          <w:p>
+            <w:pPr>
+              <w:rPr>
+                <w:rFonts w:ascii="Arial" w:hAnsi="Arial" w:cs="Arial"/>
+              </w:rPr>
+            </w:pPr>
+          </w:p>
+        </w:tc>
+      </w:tr>
+    </w:tbl>
+    <w:p>
+      <w:pPr>
+        <w:rPr>
+          <w:rFonts w:ascii="Arial" w:hAnsi="Arial" w:cs="Arial"/>
+        </w:rPr>
+      </w:pPr>
+    </w:p>
+    <w:tbl>
+      <w:tblPr>
+        <w:tblStyle w:val="Grigliatabella"/>
+        <w:tblW w:w="0" w:type="auto"/>
+        <w:tblLook w:val="04A0" w:firstRow="1" w:lastRow="0" w:firstColumn="1" w:lastColumn="0" w:noHBand="0" w:noVBand="1"/>
+      </w:tblPr>
+      <w:tblGrid>
+        <w:gridCol w:w="9628"/>
+      </w:tblGrid>
+      <w:tr>
+        <w:tc>
+          <w:tcPr>
+            <w:tcW w:w="9628" w:type="dxa"/>
+            <w:shd w:val="clear" w:color="auto" w:fill="D9D9D9" w:themeFill="background1" w:themeFillShade="D9"/>
+          </w:tcPr>
+          <w:p>
+            <w:pPr>
+              <w:rPr>
+                <w:rFonts w:ascii="Arial" w:hAnsi="Arial" w:cs="Arial"/>
+              </w:rPr>
+            </w:pPr>
+            <w:r>
+              <w:rPr>
+                <w:rFonts w:ascii="Arial" w:hAnsi="Arial" w:cs="Arial"/>
+              </w:rPr>
+              <w:t>Punto della situazione rispetto alla pianificazione</w:t>
+            </w:r>
+          </w:p>
+        </w:tc>
+      </w:tr>
+      <w:tr>
+        <w:tc>
+          <w:tcPr>
+            <w:tcW w:w="9628" w:type="dxa"/>
+          </w:tcPr>
+          <w:p>
+            <w:pPr>
+              <w:rPr>
+                <w:rFonts w:ascii="Arial" w:hAnsi="Arial" w:cs="Arial"/>
+              </w:rPr>
+            </w:pPr>
+          </w:p>
+        </w:tc>
+      </w:tr>
+    </w:tbl>
+    <w:p>
+      <w:pPr>
+        <w:rPr>
+          <w:rFonts w:ascii="Arial" w:hAnsi="Arial" w:cs="Arial"/>
+        </w:rPr>
+      </w:pPr>
+    </w:p>
+    <w:tbl>
+      <w:tblPr>
+        <w:tblStyle w:val="Grigliatabella"/>
+        <w:tblW w:w="0" w:type="auto"/>
+        <w:tblLook w:val="04A0" w:firstRow="1" w:lastRow="0" w:firstColumn="1" w:lastColumn="0" w:noHBand="0" w:noVBand="1"/>
+      </w:tblPr>
+      <w:tblGrid>
+        <w:gridCol w:w="9628"/>
+      </w:tblGrid>
+      <w:tr>
+        <w:tc>
+          <w:tcPr>
+            <w:tcW w:w="9628" w:type="dxa"/>
+            <w:shd w:val="clear" w:color="auto" w:fill="D9D9D9" w:themeFill="background1" w:themeFillShade="D9"/>
+          </w:tcPr>
+          <w:p>
+            <w:pPr>
+              <w:rPr>
+                <w:rFonts w:ascii="Arial" w:hAnsi="Arial" w:cs="Arial"/>
+              </w:rPr>
+            </w:pPr>
+            <w:r>
+              <w:rPr>
+                <w:rFonts w:ascii="Arial" w:hAnsi="Arial" w:cs="Arial"/>
+              </w:rPr>
+              <w:t>Programma di massima per la prossima giornata di lavoro</w:t>
+            </w:r>
+          </w:p>
+        </w:tc>
+      </w:tr>
+      <w:tr>
+        <w:tc>
+          <w:tcPr>
+            <w:tcW w:w="9628" w:type="dxa"/>
+          </w:tcPr>
+          <w:p>
+            <w:pPr>
+              <w:rPr>
+                <w:rFonts w:ascii="Arial" w:hAnsi="Arial" w:cs="Arial"/>
+              </w:rPr>
+            </w:pPr>
+            <w:r>
+              <w:rPr>
+                <w:rFonts w:ascii="Arial" w:hAnsi="Arial" w:cs="Arial"/>
+              </w:rPr>
+              <w:t xml:space="preserve">Fare Gantt e </w:t>
+            </w:r>
+            <w:r>
+              <w:rPr>
+                <w:rFonts w:ascii="Arial" w:hAnsi="Arial" w:cs="Arial"/>
+              </w:rPr>
+              <w:t>finire i mockup e iniziare a fare tutti i spritesheet.</w:t>
             </w:r>
           </w:p>
         </w:tc>
@@ -1683,19 +2195,11 @@
         <w:shd w:val="clear" w:color="auto" w:fill="000000" w:themeFill="text1"/>
       </w:rPr>
     </w:pPr>
-    <w:proofErr w:type="spellStart"/>
     <w:r>
       <w:rPr>
         <w:rFonts w:ascii="Arial" w:hAnsi="Arial" w:cs="Arial"/>
       </w:rPr>
-      <w:t>Sidon</w:t>
-    </w:r>
-    <w:proofErr w:type="spellEnd"/>
-    <w:r>
-      <w:rPr>
-        <w:rFonts w:ascii="Arial" w:hAnsi="Arial" w:cs="Arial"/>
-      </w:rPr>
-      <w:t xml:space="preserve"> Samuel</w:t>
+      <w:t>Sidon Samuel</w:t>
     </w:r>
     <w:r>
       <w:rPr>
@@ -1719,21 +2223,7 @@
       <w:rPr>
         <w:rFonts w:ascii="Arial" w:hAnsi="Arial" w:cs="Arial"/>
       </w:rPr>
-      <w:t xml:space="preserve">, Yasser </w:t>
-    </w:r>
-    <w:proofErr w:type="spellStart"/>
-    <w:r>
-      <w:rPr>
-        <w:rFonts w:ascii="Arial" w:hAnsi="Arial" w:cs="Arial"/>
-      </w:rPr>
-      <w:t>Oudabashi</w:t>
-    </w:r>
-    <w:proofErr w:type="spellEnd"/>
-    <w:r>
-      <w:rPr>
-        <w:rFonts w:ascii="Arial" w:hAnsi="Arial" w:cs="Arial"/>
-      </w:rPr>
-      <w:t xml:space="preserve"> </w:t>
+      <w:t xml:space="preserve">, Yasser Oudabashi </w:t>
     </w:r>
     <w:r>
       <w:rPr>
@@ -1745,21 +2235,7 @@
       <w:rPr>
         <w:rFonts w:ascii="Arial" w:hAnsi="Arial" w:cs="Arial"/>
       </w:rPr>
-      <w:t xml:space="preserve">, Ivan </w:t>
-    </w:r>
-    <w:proofErr w:type="spellStart"/>
-    <w:r>
-      <w:rPr>
-        <w:rFonts w:ascii="Arial" w:hAnsi="Arial" w:cs="Arial"/>
-      </w:rPr>
-      <w:t>Ostroumov</w:t>
-    </w:r>
-    <w:proofErr w:type="spellEnd"/>
-    <w:r>
-      <w:rPr>
-        <w:rFonts w:ascii="Arial" w:hAnsi="Arial" w:cs="Arial"/>
-      </w:rPr>
-      <w:t xml:space="preserve"> I3BD</w:t>
+      <w:t>, Ivan Ostroumov I3BD</w:t>
     </w:r>
   </w:p>
 </w:hdr>
@@ -5791,23 +6267,6 @@
 </file>
 
 <file path=customXml/item1.xml><?xml version="1.0" encoding="utf-8"?>
-<p:properties xmlns:p="http://schemas.microsoft.com/office/2006/metadata/properties" xmlns:xsi="http://www.w3.org/2001/XMLSchema-instance" xmlns:pc="http://schemas.microsoft.com/office/infopath/2007/PartnerControls">
-  <documentManagement>
-    <_activity xmlns="9a5989ba-1f3a-4074-8e62-988f1f5a6d91" xsi:nil="true"/>
-  </documentManagement>
-</p:properties>
-</file>
-
-<file path=customXml/item2.xml><?xml version="1.0" encoding="utf-8"?>
-<?mso-contentType ?>
-<FormTemplates xmlns="http://schemas.microsoft.com/sharepoint/v3/contenttype/forms">
-  <Display>DocumentLibraryForm</Display>
-  <Edit>DocumentLibraryForm</Edit>
-  <New>DocumentLibraryForm</New>
-</FormTemplates>
-</file>
-
-<file path=customXml/item3.xml><?xml version="1.0" encoding="utf-8"?>
 <ct:contentTypeSchema xmlns:ct="http://schemas.microsoft.com/office/2006/metadata/contentType" xmlns:ma="http://schemas.microsoft.com/office/2006/metadata/properties/metaAttributes" ct:_="" ma:_="" ma:contentTypeName="Documento" ma:contentTypeID="0x0101001D68984F87EC994ABE7B851987432E7B" ma:contentTypeVersion="13" ma:contentTypeDescription="Creare un nuovo documento." ma:contentTypeScope="" ma:versionID="9735a29966f8059e51308ea1cecd41eb">
   <xsd:schema xmlns:xsd="http://www.w3.org/2001/XMLSchema" xmlns:xs="http://www.w3.org/2001/XMLSchema" xmlns:p="http://schemas.microsoft.com/office/2006/metadata/properties" xmlns:ns3="d8eed4e0-1c4d-4eb7-9d5a-8c6be5a7f7cc" xmlns:ns4="9a5989ba-1f3a-4074-8e62-988f1f5a6d91" targetNamespace="http://schemas.microsoft.com/office/2006/metadata/properties" ma:root="true" ma:fieldsID="10fd3cb04b3c10d561cc1ece84de1cfd" ns3:_="" ns4:_="">
     <xsd:import namespace="d8eed4e0-1c4d-4eb7-9d5a-8c6be5a7f7cc"/>
@@ -6028,29 +6487,28 @@
 </ct:contentTypeSchema>
 </file>
 
-<file path=customXml/item4.xml><?xml version="1.0" encoding="utf-8"?>
+<file path=customXml/item2.xml><?xml version="1.0" encoding="utf-8"?>
 <b:Sources xmlns:b="http://schemas.openxmlformats.org/officeDocument/2006/bibliography" xmlns="http://schemas.openxmlformats.org/officeDocument/2006/bibliography" SelectedStyle="\APA.XSL" StyleName="APA"/>
 </file>
 
-<file path=customXml/itemProps1.xml><?xml version="1.0" encoding="utf-8"?>
-<ds:datastoreItem xmlns:ds="http://schemas.openxmlformats.org/officeDocument/2006/customXml" ds:itemID="{4C5564E7-A054-43C4-BF74-7A145474E87C}">
-  <ds:schemaRefs>
-    <ds:schemaRef ds:uri="http://schemas.microsoft.com/office/2006/metadata/properties"/>
-    <ds:schemaRef ds:uri="http://schemas.microsoft.com/office/infopath/2007/PartnerControls"/>
-    <ds:schemaRef ds:uri="9a5989ba-1f3a-4074-8e62-988f1f5a6d91"/>
-  </ds:schemaRefs>
-</ds:datastoreItem>
+<file path=customXml/item3.xml><?xml version="1.0" encoding="utf-8"?>
+<p:properties xmlns:p="http://schemas.microsoft.com/office/2006/metadata/properties" xmlns:xsi="http://www.w3.org/2001/XMLSchema-instance" xmlns:pc="http://schemas.microsoft.com/office/infopath/2007/PartnerControls">
+  <documentManagement>
+    <_activity xmlns="9a5989ba-1f3a-4074-8e62-988f1f5a6d91" xsi:nil="true"/>
+  </documentManagement>
+</p:properties>
 </file>
 
-<file path=customXml/itemProps2.xml><?xml version="1.0" encoding="utf-8"?>
-<ds:datastoreItem xmlns:ds="http://schemas.openxmlformats.org/officeDocument/2006/customXml" ds:itemID="{F88632BD-6596-4D41-8033-40DE95A98259}">
-  <ds:schemaRefs>
-    <ds:schemaRef ds:uri="http://schemas.microsoft.com/sharepoint/v3/contenttype/forms"/>
-  </ds:schemaRefs>
-</ds:datastoreItem>
+<file path=customXml/item4.xml><?xml version="1.0" encoding="utf-8"?>
+<?mso-contentType ?>
+<FormTemplates xmlns="http://schemas.microsoft.com/sharepoint/v3/contenttype/forms">
+  <Display>DocumentLibraryForm</Display>
+  <Edit>DocumentLibraryForm</Edit>
+  <New>DocumentLibraryForm</New>
+</FormTemplates>
 </file>
 
-<file path=customXml/itemProps3.xml><?xml version="1.0" encoding="utf-8"?>
+<file path=customXml/itemProps1.xml><?xml version="1.0" encoding="utf-8"?>
 <ds:datastoreItem xmlns:ds="http://schemas.openxmlformats.org/officeDocument/2006/customXml" ds:itemID="{DF47FB3B-BE2E-4282-A583-D09F8A90D7A9}">
   <ds:schemaRefs>
     <ds:schemaRef ds:uri="http://schemas.microsoft.com/office/2006/metadata/contentType"/>
@@ -6069,10 +6527,28 @@
 </ds:datastoreItem>
 </file>
 
-<file path=customXml/itemProps4.xml><?xml version="1.0" encoding="utf-8"?>
+<file path=customXml/itemProps2.xml><?xml version="1.0" encoding="utf-8"?>
 <ds:datastoreItem xmlns:ds="http://schemas.openxmlformats.org/officeDocument/2006/customXml" ds:itemID="{A4D352A7-3801-4E51-8ED0-E5F8E4A7EC31}">
   <ds:schemaRefs>
     <ds:schemaRef ds:uri="http://schemas.openxmlformats.org/officeDocument/2006/bibliography"/>
   </ds:schemaRefs>
 </ds:datastoreItem>
+</file>
+
+<file path=customXml/itemProps3.xml><?xml version="1.0" encoding="utf-8"?>
+<ds:datastoreItem xmlns:ds="http://schemas.openxmlformats.org/officeDocument/2006/customXml" ds:itemID="{4C5564E7-A054-43C4-BF74-7A145474E87C}">
+  <ds:schemaRefs>
+    <ds:schemaRef ds:uri="http://schemas.microsoft.com/office/2006/metadata/properties"/>
+    <ds:schemaRef ds:uri="http://schemas.microsoft.com/office/infopath/2007/PartnerControls"/>
+    <ds:schemaRef ds:uri="9a5989ba-1f3a-4074-8e62-988f1f5a6d91"/>
+  </ds:schemaRefs>
+</ds:datastoreItem>
+</file>
+
+<file path=customXml/itemProps4.xml><?xml version="1.0" encoding="utf-8"?>
+<ds:datastoreItem xmlns:ds="http://schemas.openxmlformats.org/officeDocument/2006/customXml" ds:itemID="{F88632BD-6596-4D41-8033-40DE95A98259}">
+  <ds:schemaRefs>
+    <ds:schemaRef ds:uri="http://schemas.microsoft.com/sharepoint/v3/contenttype/forms"/>
+  </ds:schemaRefs>
+</ds:datastoreItem>
 </file>
</xml_diff>

<commit_message>
Fatto modifiche a tutto | 13.02.2026
</commit_message>
<xml_diff>
--- a/4_Diari/Diario di Lavoro.docx
+++ b/4_Diari/Diario di Lavoro.docx
@@ -200,7 +200,13 @@
               <w:rPr>
                 <w:rFonts w:ascii="Arial" w:hAnsi="Arial" w:cs="Arial"/>
               </w:rPr>
-              <w:t>8:20-9:35</w:t>
+              <w:t>8:20-9:</w:t>
+            </w:r>
+            <w:r>
+              <w:rPr>
+                <w:rFonts w:ascii="Arial" w:hAnsi="Arial" w:cs="Arial"/>
+              </w:rPr>
+              <w:t>50</w:t>
             </w:r>
           </w:p>
         </w:tc>
@@ -259,7 +265,13 @@
               <w:rPr>
                 <w:rFonts w:ascii="Arial" w:hAnsi="Arial" w:cs="Arial"/>
               </w:rPr>
-              <w:t>9:50-11:35</w:t>
+              <w:t>10:05</w:t>
+            </w:r>
+            <w:r>
+              <w:rPr>
+                <w:rFonts w:ascii="Arial" w:hAnsi="Arial" w:cs="Arial"/>
+              </w:rPr>
+              <w:t>-11:35</w:t>
             </w:r>
           </w:p>
         </w:tc>
@@ -513,7 +525,35 @@
               <w:rPr>
                 <w:rFonts w:ascii="Arial" w:hAnsi="Arial" w:cs="Arial"/>
               </w:rPr>
-              <w:t>Messo tutto insieme e commit github.</w:t>
+              <w:t xml:space="preserve">Messo tutto insieme e </w:t>
+            </w:r>
+            <w:proofErr w:type="spellStart"/>
+            <w:r>
+              <w:rPr>
+                <w:rFonts w:ascii="Arial" w:hAnsi="Arial" w:cs="Arial"/>
+              </w:rPr>
+              <w:t>commit</w:t>
+            </w:r>
+            <w:proofErr w:type="spellEnd"/>
+            <w:r>
+              <w:rPr>
+                <w:rFonts w:ascii="Arial" w:hAnsi="Arial" w:cs="Arial"/>
+              </w:rPr>
+              <w:t xml:space="preserve"> </w:t>
+            </w:r>
+            <w:proofErr w:type="spellStart"/>
+            <w:r>
+              <w:rPr>
+                <w:rFonts w:ascii="Arial" w:hAnsi="Arial" w:cs="Arial"/>
+              </w:rPr>
+              <w:t>github</w:t>
+            </w:r>
+            <w:proofErr w:type="spellEnd"/>
+            <w:r>
+              <w:rPr>
+                <w:rFonts w:ascii="Arial" w:hAnsi="Arial" w:cs="Arial"/>
+              </w:rPr>
+              <w:t>.</w:t>
             </w:r>
           </w:p>
         </w:tc>
@@ -866,7 +906,13 @@
               <w:rPr>
                 <w:rFonts w:ascii="Arial" w:hAnsi="Arial" w:cs="Arial"/>
               </w:rPr>
-              <w:t>8:20-9:35</w:t>
+              <w:t>8:20-</w:t>
+            </w:r>
+            <w:r>
+              <w:rPr>
+                <w:rFonts w:ascii="Arial" w:hAnsi="Arial" w:cs="Arial"/>
+              </w:rPr>
+              <w:t>9:50</w:t>
             </w:r>
           </w:p>
         </w:tc>
@@ -907,7 +953,13 @@
               <w:rPr>
                 <w:rFonts w:ascii="Arial" w:hAnsi="Arial" w:cs="Arial"/>
               </w:rPr>
-              <w:t>9:50-11:35</w:t>
+              <w:t>10:05</w:t>
+            </w:r>
+            <w:r>
+              <w:rPr>
+                <w:rFonts w:ascii="Arial" w:hAnsi="Arial" w:cs="Arial"/>
+              </w:rPr>
+              <w:t>-11:35</w:t>
             </w:r>
           </w:p>
         </w:tc>
@@ -938,8 +990,16 @@
               <w:rPr>
                 <w:rFonts w:ascii="Arial" w:hAnsi="Arial" w:cs="Arial"/>
               </w:rPr>
-              <w:t>Ivan, Yasser, Quan: Modifiche finali al QdC</w:t>
-            </w:r>
+              <w:t xml:space="preserve">Ivan, Yasser, Quan: Modifiche finali al </w:t>
+            </w:r>
+            <w:proofErr w:type="spellStart"/>
+            <w:r>
+              <w:rPr>
+                <w:rFonts w:ascii="Arial" w:hAnsi="Arial" w:cs="Arial"/>
+              </w:rPr>
+              <w:t>QdC</w:t>
+            </w:r>
+            <w:proofErr w:type="spellEnd"/>
           </w:p>
           <w:p>
             <w:pPr>
@@ -992,7 +1052,21 @@
               <w:rPr>
                 <w:rFonts w:ascii="Arial" w:hAnsi="Arial" w:cs="Arial"/>
               </w:rPr>
-              <w:t>Discussione del QdC e del progetto con il professore</w:t>
+              <w:t xml:space="preserve">Discussione del </w:t>
+            </w:r>
+            <w:proofErr w:type="spellStart"/>
+            <w:r>
+              <w:rPr>
+                <w:rFonts w:ascii="Arial" w:hAnsi="Arial" w:cs="Arial"/>
+              </w:rPr>
+              <w:t>QdC</w:t>
+            </w:r>
+            <w:proofErr w:type="spellEnd"/>
+            <w:r>
+              <w:rPr>
+                <w:rFonts w:ascii="Arial" w:hAnsi="Arial" w:cs="Arial"/>
+              </w:rPr>
+              <w:t xml:space="preserve"> e del progetto con il professore</w:t>
             </w:r>
             <w:r>
               <w:rPr>
@@ -1038,7 +1112,35 @@
               <w:rPr>
                 <w:rFonts w:ascii="Arial" w:hAnsi="Arial" w:cs="Arial"/>
               </w:rPr>
-              <w:t>are a usare unity e documentare bene come creare un picchia duro su unity.</w:t>
+              <w:t xml:space="preserve">are a usare </w:t>
+            </w:r>
+            <w:proofErr w:type="spellStart"/>
+            <w:r>
+              <w:rPr>
+                <w:rFonts w:ascii="Arial" w:hAnsi="Arial" w:cs="Arial"/>
+              </w:rPr>
+              <w:t>unity</w:t>
+            </w:r>
+            <w:proofErr w:type="spellEnd"/>
+            <w:r>
+              <w:rPr>
+                <w:rFonts w:ascii="Arial" w:hAnsi="Arial" w:cs="Arial"/>
+              </w:rPr>
+              <w:t xml:space="preserve"> e documentare bene come creare un picchia duro su </w:t>
+            </w:r>
+            <w:proofErr w:type="spellStart"/>
+            <w:r>
+              <w:rPr>
+                <w:rFonts w:ascii="Arial" w:hAnsi="Arial" w:cs="Arial"/>
+              </w:rPr>
+              <w:t>unity</w:t>
+            </w:r>
+            <w:proofErr w:type="spellEnd"/>
+            <w:r>
+              <w:rPr>
+                <w:rFonts w:ascii="Arial" w:hAnsi="Arial" w:cs="Arial"/>
+              </w:rPr>
+              <w:t>.</w:t>
             </w:r>
           </w:p>
           <w:p>
@@ -1098,7 +1200,21 @@
               <w:rPr>
                 <w:rFonts w:ascii="Arial" w:hAnsi="Arial" w:cs="Arial"/>
               </w:rPr>
-              <w:t xml:space="preserve">Ci siamo andati a informare su come funziona github e poi ognuno </w:t>
+              <w:t xml:space="preserve">Ci siamo andati a informare su come funziona </w:t>
+            </w:r>
+            <w:proofErr w:type="spellStart"/>
+            <w:r>
+              <w:rPr>
+                <w:rFonts w:ascii="Arial" w:hAnsi="Arial" w:cs="Arial"/>
+              </w:rPr>
+              <w:t>github</w:t>
+            </w:r>
+            <w:proofErr w:type="spellEnd"/>
+            <w:r>
+              <w:rPr>
+                <w:rFonts w:ascii="Arial" w:hAnsi="Arial" w:cs="Arial"/>
+              </w:rPr>
+              <w:t xml:space="preserve"> e poi ognuno </w:t>
             </w:r>
             <w:r>
               <w:rPr>
@@ -1149,8 +1265,16 @@
               <w:rPr>
                 <w:rFonts w:ascii="Arial" w:hAnsi="Arial" w:cs="Arial"/>
               </w:rPr>
-              <w:t>Quan: Swimlanes</w:t>
-            </w:r>
+              <w:t xml:space="preserve">Quan: </w:t>
+            </w:r>
+            <w:proofErr w:type="spellStart"/>
+            <w:r>
+              <w:rPr>
+                <w:rFonts w:ascii="Arial" w:hAnsi="Arial" w:cs="Arial"/>
+              </w:rPr>
+              <w:t>Swimlanes</w:t>
+            </w:r>
+            <w:proofErr w:type="spellEnd"/>
           </w:p>
         </w:tc>
       </w:tr>
@@ -1551,7 +1675,13 @@
               <w:rPr>
                 <w:rFonts w:ascii="Arial" w:hAnsi="Arial" w:cs="Arial"/>
               </w:rPr>
-              <w:t>8:20-9:35</w:t>
+              <w:t>8:20-</w:t>
+            </w:r>
+            <w:r>
+              <w:rPr>
+                <w:rFonts w:ascii="Arial" w:hAnsi="Arial" w:cs="Arial"/>
+              </w:rPr>
+              <w:t>9:50</w:t>
             </w:r>
           </w:p>
         </w:tc>
@@ -1592,7 +1722,25 @@
               <w:rPr>
                 <w:rFonts w:ascii="Arial" w:hAnsi="Arial" w:cs="Arial"/>
               </w:rPr>
-              <w:t>9:50-11:35</w:t>
+              <w:t>10:</w:t>
+            </w:r>
+            <w:r>
+              <w:rPr>
+                <w:rFonts w:ascii="Arial" w:hAnsi="Arial" w:cs="Arial"/>
+              </w:rPr>
+              <w:t>0</w:t>
+            </w:r>
+            <w:r>
+              <w:rPr>
+                <w:rFonts w:ascii="Arial" w:hAnsi="Arial" w:cs="Arial"/>
+              </w:rPr>
+              <w:t>5</w:t>
+            </w:r>
+            <w:r>
+              <w:rPr>
+                <w:rFonts w:ascii="Arial" w:hAnsi="Arial" w:cs="Arial"/>
+              </w:rPr>
+              <w:t>-11:35</w:t>
             </w:r>
           </w:p>
         </w:tc>
@@ -1655,7 +1803,35 @@
               <w:rPr>
                 <w:rFonts w:ascii="Arial" w:hAnsi="Arial" w:cs="Arial"/>
               </w:rPr>
-              <w:t>Quan: Fa il mockup della schermata principale e delle impostazioni (salvando tutte le sprite).</w:t>
+              <w:t xml:space="preserve">Quan: Fa il </w:t>
+            </w:r>
+            <w:proofErr w:type="spellStart"/>
+            <w:r>
+              <w:rPr>
+                <w:rFonts w:ascii="Arial" w:hAnsi="Arial" w:cs="Arial"/>
+              </w:rPr>
+              <w:t>mockup</w:t>
+            </w:r>
+            <w:proofErr w:type="spellEnd"/>
+            <w:r>
+              <w:rPr>
+                <w:rFonts w:ascii="Arial" w:hAnsi="Arial" w:cs="Arial"/>
+              </w:rPr>
+              <w:t xml:space="preserve"> della schermata principale e delle impostazioni (salvando tutte le </w:t>
+            </w:r>
+            <w:proofErr w:type="spellStart"/>
+            <w:r>
+              <w:rPr>
+                <w:rFonts w:ascii="Arial" w:hAnsi="Arial" w:cs="Arial"/>
+              </w:rPr>
+              <w:t>sprite</w:t>
+            </w:r>
+            <w:proofErr w:type="spellEnd"/>
+            <w:r>
+              <w:rPr>
+                <w:rFonts w:ascii="Arial" w:hAnsi="Arial" w:cs="Arial"/>
+              </w:rPr>
+              <w:t>).</w:t>
             </w:r>
           </w:p>
         </w:tc>
@@ -1724,8 +1900,30 @@
               <w:rPr>
                 <w:rFonts w:ascii="Arial" w:hAnsi="Arial" w:cs="Arial"/>
               </w:rPr>
-              <w:t>Quan: continuazione sprite e mockup</w:t>
-            </w:r>
+              <w:t xml:space="preserve">Quan: continuazione </w:t>
+            </w:r>
+            <w:proofErr w:type="spellStart"/>
+            <w:r>
+              <w:rPr>
+                <w:rFonts w:ascii="Arial" w:hAnsi="Arial" w:cs="Arial"/>
+              </w:rPr>
+              <w:t>sprite</w:t>
+            </w:r>
+            <w:proofErr w:type="spellEnd"/>
+            <w:r>
+              <w:rPr>
+                <w:rFonts w:ascii="Arial" w:hAnsi="Arial" w:cs="Arial"/>
+              </w:rPr>
+              <w:t xml:space="preserve"> e </w:t>
+            </w:r>
+            <w:proofErr w:type="spellStart"/>
+            <w:r>
+              <w:rPr>
+                <w:rFonts w:ascii="Arial" w:hAnsi="Arial" w:cs="Arial"/>
+              </w:rPr>
+              <w:t>mockup</w:t>
+            </w:r>
+            <w:proofErr w:type="spellEnd"/>
           </w:p>
         </w:tc>
       </w:tr>
@@ -1783,21 +1981,37 @@
               <w:rPr>
                 <w:rFonts w:ascii="Arial" w:hAnsi="Arial" w:cs="Arial"/>
               </w:rPr>
-              <w:t>iniziato a fare i mockup</w:t>
-            </w:r>
-          </w:p>
-          <w:p>
-            <w:pPr>
-              <w:rPr>
-                <w:rFonts w:ascii="Arial" w:hAnsi="Arial" w:cs="Arial"/>
-              </w:rPr>
-            </w:pPr>
-            <w:r>
-              <w:rPr>
-                <w:rFonts w:ascii="Arial" w:hAnsi="Arial" w:cs="Arial"/>
-              </w:rPr>
-              <w:t>Quan: continuato i mockup</w:t>
-            </w:r>
+              <w:t xml:space="preserve">iniziato a fare i </w:t>
+            </w:r>
+            <w:proofErr w:type="spellStart"/>
+            <w:r>
+              <w:rPr>
+                <w:rFonts w:ascii="Arial" w:hAnsi="Arial" w:cs="Arial"/>
+              </w:rPr>
+              <w:t>mockup</w:t>
+            </w:r>
+            <w:proofErr w:type="spellEnd"/>
+          </w:p>
+          <w:p>
+            <w:pPr>
+              <w:rPr>
+                <w:rFonts w:ascii="Arial" w:hAnsi="Arial" w:cs="Arial"/>
+              </w:rPr>
+            </w:pPr>
+            <w:r>
+              <w:rPr>
+                <w:rFonts w:ascii="Arial" w:hAnsi="Arial" w:cs="Arial"/>
+              </w:rPr>
+              <w:t xml:space="preserve">Quan: continuato i </w:t>
+            </w:r>
+            <w:proofErr w:type="spellStart"/>
+            <w:r>
+              <w:rPr>
+                <w:rFonts w:ascii="Arial" w:hAnsi="Arial" w:cs="Arial"/>
+              </w:rPr>
+              <w:t>mockup</w:t>
+            </w:r>
+            <w:proofErr w:type="spellEnd"/>
             <w:r>
               <w:rPr>
                 <w:rFonts w:ascii="Arial" w:hAnsi="Arial" w:cs="Arial"/>
@@ -1827,7 +2041,21 @@
               <w:rPr>
                 <w:rFonts w:ascii="Arial" w:hAnsi="Arial" w:cs="Arial"/>
               </w:rPr>
-              <w:t>iniziato a documentare i use case e i diagrammi</w:t>
+              <w:t xml:space="preserve">iniziato a documentare </w:t>
+            </w:r>
+            <w:proofErr w:type="gramStart"/>
+            <w:r>
+              <w:rPr>
+                <w:rFonts w:ascii="Arial" w:hAnsi="Arial" w:cs="Arial"/>
+              </w:rPr>
+              <w:t>i use</w:t>
+            </w:r>
+            <w:proofErr w:type="gramEnd"/>
+            <w:r>
+              <w:rPr>
+                <w:rFonts w:ascii="Arial" w:hAnsi="Arial" w:cs="Arial"/>
+              </w:rPr>
+              <w:t xml:space="preserve"> case e i diagrammi</w:t>
             </w:r>
           </w:p>
         </w:tc>
@@ -1995,8 +2223,2138 @@
               <w:rPr>
                 <w:rFonts w:ascii="Arial" w:hAnsi="Arial" w:cs="Arial"/>
               </w:rPr>
-              <w:t>finire i mockup e iniziare a fare tutti i spritesheet.</w:t>
-            </w:r>
+              <w:t xml:space="preserve">finire i </w:t>
+            </w:r>
+            <w:proofErr w:type="spellStart"/>
+            <w:r>
+              <w:rPr>
+                <w:rFonts w:ascii="Arial" w:hAnsi="Arial" w:cs="Arial"/>
+              </w:rPr>
+              <w:t>mockup</w:t>
+            </w:r>
+            <w:proofErr w:type="spellEnd"/>
+            <w:r>
+              <w:rPr>
+                <w:rFonts w:ascii="Arial" w:hAnsi="Arial" w:cs="Arial"/>
+              </w:rPr>
+              <w:t xml:space="preserve"> e iniziare a fare tutti i </w:t>
+            </w:r>
+            <w:proofErr w:type="spellStart"/>
+            <w:r>
+              <w:rPr>
+                <w:rFonts w:ascii="Arial" w:hAnsi="Arial" w:cs="Arial"/>
+              </w:rPr>
+              <w:t>spritesheet</w:t>
+            </w:r>
+            <w:proofErr w:type="spellEnd"/>
+            <w:r>
+              <w:rPr>
+                <w:rFonts w:ascii="Arial" w:hAnsi="Arial" w:cs="Arial"/>
+              </w:rPr>
+              <w:t>.</w:t>
+            </w:r>
+          </w:p>
+        </w:tc>
+      </w:tr>
+    </w:tbl>
+    <w:p>
+      <w:pPr>
+        <w:rPr>
+          <w:rFonts w:ascii="Arial" w:hAnsi="Arial" w:cs="Arial"/>
+        </w:rPr>
+      </w:pPr>
+    </w:p>
+    <w:p>
+      <w:pPr>
+        <w:rPr>
+          <w:rFonts w:ascii="Arial" w:hAnsi="Arial" w:cs="Arial"/>
+        </w:rPr>
+      </w:pPr>
+      <w:r>
+        <w:rPr>
+          <w:rFonts w:ascii="Arial" w:hAnsi="Arial" w:cs="Arial"/>
+        </w:rPr>
+        <w:br w:type="page"/>
+      </w:r>
+    </w:p>
+    <w:tbl>
+      <w:tblPr>
+        <w:tblStyle w:val="Grigliatabella"/>
+        <w:tblW w:w="9634" w:type="dxa"/>
+        <w:tblLook w:val="04A0" w:firstRow="1" w:lastRow="0" w:firstColumn="1" w:lastColumn="0" w:noHBand="0" w:noVBand="1"/>
+      </w:tblPr>
+      <w:tblGrid>
+        <w:gridCol w:w="4803"/>
+        <w:gridCol w:w="4831"/>
+      </w:tblGrid>
+      <w:tr>
+        <w:trPr>
+          <w:trHeight w:hRule="exact" w:val="397"/>
+        </w:trPr>
+        <w:tc>
+          <w:tcPr>
+            <w:tcW w:w="4803" w:type="dxa"/>
+            <w:tcBorders>
+              <w:top w:val="single" w:sz="4" w:space="0" w:color="auto"/>
+              <w:left w:val="single" w:sz="4" w:space="0" w:color="auto"/>
+              <w:bottom w:val="single" w:sz="4" w:space="0" w:color="auto"/>
+              <w:right w:val="single" w:sz="4" w:space="0" w:color="auto"/>
+            </w:tcBorders>
+            <w:vAlign w:val="center"/>
+            <w:hideMark/>
+          </w:tcPr>
+          <w:p>
+            <w:pPr>
+              <w:rPr>
+                <w:rFonts w:ascii="Arial" w:hAnsi="Arial" w:cs="Arial"/>
+              </w:rPr>
+            </w:pPr>
+            <w:r>
+              <w:rPr>
+                <w:rFonts w:ascii="Arial" w:hAnsi="Arial" w:cs="Arial"/>
+              </w:rPr>
+              <w:lastRenderedPageBreak/>
+              <w:t>Luogo</w:t>
+            </w:r>
+          </w:p>
+        </w:tc>
+        <w:tc>
+          <w:tcPr>
+            <w:tcW w:w="4831" w:type="dxa"/>
+            <w:tcBorders>
+              <w:top w:val="single" w:sz="4" w:space="0" w:color="auto"/>
+              <w:left w:val="single" w:sz="4" w:space="0" w:color="auto"/>
+              <w:bottom w:val="single" w:sz="4" w:space="0" w:color="auto"/>
+              <w:right w:val="single" w:sz="4" w:space="0" w:color="auto"/>
+            </w:tcBorders>
+            <w:vAlign w:val="center"/>
+            <w:hideMark/>
+          </w:tcPr>
+          <w:p>
+            <w:pPr>
+              <w:pStyle w:val="Nessunaspaziatura"/>
+              <w:spacing w:line="360" w:lineRule="auto"/>
+              <w:rPr>
+                <w:rFonts w:ascii="Arial" w:hAnsi="Arial" w:cs="Arial"/>
+              </w:rPr>
+            </w:pPr>
+            <w:r>
+              <w:rPr>
+                <w:rFonts w:ascii="Arial" w:hAnsi="Arial" w:cs="Arial"/>
+              </w:rPr>
+              <w:t>Canobbio</w:t>
+            </w:r>
+          </w:p>
+        </w:tc>
+      </w:tr>
+      <w:tr>
+        <w:trPr>
+          <w:trHeight w:hRule="exact" w:val="397"/>
+        </w:trPr>
+        <w:tc>
+          <w:tcPr>
+            <w:tcW w:w="4803" w:type="dxa"/>
+            <w:tcBorders>
+              <w:top w:val="single" w:sz="4" w:space="0" w:color="auto"/>
+              <w:left w:val="single" w:sz="4" w:space="0" w:color="auto"/>
+              <w:bottom w:val="single" w:sz="4" w:space="0" w:color="auto"/>
+              <w:right w:val="single" w:sz="4" w:space="0" w:color="auto"/>
+            </w:tcBorders>
+            <w:vAlign w:val="center"/>
+            <w:hideMark/>
+          </w:tcPr>
+          <w:p>
+            <w:pPr>
+              <w:rPr>
+                <w:rFonts w:ascii="Arial" w:hAnsi="Arial" w:cs="Arial"/>
+              </w:rPr>
+            </w:pPr>
+            <w:r>
+              <w:rPr>
+                <w:rFonts w:ascii="Arial" w:hAnsi="Arial" w:cs="Arial"/>
+              </w:rPr>
+              <w:t>Data</w:t>
+            </w:r>
+          </w:p>
+        </w:tc>
+        <w:tc>
+          <w:tcPr>
+            <w:tcW w:w="4831" w:type="dxa"/>
+            <w:tcBorders>
+              <w:top w:val="single" w:sz="4" w:space="0" w:color="auto"/>
+              <w:left w:val="single" w:sz="4" w:space="0" w:color="auto"/>
+              <w:bottom w:val="single" w:sz="4" w:space="0" w:color="auto"/>
+              <w:right w:val="single" w:sz="4" w:space="0" w:color="auto"/>
+            </w:tcBorders>
+            <w:vAlign w:val="center"/>
+            <w:hideMark/>
+          </w:tcPr>
+          <w:p>
+            <w:pPr>
+              <w:rPr>
+                <w:rFonts w:ascii="Arial" w:hAnsi="Arial" w:cs="Arial"/>
+              </w:rPr>
+            </w:pPr>
+            <w:r>
+              <w:rPr>
+                <w:rFonts w:ascii="Arial" w:hAnsi="Arial" w:cs="Arial"/>
+              </w:rPr>
+              <w:t>13</w:t>
+            </w:r>
+            <w:r>
+              <w:rPr>
+                <w:rFonts w:ascii="Arial" w:hAnsi="Arial" w:cs="Arial"/>
+              </w:rPr>
+              <w:t>.</w:t>
+            </w:r>
+            <w:r>
+              <w:rPr>
+                <w:rFonts w:ascii="Arial" w:hAnsi="Arial" w:cs="Arial"/>
+              </w:rPr>
+              <w:t>02</w:t>
+            </w:r>
+            <w:r>
+              <w:rPr>
+                <w:rFonts w:ascii="Arial" w:hAnsi="Arial" w:cs="Arial"/>
+              </w:rPr>
+              <w:t>.</w:t>
+            </w:r>
+            <w:r>
+              <w:rPr>
+                <w:rFonts w:ascii="Arial" w:hAnsi="Arial" w:cs="Arial"/>
+              </w:rPr>
+              <w:t>2026</w:t>
+            </w:r>
+          </w:p>
+        </w:tc>
+      </w:tr>
+    </w:tbl>
+    <w:p>
+      <w:pPr>
+        <w:rPr>
+          <w:rFonts w:ascii="Arial" w:hAnsi="Arial" w:cs="Arial"/>
+        </w:rPr>
+      </w:pPr>
+    </w:p>
+    <w:tbl>
+      <w:tblPr>
+        <w:tblStyle w:val="Grigliatabella"/>
+        <w:tblW w:w="0" w:type="auto"/>
+        <w:tblLook w:val="04A0" w:firstRow="1" w:lastRow="0" w:firstColumn="1" w:lastColumn="0" w:noHBand="0" w:noVBand="1"/>
+      </w:tblPr>
+      <w:tblGrid>
+        <w:gridCol w:w="1555"/>
+        <w:gridCol w:w="8073"/>
+      </w:tblGrid>
+      <w:tr>
+        <w:tc>
+          <w:tcPr>
+            <w:tcW w:w="9628" w:type="dxa"/>
+            <w:gridSpan w:val="2"/>
+            <w:shd w:val="clear" w:color="auto" w:fill="D9D9D9" w:themeFill="background1" w:themeFillShade="D9"/>
+          </w:tcPr>
+          <w:p>
+            <w:pPr>
+              <w:rPr>
+                <w:rFonts w:ascii="Arial" w:hAnsi="Arial" w:cs="Arial"/>
+              </w:rPr>
+            </w:pPr>
+            <w:r>
+              <w:rPr>
+                <w:rFonts w:ascii="Arial" w:hAnsi="Arial" w:cs="Arial"/>
+              </w:rPr>
+              <w:t>Lavori svolti</w:t>
+            </w:r>
+          </w:p>
+        </w:tc>
+      </w:tr>
+      <w:tr>
+        <w:tc>
+          <w:tcPr>
+            <w:tcW w:w="1555" w:type="dxa"/>
+            <w:vAlign w:val="center"/>
+          </w:tcPr>
+          <w:p>
+            <w:pPr>
+              <w:jc w:val="center"/>
+              <w:rPr>
+                <w:rFonts w:ascii="Arial" w:hAnsi="Arial" w:cs="Arial"/>
+              </w:rPr>
+            </w:pPr>
+            <w:r>
+              <w:rPr>
+                <w:rFonts w:ascii="Arial" w:hAnsi="Arial" w:cs="Arial"/>
+              </w:rPr>
+              <w:t>8:20-9:</w:t>
+            </w:r>
+            <w:r>
+              <w:rPr>
+                <w:rFonts w:ascii="Arial" w:hAnsi="Arial" w:cs="Arial"/>
+              </w:rPr>
+              <w:t>50</w:t>
+            </w:r>
+          </w:p>
+        </w:tc>
+        <w:tc>
+          <w:tcPr>
+            <w:tcW w:w="8073" w:type="dxa"/>
+          </w:tcPr>
+          <w:p>
+            <w:pPr>
+              <w:jc w:val="both"/>
+              <w:rPr>
+                <w:rFonts w:ascii="Arial" w:hAnsi="Arial" w:cs="Arial"/>
+              </w:rPr>
+            </w:pPr>
+            <w:r>
+              <w:rPr>
+                <w:rFonts w:ascii="Arial" w:hAnsi="Arial" w:cs="Arial"/>
+              </w:rPr>
+              <w:t>Teor</w:t>
+            </w:r>
+            <w:r>
+              <w:rPr>
+                <w:rFonts w:ascii="Arial" w:hAnsi="Arial" w:cs="Arial"/>
+              </w:rPr>
+              <w:t>i</w:t>
+            </w:r>
+            <w:r>
+              <w:rPr>
+                <w:rFonts w:ascii="Arial" w:hAnsi="Arial" w:cs="Arial"/>
+              </w:rPr>
+              <w:t>a</w:t>
+            </w:r>
+            <w:r>
+              <w:rPr>
+                <w:rFonts w:ascii="Arial" w:hAnsi="Arial" w:cs="Arial"/>
+              </w:rPr>
+              <w:t xml:space="preserve"> + attività carte per stimare tempi e la loro trasportazione su </w:t>
+            </w:r>
+            <w:proofErr w:type="spellStart"/>
+            <w:r>
+              <w:rPr>
+                <w:rFonts w:ascii="Arial" w:hAnsi="Arial" w:cs="Arial"/>
+              </w:rPr>
+              <w:t>gantt</w:t>
+            </w:r>
+            <w:proofErr w:type="spellEnd"/>
+            <w:r>
+              <w:rPr>
+                <w:rFonts w:ascii="Arial" w:hAnsi="Arial" w:cs="Arial"/>
+              </w:rPr>
+              <w:t>.</w:t>
+            </w:r>
+          </w:p>
+        </w:tc>
+      </w:tr>
+      <w:tr>
+        <w:tc>
+          <w:tcPr>
+            <w:tcW w:w="1555" w:type="dxa"/>
+            <w:vAlign w:val="center"/>
+          </w:tcPr>
+          <w:p>
+            <w:pPr>
+              <w:jc w:val="center"/>
+              <w:rPr>
+                <w:rFonts w:ascii="Arial" w:hAnsi="Arial" w:cs="Arial"/>
+              </w:rPr>
+            </w:pPr>
+            <w:r>
+              <w:rPr>
+                <w:rFonts w:ascii="Arial" w:hAnsi="Arial" w:cs="Arial"/>
+              </w:rPr>
+              <w:t>10:05</w:t>
+            </w:r>
+            <w:r>
+              <w:rPr>
+                <w:rFonts w:ascii="Arial" w:hAnsi="Arial" w:cs="Arial"/>
+              </w:rPr>
+              <w:t>-11:35</w:t>
+            </w:r>
+          </w:p>
+        </w:tc>
+        <w:tc>
+          <w:tcPr>
+            <w:tcW w:w="8073" w:type="dxa"/>
+          </w:tcPr>
+          <w:p>
+            <w:pPr>
+              <w:rPr>
+                <w:rFonts w:ascii="Arial" w:hAnsi="Arial" w:cs="Arial"/>
+              </w:rPr>
+            </w:pPr>
+            <w:r>
+              <w:rPr>
+                <w:rFonts w:ascii="Arial" w:hAnsi="Arial" w:cs="Arial"/>
+              </w:rPr>
+              <w:t xml:space="preserve">Sidon: </w:t>
+            </w:r>
+            <w:r>
+              <w:rPr>
+                <w:rFonts w:ascii="Arial" w:hAnsi="Arial" w:cs="Arial"/>
+              </w:rPr>
+              <w:t>Gantt</w:t>
+            </w:r>
+          </w:p>
+          <w:p>
+            <w:pPr>
+              <w:rPr>
+                <w:rFonts w:ascii="Arial" w:hAnsi="Arial" w:cs="Arial"/>
+              </w:rPr>
+            </w:pPr>
+            <w:r>
+              <w:rPr>
+                <w:rFonts w:ascii="Arial" w:hAnsi="Arial" w:cs="Arial"/>
+              </w:rPr>
+              <w:t>Quan: Impostazioni</w:t>
+            </w:r>
+          </w:p>
+          <w:p>
+            <w:pPr>
+              <w:rPr>
+                <w:rFonts w:ascii="Arial" w:hAnsi="Arial" w:cs="Arial"/>
+              </w:rPr>
+            </w:pPr>
+            <w:r>
+              <w:rPr>
+                <w:rFonts w:ascii="Arial" w:hAnsi="Arial" w:cs="Arial"/>
+              </w:rPr>
+              <w:t>Y</w:t>
+            </w:r>
+            <w:r>
+              <w:rPr>
+                <w:rFonts w:ascii="Arial" w:hAnsi="Arial" w:cs="Arial"/>
+              </w:rPr>
+              <w:t>asser</w:t>
+            </w:r>
+            <w:r>
+              <w:rPr>
+                <w:rFonts w:ascii="Arial" w:hAnsi="Arial" w:cs="Arial"/>
+              </w:rPr>
+              <w:t>: Seleziona personaggi e mappa</w:t>
+            </w:r>
+          </w:p>
+          <w:p>
+            <w:pPr>
+              <w:rPr>
+                <w:rFonts w:ascii="Arial" w:hAnsi="Arial" w:cs="Arial"/>
+              </w:rPr>
+            </w:pPr>
+            <w:r>
+              <w:rPr>
+                <w:rFonts w:ascii="Arial" w:hAnsi="Arial" w:cs="Arial"/>
+              </w:rPr>
+              <w:t>Ivan: Schermata informativa</w:t>
+            </w:r>
+          </w:p>
+          <w:p>
+            <w:pPr>
+              <w:rPr>
+                <w:rFonts w:ascii="Arial" w:hAnsi="Arial" w:cs="Arial"/>
+              </w:rPr>
+            </w:pPr>
+            <w:r>
+              <w:rPr>
+                <w:rFonts w:ascii="Arial" w:hAnsi="Arial" w:cs="Arial"/>
+              </w:rPr>
+              <w:t>Quan e Ivan: scelta stile delle interfacce</w:t>
+            </w:r>
+          </w:p>
+        </w:tc>
+      </w:tr>
+      <w:tr>
+        <w:tc>
+          <w:tcPr>
+            <w:tcW w:w="1555" w:type="dxa"/>
+            <w:vAlign w:val="center"/>
+          </w:tcPr>
+          <w:p>
+            <w:pPr>
+              <w:jc w:val="center"/>
+              <w:rPr>
+                <w:rFonts w:ascii="Arial" w:hAnsi="Arial" w:cs="Arial"/>
+              </w:rPr>
+            </w:pPr>
+            <w:r>
+              <w:rPr>
+                <w:rFonts w:ascii="Arial" w:hAnsi="Arial" w:cs="Arial"/>
+              </w:rPr>
+              <w:t>12:30-14:00</w:t>
+            </w:r>
+          </w:p>
+        </w:tc>
+        <w:tc>
+          <w:tcPr>
+            <w:tcW w:w="8073" w:type="dxa"/>
+          </w:tcPr>
+          <w:p>
+            <w:pPr>
+              <w:tabs>
+                <w:tab w:val="left" w:pos="924"/>
+              </w:tabs>
+              <w:jc w:val="both"/>
+              <w:rPr>
+                <w:rFonts w:ascii="Arial" w:hAnsi="Arial" w:cs="Arial"/>
+              </w:rPr>
+            </w:pPr>
+            <w:r>
+              <w:rPr>
+                <w:rFonts w:ascii="Arial" w:hAnsi="Arial" w:cs="Arial"/>
+              </w:rPr>
+              <w:t>Sidon</w:t>
+            </w:r>
+            <w:r>
+              <w:rPr>
+                <w:rFonts w:ascii="Arial" w:hAnsi="Arial" w:cs="Arial"/>
+              </w:rPr>
+              <w:t xml:space="preserve"> e Yasser: Continuazione Gantt</w:t>
+            </w:r>
+          </w:p>
+          <w:p>
+            <w:pPr>
+              <w:tabs>
+                <w:tab w:val="left" w:pos="924"/>
+              </w:tabs>
+              <w:jc w:val="both"/>
+              <w:rPr>
+                <w:rFonts w:ascii="Arial" w:hAnsi="Arial" w:cs="Arial"/>
+              </w:rPr>
+            </w:pPr>
+            <w:r>
+              <w:rPr>
+                <w:rFonts w:ascii="Arial" w:hAnsi="Arial" w:cs="Arial"/>
+              </w:rPr>
+              <w:t>Ivan e Quan: rielaborazione delle interfacce adattandole allo stile nuovo</w:t>
+            </w:r>
+          </w:p>
+        </w:tc>
+      </w:tr>
+      <w:tr>
+        <w:tc>
+          <w:tcPr>
+            <w:tcW w:w="1555" w:type="dxa"/>
+            <w:vAlign w:val="center"/>
+          </w:tcPr>
+          <w:p>
+            <w:pPr>
+              <w:jc w:val="center"/>
+              <w:rPr>
+                <w:rFonts w:ascii="Arial" w:hAnsi="Arial" w:cs="Arial"/>
+              </w:rPr>
+            </w:pPr>
+            <w:r>
+              <w:rPr>
+                <w:rFonts w:ascii="Arial" w:hAnsi="Arial" w:cs="Arial"/>
+              </w:rPr>
+              <w:t>14:15-15:45</w:t>
+            </w:r>
+          </w:p>
+        </w:tc>
+        <w:tc>
+          <w:tcPr>
+            <w:tcW w:w="8073" w:type="dxa"/>
+          </w:tcPr>
+          <w:p>
+            <w:pPr>
+              <w:rPr>
+                <w:rFonts w:ascii="Arial" w:hAnsi="Arial" w:cs="Arial"/>
+              </w:rPr>
+            </w:pPr>
+            <w:r>
+              <w:rPr>
+                <w:rFonts w:ascii="Arial" w:hAnsi="Arial" w:cs="Arial"/>
+              </w:rPr>
+              <w:t xml:space="preserve">Sidon e Yasser: Fine </w:t>
+            </w:r>
+            <w:proofErr w:type="spellStart"/>
+            <w:r>
+              <w:rPr>
+                <w:rFonts w:ascii="Arial" w:hAnsi="Arial" w:cs="Arial"/>
+              </w:rPr>
+              <w:t>gantt</w:t>
+            </w:r>
+            <w:proofErr w:type="spellEnd"/>
+          </w:p>
+          <w:p>
+            <w:pPr>
+              <w:rPr>
+                <w:rFonts w:ascii="Arial" w:hAnsi="Arial" w:cs="Arial"/>
+              </w:rPr>
+            </w:pPr>
+            <w:r>
+              <w:rPr>
+                <w:rFonts w:ascii="Arial" w:hAnsi="Arial" w:cs="Arial"/>
+              </w:rPr>
+              <w:t>Ivan e Quan: Fine interfacce</w:t>
+            </w:r>
+          </w:p>
+          <w:p>
+            <w:pPr>
+              <w:rPr>
+                <w:rFonts w:ascii="Arial" w:hAnsi="Arial" w:cs="Arial"/>
+              </w:rPr>
+            </w:pPr>
+            <w:r>
+              <w:rPr>
+                <w:rFonts w:ascii="Arial" w:hAnsi="Arial" w:cs="Arial"/>
+              </w:rPr>
+              <w:t>Gruppo: Discusso con il docente alcune modifiche sul QDC come la modifica dei punti specifici e l’aggiunta di un requisito cioè salvataggio delle vittorie</w:t>
+            </w:r>
+            <w:r>
+              <w:rPr>
+                <w:rFonts w:ascii="Arial" w:hAnsi="Arial" w:cs="Arial"/>
+              </w:rPr>
+              <w:t xml:space="preserve"> e di creare infine l’eseguibile da mettere sul server scolastico</w:t>
+            </w:r>
+          </w:p>
+          <w:p>
+            <w:pPr>
+              <w:rPr>
+                <w:rFonts w:ascii="Arial" w:hAnsi="Arial" w:cs="Arial"/>
+              </w:rPr>
+            </w:pPr>
+          </w:p>
+        </w:tc>
+      </w:tr>
+    </w:tbl>
+    <w:p>
+      <w:pPr>
+        <w:rPr>
+          <w:rFonts w:ascii="Arial" w:hAnsi="Arial" w:cs="Arial"/>
+        </w:rPr>
+      </w:pPr>
+    </w:p>
+    <w:tbl>
+      <w:tblPr>
+        <w:tblStyle w:val="Grigliatabella"/>
+        <w:tblW w:w="0" w:type="auto"/>
+        <w:tblLook w:val="04A0" w:firstRow="1" w:lastRow="0" w:firstColumn="1" w:lastColumn="0" w:noHBand="0" w:noVBand="1"/>
+      </w:tblPr>
+      <w:tblGrid>
+        <w:gridCol w:w="9628"/>
+      </w:tblGrid>
+      <w:tr>
+        <w:tc>
+          <w:tcPr>
+            <w:tcW w:w="9854" w:type="dxa"/>
+            <w:tcBorders>
+              <w:top w:val="single" w:sz="4" w:space="0" w:color="auto"/>
+              <w:left w:val="single" w:sz="4" w:space="0" w:color="auto"/>
+              <w:bottom w:val="single" w:sz="4" w:space="0" w:color="auto"/>
+              <w:right w:val="single" w:sz="4" w:space="0" w:color="auto"/>
+            </w:tcBorders>
+            <w:shd w:val="clear" w:color="auto" w:fill="D9D9D9" w:themeFill="background1" w:themeFillShade="D9"/>
+            <w:hideMark/>
+          </w:tcPr>
+          <w:p>
+            <w:pPr>
+              <w:rPr>
+                <w:rFonts w:ascii="Arial" w:hAnsi="Arial" w:cs="Arial"/>
+              </w:rPr>
+            </w:pPr>
+            <w:r>
+              <w:rPr>
+                <w:rFonts w:ascii="Arial" w:hAnsi="Arial" w:cs="Arial"/>
+              </w:rPr>
+              <w:t>Problemi riscontrati e soluzioni adottate</w:t>
+            </w:r>
+          </w:p>
+        </w:tc>
+      </w:tr>
+      <w:tr>
+        <w:tc>
+          <w:tcPr>
+            <w:tcW w:w="9854" w:type="dxa"/>
+            <w:tcBorders>
+              <w:top w:val="single" w:sz="4" w:space="0" w:color="auto"/>
+              <w:left w:val="single" w:sz="4" w:space="0" w:color="auto"/>
+              <w:bottom w:val="single" w:sz="4" w:space="0" w:color="auto"/>
+              <w:right w:val="single" w:sz="4" w:space="0" w:color="auto"/>
+            </w:tcBorders>
+          </w:tcPr>
+          <w:p>
+            <w:pPr>
+              <w:rPr>
+                <w:rFonts w:ascii="Arial" w:hAnsi="Arial" w:cs="Arial"/>
+              </w:rPr>
+            </w:pPr>
+            <w:r>
+              <w:rPr>
+                <w:rFonts w:ascii="Arial" w:hAnsi="Arial" w:cs="Arial"/>
+              </w:rPr>
+              <w:t>Riguardando i tempi abbiamo capito che non ci resta tempo per implementare le ultimate e quindi vengono tralasciate.</w:t>
+            </w:r>
+          </w:p>
+          <w:p>
+            <w:pPr>
+              <w:rPr>
+                <w:rFonts w:ascii="Arial" w:hAnsi="Arial" w:cs="Arial"/>
+              </w:rPr>
+            </w:pPr>
+          </w:p>
+          <w:p>
+            <w:pPr>
+              <w:rPr>
+                <w:rFonts w:ascii="Arial" w:hAnsi="Arial" w:cs="Arial"/>
+              </w:rPr>
+            </w:pPr>
+            <w:r>
+              <w:rPr>
+                <w:rFonts w:ascii="Arial" w:hAnsi="Arial" w:cs="Arial"/>
+              </w:rPr>
+              <w:t>C’è il problema che al momento, dopo la discussione con il docente, dobbiamo aggiungere e cambiare tante cose come il use case, aggiungere le interazioni del utente con la nuova pagina dei punteggi e il server che stampa i log di errori, vanno aggiunti almeno 4/5 requisiti e altrettanto di test case, che saranno di priorità bassa, visto che il gruppo è la prima volta che lavora con Unity e deve ancora entrare in confidenza con la sua interfaccia e i suoi metodi di usanza tradizionali, visto che bisogna rispettare i punti specifici. Perciò, molto probabilmente, ci saranno tante funzionalità non molto utili per il giocatore, ma che allungano la durata di progettazione e di studio, ma soprattutto non saranno completati, o meglio dire, non completati in maniera giusta, senza che dia problemi all’applicazione finale</w:t>
+            </w:r>
+            <w:r>
+              <w:rPr>
+                <w:rFonts w:ascii="Arial" w:hAnsi="Arial" w:cs="Arial"/>
+              </w:rPr>
+              <w:t>. Inoltre abbiamo già deciso prima della discussione che le ultimate sarebbero state tolte dalla implementazione quindi anche dai requisiti ma adesso stiamo rivalutando come gestire i requisiti.</w:t>
+            </w:r>
+          </w:p>
+        </w:tc>
+      </w:tr>
+    </w:tbl>
+    <w:p>
+      <w:pPr>
+        <w:rPr>
+          <w:rFonts w:ascii="Arial" w:hAnsi="Arial" w:cs="Arial"/>
+        </w:rPr>
+      </w:pPr>
+    </w:p>
+    <w:tbl>
+      <w:tblPr>
+        <w:tblStyle w:val="Grigliatabella"/>
+        <w:tblW w:w="0" w:type="auto"/>
+        <w:tblLook w:val="04A0" w:firstRow="1" w:lastRow="0" w:firstColumn="1" w:lastColumn="0" w:noHBand="0" w:noVBand="1"/>
+      </w:tblPr>
+      <w:tblGrid>
+        <w:gridCol w:w="9628"/>
+      </w:tblGrid>
+      <w:tr>
+        <w:tc>
+          <w:tcPr>
+            <w:tcW w:w="9854" w:type="dxa"/>
+            <w:tcBorders>
+              <w:top w:val="single" w:sz="4" w:space="0" w:color="auto"/>
+              <w:left w:val="single" w:sz="4" w:space="0" w:color="auto"/>
+              <w:bottom w:val="single" w:sz="4" w:space="0" w:color="auto"/>
+              <w:right w:val="single" w:sz="4" w:space="0" w:color="auto"/>
+            </w:tcBorders>
+            <w:shd w:val="clear" w:color="auto" w:fill="D9D9D9" w:themeFill="background1" w:themeFillShade="D9"/>
+            <w:hideMark/>
+          </w:tcPr>
+          <w:p>
+            <w:pPr>
+              <w:rPr>
+                <w:rFonts w:ascii="Arial" w:hAnsi="Arial" w:cs="Arial"/>
+              </w:rPr>
+            </w:pPr>
+            <w:r>
+              <w:rPr>
+                <w:rFonts w:ascii="Arial" w:hAnsi="Arial" w:cs="Arial"/>
+              </w:rPr>
+              <w:t>Punto della situazione rispetto alla pianificazione</w:t>
+            </w:r>
+          </w:p>
+        </w:tc>
+      </w:tr>
+      <w:tr>
+        <w:tc>
+          <w:tcPr>
+            <w:tcW w:w="9854" w:type="dxa"/>
+            <w:tcBorders>
+              <w:top w:val="single" w:sz="4" w:space="0" w:color="auto"/>
+              <w:left w:val="single" w:sz="4" w:space="0" w:color="auto"/>
+              <w:bottom w:val="single" w:sz="4" w:space="0" w:color="auto"/>
+              <w:right w:val="single" w:sz="4" w:space="0" w:color="auto"/>
+            </w:tcBorders>
+          </w:tcPr>
+          <w:p>
+            <w:pPr>
+              <w:rPr>
+                <w:rFonts w:ascii="Arial" w:hAnsi="Arial" w:cs="Arial"/>
+              </w:rPr>
+            </w:pPr>
+          </w:p>
+        </w:tc>
+      </w:tr>
+    </w:tbl>
+    <w:p>
+      <w:pPr>
+        <w:rPr>
+          <w:rFonts w:ascii="Arial" w:hAnsi="Arial" w:cs="Arial"/>
+        </w:rPr>
+      </w:pPr>
+    </w:p>
+    <w:tbl>
+      <w:tblPr>
+        <w:tblStyle w:val="Grigliatabella"/>
+        <w:tblW w:w="0" w:type="auto"/>
+        <w:tblLook w:val="04A0" w:firstRow="1" w:lastRow="0" w:firstColumn="1" w:lastColumn="0" w:noHBand="0" w:noVBand="1"/>
+      </w:tblPr>
+      <w:tblGrid>
+        <w:gridCol w:w="9628"/>
+      </w:tblGrid>
+      <w:tr>
+        <w:tc>
+          <w:tcPr>
+            <w:tcW w:w="9854" w:type="dxa"/>
+            <w:tcBorders>
+              <w:top w:val="single" w:sz="4" w:space="0" w:color="auto"/>
+              <w:left w:val="single" w:sz="4" w:space="0" w:color="auto"/>
+              <w:bottom w:val="single" w:sz="4" w:space="0" w:color="auto"/>
+              <w:right w:val="single" w:sz="4" w:space="0" w:color="auto"/>
+            </w:tcBorders>
+            <w:shd w:val="clear" w:color="auto" w:fill="D9D9D9" w:themeFill="background1" w:themeFillShade="D9"/>
+            <w:hideMark/>
+          </w:tcPr>
+          <w:p>
+            <w:pPr>
+              <w:rPr>
+                <w:rFonts w:ascii="Arial" w:hAnsi="Arial" w:cs="Arial"/>
+              </w:rPr>
+            </w:pPr>
+            <w:r>
+              <w:rPr>
+                <w:rFonts w:ascii="Arial" w:hAnsi="Arial" w:cs="Arial"/>
+              </w:rPr>
+              <w:t>Programma di massima per la prossima giornata di lavoro</w:t>
+            </w:r>
+          </w:p>
+        </w:tc>
+      </w:tr>
+      <w:tr>
+        <w:tc>
+          <w:tcPr>
+            <w:tcW w:w="9854" w:type="dxa"/>
+            <w:tcBorders>
+              <w:top w:val="single" w:sz="4" w:space="0" w:color="auto"/>
+              <w:left w:val="single" w:sz="4" w:space="0" w:color="auto"/>
+              <w:bottom w:val="single" w:sz="4" w:space="0" w:color="auto"/>
+              <w:right w:val="single" w:sz="4" w:space="0" w:color="auto"/>
+            </w:tcBorders>
+          </w:tcPr>
+          <w:p>
+            <w:pPr>
+              <w:rPr>
+                <w:rFonts w:ascii="Arial" w:hAnsi="Arial" w:cs="Arial"/>
+              </w:rPr>
+            </w:pPr>
+            <w:r>
+              <w:rPr>
+                <w:rFonts w:ascii="Arial" w:hAnsi="Arial" w:cs="Arial"/>
+              </w:rPr>
+              <w:t xml:space="preserve">Riguardare </w:t>
+            </w:r>
+            <w:proofErr w:type="spellStart"/>
+            <w:r>
+              <w:rPr>
+                <w:rFonts w:ascii="Arial" w:hAnsi="Arial" w:cs="Arial"/>
+              </w:rPr>
+              <w:t>requisit</w:t>
+            </w:r>
+            <w:proofErr w:type="spellEnd"/>
+            <w:r>
+              <w:rPr>
+                <w:rFonts w:ascii="Arial" w:hAnsi="Arial" w:cs="Arial"/>
+              </w:rPr>
+              <w:t xml:space="preserve"> e test case </w:t>
+            </w:r>
+            <w:r>
+              <w:rPr>
+                <w:rFonts w:ascii="Arial" w:hAnsi="Arial" w:cs="Arial"/>
+              </w:rPr>
+              <w:sym w:font="Wingdings" w:char="F0E0"/>
+            </w:r>
+            <w:proofErr w:type="spellStart"/>
+            <w:proofErr w:type="gramStart"/>
+            <w:r>
+              <w:rPr>
+                <w:rFonts w:ascii="Arial" w:hAnsi="Arial" w:cs="Arial"/>
+              </w:rPr>
+              <w:t>Yasser,Ivan</w:t>
+            </w:r>
+            <w:proofErr w:type="spellEnd"/>
+            <w:proofErr w:type="gramEnd"/>
+          </w:p>
+          <w:p>
+            <w:pPr>
+              <w:rPr>
+                <w:rFonts w:ascii="Arial" w:hAnsi="Arial" w:cs="Arial"/>
+              </w:rPr>
+            </w:pPr>
+            <w:r>
+              <w:rPr>
+                <w:rFonts w:ascii="Arial" w:hAnsi="Arial" w:cs="Arial"/>
+              </w:rPr>
+              <w:t xml:space="preserve">Aggiungere le ultime modifiche al </w:t>
+            </w:r>
+            <w:proofErr w:type="spellStart"/>
+            <w:r>
+              <w:rPr>
+                <w:rFonts w:ascii="Arial" w:hAnsi="Arial" w:cs="Arial"/>
+              </w:rPr>
+              <w:t>gannt</w:t>
+            </w:r>
+            <w:proofErr w:type="spellEnd"/>
+            <w:r>
+              <w:rPr>
+                <w:rFonts w:ascii="Arial" w:hAnsi="Arial" w:cs="Arial"/>
+              </w:rPr>
+              <w:sym w:font="Wingdings" w:char="F0E0"/>
+            </w:r>
+            <w:r>
+              <w:rPr>
+                <w:rFonts w:ascii="Arial" w:hAnsi="Arial" w:cs="Arial"/>
+              </w:rPr>
+              <w:t>Sidon</w:t>
+            </w:r>
+          </w:p>
+          <w:p>
+            <w:pPr>
+              <w:rPr>
+                <w:rFonts w:ascii="Arial" w:hAnsi="Arial" w:cs="Arial"/>
+              </w:rPr>
+            </w:pPr>
+            <w:proofErr w:type="spellStart"/>
+            <w:r>
+              <w:rPr>
+                <w:rFonts w:ascii="Arial" w:hAnsi="Arial" w:cs="Arial"/>
+              </w:rPr>
+              <w:t>Rivisionare</w:t>
+            </w:r>
+            <w:proofErr w:type="spellEnd"/>
+            <w:r>
+              <w:rPr>
+                <w:rFonts w:ascii="Arial" w:hAnsi="Arial" w:cs="Arial"/>
+              </w:rPr>
+              <w:t xml:space="preserve"> use case e diagramma di flusso</w:t>
+            </w:r>
+            <w:r>
+              <w:rPr>
+                <w:rFonts w:ascii="Arial" w:hAnsi="Arial" w:cs="Arial"/>
+              </w:rPr>
+              <w:sym w:font="Wingdings" w:char="F0E0"/>
+            </w:r>
+            <w:r>
+              <w:rPr>
+                <w:rFonts w:ascii="Arial" w:hAnsi="Arial" w:cs="Arial"/>
+              </w:rPr>
+              <w:t>Quan</w:t>
+            </w:r>
+          </w:p>
+          <w:p>
+            <w:pPr>
+              <w:rPr>
+                <w:rFonts w:ascii="Arial" w:hAnsi="Arial" w:cs="Arial"/>
+              </w:rPr>
+            </w:pPr>
+            <w:r>
+              <w:rPr>
+                <w:rFonts w:ascii="Arial" w:hAnsi="Arial" w:cs="Arial"/>
+              </w:rPr>
+              <w:t>Creazione struttura cartelle</w:t>
+            </w:r>
+            <w:r>
+              <w:rPr>
+                <w:rFonts w:ascii="Arial" w:hAnsi="Arial" w:cs="Arial"/>
+              </w:rPr>
+              <w:sym w:font="Wingdings" w:char="F0E0"/>
+            </w:r>
+            <w:r>
+              <w:rPr>
+                <w:rFonts w:ascii="Arial" w:hAnsi="Arial" w:cs="Arial"/>
+              </w:rPr>
+              <w:t xml:space="preserve"> tutti</w:t>
+            </w:r>
+          </w:p>
+          <w:p>
+            <w:pPr>
+              <w:rPr>
+                <w:rFonts w:ascii="Arial" w:hAnsi="Arial" w:cs="Arial"/>
+              </w:rPr>
+            </w:pPr>
+            <w:proofErr w:type="spellStart"/>
+            <w:r>
+              <w:rPr>
+                <w:rFonts w:ascii="Arial" w:hAnsi="Arial" w:cs="Arial"/>
+              </w:rPr>
+              <w:t>Inizare</w:t>
+            </w:r>
+            <w:proofErr w:type="spellEnd"/>
+            <w:r>
+              <w:rPr>
+                <w:rFonts w:ascii="Arial" w:hAnsi="Arial" w:cs="Arial"/>
+              </w:rPr>
+              <w:t xml:space="preserve"> i diversi </w:t>
+            </w:r>
+            <w:proofErr w:type="spellStart"/>
+            <w:r>
+              <w:rPr>
+                <w:rFonts w:ascii="Arial" w:hAnsi="Arial" w:cs="Arial"/>
+              </w:rPr>
+              <w:t>spritesheet</w:t>
+            </w:r>
+            <w:proofErr w:type="spellEnd"/>
+            <w:r>
+              <w:rPr>
+                <w:rFonts w:ascii="Arial" w:hAnsi="Arial" w:cs="Arial"/>
+              </w:rPr>
+              <w:sym w:font="Wingdings" w:char="F0E0"/>
+            </w:r>
+            <w:r>
+              <w:rPr>
+                <w:rFonts w:ascii="Arial" w:hAnsi="Arial" w:cs="Arial"/>
+              </w:rPr>
+              <w:t>Ogni membro il proprio personaggio</w:t>
+            </w:r>
+          </w:p>
+          <w:p>
+            <w:pPr>
+              <w:rPr>
+                <w:rFonts w:ascii="Arial" w:hAnsi="Arial" w:cs="Arial"/>
+              </w:rPr>
+            </w:pPr>
+            <w:proofErr w:type="spellStart"/>
+            <w:r>
+              <w:rPr>
+                <w:rFonts w:ascii="Arial" w:hAnsi="Arial" w:cs="Arial"/>
+              </w:rPr>
+              <w:t>Mockup</w:t>
+            </w:r>
+            <w:proofErr w:type="spellEnd"/>
+            <w:r>
+              <w:rPr>
+                <w:rFonts w:ascii="Arial" w:hAnsi="Arial" w:cs="Arial"/>
+              </w:rPr>
+              <w:t xml:space="preserve"> -&gt; tutti</w:t>
+            </w:r>
+          </w:p>
+        </w:tc>
+      </w:tr>
+    </w:tbl>
+    <w:p>
+      <w:pPr>
+        <w:rPr>
+          <w:rFonts w:ascii="Arial" w:hAnsi="Arial" w:cs="Arial"/>
+        </w:rPr>
+      </w:pPr>
+    </w:p>
+    <w:p>
+      <w:pPr>
+        <w:pStyle w:val="Titolo2"/>
+        <w:rPr>
+          <w:sz w:val="36"/>
+        </w:rPr>
+      </w:pPr>
+      <w:r>
+        <w:rPr>
+          <w:sz w:val="36"/>
+        </w:rPr>
+        <w:t>Agile - Resoconto</w:t>
+      </w:r>
+    </w:p>
+    <w:p/>
+    <w:tbl>
+      <w:tblPr>
+        <w:tblStyle w:val="Grigliatabella"/>
+        <w:tblW w:w="0" w:type="auto"/>
+        <w:tblLook w:val="04A0" w:firstRow="1" w:lastRow="0" w:firstColumn="1" w:lastColumn="0" w:noHBand="0" w:noVBand="1"/>
+      </w:tblPr>
+      <w:tblGrid>
+        <w:gridCol w:w="9628"/>
+      </w:tblGrid>
+      <w:tr>
+        <w:tc>
+          <w:tcPr>
+            <w:tcW w:w="9854" w:type="dxa"/>
+            <w:tcBorders>
+              <w:top w:val="single" w:sz="4" w:space="0" w:color="auto"/>
+              <w:left w:val="single" w:sz="4" w:space="0" w:color="auto"/>
+              <w:bottom w:val="single" w:sz="4" w:space="0" w:color="auto"/>
+              <w:right w:val="single" w:sz="4" w:space="0" w:color="auto"/>
+            </w:tcBorders>
+            <w:shd w:val="clear" w:color="auto" w:fill="D9D9D9" w:themeFill="background1" w:themeFillShade="D9"/>
+            <w:hideMark/>
+          </w:tcPr>
+          <w:p>
+            <w:pPr>
+              <w:rPr>
+                <w:rFonts w:ascii="Arial" w:hAnsi="Arial" w:cs="Arial"/>
+              </w:rPr>
+            </w:pPr>
+            <w:proofErr w:type="spellStart"/>
+            <w:r>
+              <w:rPr>
+                <w:rFonts w:ascii="Arial" w:hAnsi="Arial" w:cs="Arial"/>
+              </w:rPr>
+              <w:t>Daily</w:t>
+            </w:r>
+            <w:proofErr w:type="spellEnd"/>
+            <w:r>
+              <w:rPr>
+                <w:rFonts w:ascii="Arial" w:hAnsi="Arial" w:cs="Arial"/>
+              </w:rPr>
+              <w:t xml:space="preserve"> </w:t>
+            </w:r>
+            <w:proofErr w:type="spellStart"/>
+            <w:r>
+              <w:rPr>
+                <w:rFonts w:ascii="Arial" w:hAnsi="Arial" w:cs="Arial"/>
+              </w:rPr>
+              <w:t>Scrum</w:t>
+            </w:r>
+            <w:proofErr w:type="spellEnd"/>
+          </w:p>
+        </w:tc>
+      </w:tr>
+      <w:tr>
+        <w:tc>
+          <w:tcPr>
+            <w:tcW w:w="9854" w:type="dxa"/>
+            <w:tcBorders>
+              <w:top w:val="single" w:sz="4" w:space="0" w:color="auto"/>
+              <w:left w:val="single" w:sz="4" w:space="0" w:color="auto"/>
+              <w:bottom w:val="single" w:sz="4" w:space="0" w:color="auto"/>
+              <w:right w:val="single" w:sz="4" w:space="0" w:color="auto"/>
+            </w:tcBorders>
+          </w:tcPr>
+          <w:p>
+            <w:pPr>
+              <w:rPr>
+                <w:rFonts w:ascii="Arial" w:hAnsi="Arial" w:cs="Arial"/>
+              </w:rPr>
+            </w:pPr>
+          </w:p>
+        </w:tc>
+      </w:tr>
+    </w:tbl>
+    <w:p>
+      <w:pPr>
+        <w:rPr>
+          <w:rFonts w:ascii="Arial" w:hAnsi="Arial" w:cs="Arial"/>
+        </w:rPr>
+      </w:pPr>
+    </w:p>
+    <w:tbl>
+      <w:tblPr>
+        <w:tblStyle w:val="Grigliatabella"/>
+        <w:tblW w:w="0" w:type="auto"/>
+        <w:tblLook w:val="04A0" w:firstRow="1" w:lastRow="0" w:firstColumn="1" w:lastColumn="0" w:noHBand="0" w:noVBand="1"/>
+      </w:tblPr>
+      <w:tblGrid>
+        <w:gridCol w:w="9628"/>
+      </w:tblGrid>
+      <w:tr>
+        <w:tc>
+          <w:tcPr>
+            <w:tcW w:w="9854" w:type="dxa"/>
+            <w:tcBorders>
+              <w:top w:val="single" w:sz="4" w:space="0" w:color="auto"/>
+              <w:left w:val="single" w:sz="4" w:space="0" w:color="auto"/>
+              <w:bottom w:val="single" w:sz="4" w:space="0" w:color="auto"/>
+              <w:right w:val="single" w:sz="4" w:space="0" w:color="auto"/>
+            </w:tcBorders>
+            <w:shd w:val="clear" w:color="auto" w:fill="D9D9D9" w:themeFill="background1" w:themeFillShade="D9"/>
+            <w:hideMark/>
+          </w:tcPr>
+          <w:p>
+            <w:pPr>
+              <w:rPr>
+                <w:rFonts w:ascii="Arial" w:hAnsi="Arial" w:cs="Arial"/>
+              </w:rPr>
+            </w:pPr>
+            <w:r>
+              <w:rPr>
+                <w:rFonts w:ascii="Arial" w:hAnsi="Arial" w:cs="Arial"/>
+              </w:rPr>
+              <w:t>Sprint Planning</w:t>
+            </w:r>
+          </w:p>
+        </w:tc>
+      </w:tr>
+      <w:tr>
+        <w:tc>
+          <w:tcPr>
+            <w:tcW w:w="9854" w:type="dxa"/>
+            <w:tcBorders>
+              <w:top w:val="single" w:sz="4" w:space="0" w:color="auto"/>
+              <w:left w:val="single" w:sz="4" w:space="0" w:color="auto"/>
+              <w:bottom w:val="single" w:sz="4" w:space="0" w:color="auto"/>
+              <w:right w:val="single" w:sz="4" w:space="0" w:color="auto"/>
+            </w:tcBorders>
+          </w:tcPr>
+          <w:p>
+            <w:pPr>
+              <w:rPr>
+                <w:rFonts w:ascii="Arial" w:hAnsi="Arial" w:cs="Arial"/>
+              </w:rPr>
+            </w:pPr>
+          </w:p>
+        </w:tc>
+      </w:tr>
+    </w:tbl>
+    <w:p>
+      <w:pPr>
+        <w:rPr>
+          <w:rFonts w:ascii="Arial" w:hAnsi="Arial" w:cs="Arial"/>
+        </w:rPr>
+      </w:pPr>
+    </w:p>
+    <w:tbl>
+      <w:tblPr>
+        <w:tblStyle w:val="Grigliatabella"/>
+        <w:tblW w:w="0" w:type="auto"/>
+        <w:tblLook w:val="04A0" w:firstRow="1" w:lastRow="0" w:firstColumn="1" w:lastColumn="0" w:noHBand="0" w:noVBand="1"/>
+      </w:tblPr>
+      <w:tblGrid>
+        <w:gridCol w:w="9628"/>
+      </w:tblGrid>
+      <w:tr>
+        <w:tc>
+          <w:tcPr>
+            <w:tcW w:w="9854" w:type="dxa"/>
+            <w:tcBorders>
+              <w:top w:val="single" w:sz="4" w:space="0" w:color="auto"/>
+              <w:left w:val="single" w:sz="4" w:space="0" w:color="auto"/>
+              <w:bottom w:val="single" w:sz="4" w:space="0" w:color="auto"/>
+              <w:right w:val="single" w:sz="4" w:space="0" w:color="auto"/>
+            </w:tcBorders>
+            <w:shd w:val="clear" w:color="auto" w:fill="D9D9D9" w:themeFill="background1" w:themeFillShade="D9"/>
+            <w:hideMark/>
+          </w:tcPr>
+          <w:p>
+            <w:pPr>
+              <w:rPr>
+                <w:rFonts w:ascii="Arial" w:hAnsi="Arial" w:cs="Arial"/>
+              </w:rPr>
+            </w:pPr>
+            <w:r>
+              <w:rPr>
+                <w:rFonts w:ascii="Arial" w:hAnsi="Arial" w:cs="Arial"/>
+              </w:rPr>
+              <w:t>Sprint Review</w:t>
+            </w:r>
+          </w:p>
+        </w:tc>
+      </w:tr>
+      <w:tr>
+        <w:tc>
+          <w:tcPr>
+            <w:tcW w:w="9854" w:type="dxa"/>
+            <w:tcBorders>
+              <w:top w:val="single" w:sz="4" w:space="0" w:color="auto"/>
+              <w:left w:val="single" w:sz="4" w:space="0" w:color="auto"/>
+              <w:bottom w:val="single" w:sz="4" w:space="0" w:color="auto"/>
+              <w:right w:val="single" w:sz="4" w:space="0" w:color="auto"/>
+            </w:tcBorders>
+          </w:tcPr>
+          <w:p>
+            <w:pPr>
+              <w:rPr>
+                <w:rFonts w:ascii="Arial" w:hAnsi="Arial" w:cs="Arial"/>
+              </w:rPr>
+            </w:pPr>
+          </w:p>
+        </w:tc>
+      </w:tr>
+    </w:tbl>
+    <w:p>
+      <w:pPr>
+        <w:rPr>
+          <w:rFonts w:ascii="Arial" w:hAnsi="Arial" w:cs="Arial"/>
+        </w:rPr>
+      </w:pPr>
+    </w:p>
+    <w:tbl>
+      <w:tblPr>
+        <w:tblStyle w:val="Grigliatabella"/>
+        <w:tblW w:w="0" w:type="auto"/>
+        <w:tblLook w:val="04A0" w:firstRow="1" w:lastRow="0" w:firstColumn="1" w:lastColumn="0" w:noHBand="0" w:noVBand="1"/>
+      </w:tblPr>
+      <w:tblGrid>
+        <w:gridCol w:w="9628"/>
+      </w:tblGrid>
+      <w:tr>
+        <w:tc>
+          <w:tcPr>
+            <w:tcW w:w="9854" w:type="dxa"/>
+            <w:tcBorders>
+              <w:top w:val="single" w:sz="4" w:space="0" w:color="auto"/>
+              <w:left w:val="single" w:sz="4" w:space="0" w:color="auto"/>
+              <w:bottom w:val="single" w:sz="4" w:space="0" w:color="auto"/>
+              <w:right w:val="single" w:sz="4" w:space="0" w:color="auto"/>
+            </w:tcBorders>
+            <w:shd w:val="clear" w:color="auto" w:fill="D9D9D9" w:themeFill="background1" w:themeFillShade="D9"/>
+            <w:hideMark/>
+          </w:tcPr>
+          <w:p>
+            <w:pPr>
+              <w:rPr>
+                <w:rFonts w:ascii="Arial" w:hAnsi="Arial" w:cs="Arial"/>
+              </w:rPr>
+            </w:pPr>
+            <w:r>
+              <w:rPr>
+                <w:rFonts w:ascii="Arial" w:hAnsi="Arial" w:cs="Arial"/>
+              </w:rPr>
+              <w:t xml:space="preserve">Sprint </w:t>
+            </w:r>
+            <w:proofErr w:type="spellStart"/>
+            <w:r>
+              <w:rPr>
+                <w:rFonts w:ascii="Arial" w:hAnsi="Arial" w:cs="Arial"/>
+              </w:rPr>
+              <w:t>Retrospective</w:t>
+            </w:r>
+            <w:proofErr w:type="spellEnd"/>
+          </w:p>
+        </w:tc>
+      </w:tr>
+      <w:tr>
+        <w:tc>
+          <w:tcPr>
+            <w:tcW w:w="9854" w:type="dxa"/>
+            <w:tcBorders>
+              <w:top w:val="single" w:sz="4" w:space="0" w:color="auto"/>
+              <w:left w:val="single" w:sz="4" w:space="0" w:color="auto"/>
+              <w:bottom w:val="single" w:sz="4" w:space="0" w:color="auto"/>
+              <w:right w:val="single" w:sz="4" w:space="0" w:color="auto"/>
+            </w:tcBorders>
+          </w:tcPr>
+          <w:p>
+            <w:pPr>
+              <w:rPr>
+                <w:rFonts w:ascii="Arial" w:hAnsi="Arial" w:cs="Arial"/>
+              </w:rPr>
+            </w:pPr>
+          </w:p>
+        </w:tc>
+      </w:tr>
+    </w:tbl>
+    <w:p>
+      <w:pPr>
+        <w:rPr>
+          <w:rFonts w:ascii="Arial" w:hAnsi="Arial" w:cs="Arial"/>
+        </w:rPr>
+      </w:pPr>
+    </w:p>
+    <w:p>
+      <w:pPr>
+        <w:rPr>
+          <w:rFonts w:ascii="Arial" w:hAnsi="Arial" w:cs="Arial"/>
+        </w:rPr>
+      </w:pPr>
+      <w:r>
+        <w:rPr>
+          <w:rFonts w:ascii="Arial" w:hAnsi="Arial" w:cs="Arial"/>
+        </w:rPr>
+        <w:br w:type="page"/>
+      </w:r>
+    </w:p>
+    <w:tbl>
+      <w:tblPr>
+        <w:tblStyle w:val="Grigliatabella"/>
+        <w:tblW w:w="9634" w:type="dxa"/>
+        <w:tblLook w:val="04A0" w:firstRow="1" w:lastRow="0" w:firstColumn="1" w:lastColumn="0" w:noHBand="0" w:noVBand="1"/>
+      </w:tblPr>
+      <w:tblGrid>
+        <w:gridCol w:w="4803"/>
+        <w:gridCol w:w="4831"/>
+      </w:tblGrid>
+      <w:tr>
+        <w:trPr>
+          <w:trHeight w:hRule="exact" w:val="397"/>
+        </w:trPr>
+        <w:tc>
+          <w:tcPr>
+            <w:tcW w:w="4803" w:type="dxa"/>
+            <w:tcBorders>
+              <w:top w:val="single" w:sz="4" w:space="0" w:color="auto"/>
+              <w:left w:val="single" w:sz="4" w:space="0" w:color="auto"/>
+              <w:bottom w:val="single" w:sz="4" w:space="0" w:color="auto"/>
+              <w:right w:val="single" w:sz="4" w:space="0" w:color="auto"/>
+            </w:tcBorders>
+            <w:vAlign w:val="center"/>
+            <w:hideMark/>
+          </w:tcPr>
+          <w:p>
+            <w:pPr>
+              <w:rPr>
+                <w:rFonts w:ascii="Arial" w:hAnsi="Arial" w:cs="Arial"/>
+              </w:rPr>
+            </w:pPr>
+            <w:r>
+              <w:rPr>
+                <w:rFonts w:ascii="Arial" w:hAnsi="Arial" w:cs="Arial"/>
+              </w:rPr>
+              <w:lastRenderedPageBreak/>
+              <w:t>Luogo</w:t>
+            </w:r>
+          </w:p>
+        </w:tc>
+        <w:tc>
+          <w:tcPr>
+            <w:tcW w:w="4831" w:type="dxa"/>
+            <w:tcBorders>
+              <w:top w:val="single" w:sz="4" w:space="0" w:color="auto"/>
+              <w:left w:val="single" w:sz="4" w:space="0" w:color="auto"/>
+              <w:bottom w:val="single" w:sz="4" w:space="0" w:color="auto"/>
+              <w:right w:val="single" w:sz="4" w:space="0" w:color="auto"/>
+            </w:tcBorders>
+            <w:vAlign w:val="center"/>
+            <w:hideMark/>
+          </w:tcPr>
+          <w:p>
+            <w:pPr>
+              <w:pStyle w:val="Nessunaspaziatura"/>
+              <w:spacing w:line="360" w:lineRule="auto"/>
+              <w:rPr>
+                <w:rFonts w:ascii="Arial" w:hAnsi="Arial" w:cs="Arial"/>
+              </w:rPr>
+            </w:pPr>
+            <w:r>
+              <w:rPr>
+                <w:rFonts w:ascii="Arial" w:hAnsi="Arial" w:cs="Arial"/>
+              </w:rPr>
+              <w:t>Canobbio</w:t>
+            </w:r>
+          </w:p>
+        </w:tc>
+      </w:tr>
+      <w:tr>
+        <w:trPr>
+          <w:trHeight w:hRule="exact" w:val="397"/>
+        </w:trPr>
+        <w:tc>
+          <w:tcPr>
+            <w:tcW w:w="4803" w:type="dxa"/>
+            <w:tcBorders>
+              <w:top w:val="single" w:sz="4" w:space="0" w:color="auto"/>
+              <w:left w:val="single" w:sz="4" w:space="0" w:color="auto"/>
+              <w:bottom w:val="single" w:sz="4" w:space="0" w:color="auto"/>
+              <w:right w:val="single" w:sz="4" w:space="0" w:color="auto"/>
+            </w:tcBorders>
+            <w:vAlign w:val="center"/>
+            <w:hideMark/>
+          </w:tcPr>
+          <w:p>
+            <w:pPr>
+              <w:rPr>
+                <w:rFonts w:ascii="Arial" w:hAnsi="Arial" w:cs="Arial"/>
+              </w:rPr>
+            </w:pPr>
+            <w:r>
+              <w:rPr>
+                <w:rFonts w:ascii="Arial" w:hAnsi="Arial" w:cs="Arial"/>
+              </w:rPr>
+              <w:t>Data</w:t>
+            </w:r>
+          </w:p>
+        </w:tc>
+        <w:tc>
+          <w:tcPr>
+            <w:tcW w:w="4831" w:type="dxa"/>
+            <w:tcBorders>
+              <w:top w:val="single" w:sz="4" w:space="0" w:color="auto"/>
+              <w:left w:val="single" w:sz="4" w:space="0" w:color="auto"/>
+              <w:bottom w:val="single" w:sz="4" w:space="0" w:color="auto"/>
+              <w:right w:val="single" w:sz="4" w:space="0" w:color="auto"/>
+            </w:tcBorders>
+            <w:vAlign w:val="center"/>
+            <w:hideMark/>
+          </w:tcPr>
+          <w:p>
+            <w:pPr>
+              <w:rPr>
+                <w:rFonts w:ascii="Arial" w:hAnsi="Arial" w:cs="Arial"/>
+              </w:rPr>
+            </w:pPr>
+            <w:r>
+              <w:rPr>
+                <w:rFonts w:ascii="Arial" w:hAnsi="Arial" w:cs="Arial"/>
+              </w:rPr>
+              <w:t>27</w:t>
+            </w:r>
+            <w:r>
+              <w:rPr>
+                <w:rFonts w:ascii="Arial" w:hAnsi="Arial" w:cs="Arial"/>
+              </w:rPr>
+              <w:t>.02.2026</w:t>
+            </w:r>
+          </w:p>
+        </w:tc>
+      </w:tr>
+    </w:tbl>
+    <w:p>
+      <w:pPr>
+        <w:rPr>
+          <w:rFonts w:ascii="Arial" w:hAnsi="Arial" w:cs="Arial"/>
+        </w:rPr>
+      </w:pPr>
+    </w:p>
+    <w:tbl>
+      <w:tblPr>
+        <w:tblStyle w:val="Grigliatabella"/>
+        <w:tblW w:w="0" w:type="auto"/>
+        <w:tblLook w:val="04A0" w:firstRow="1" w:lastRow="0" w:firstColumn="1" w:lastColumn="0" w:noHBand="0" w:noVBand="1"/>
+      </w:tblPr>
+      <w:tblGrid>
+        <w:gridCol w:w="1555"/>
+        <w:gridCol w:w="8073"/>
+      </w:tblGrid>
+      <w:tr>
+        <w:tc>
+          <w:tcPr>
+            <w:tcW w:w="9628" w:type="dxa"/>
+            <w:gridSpan w:val="2"/>
+            <w:shd w:val="clear" w:color="auto" w:fill="D9D9D9" w:themeFill="background1" w:themeFillShade="D9"/>
+          </w:tcPr>
+          <w:p>
+            <w:pPr>
+              <w:rPr>
+                <w:rFonts w:ascii="Arial" w:hAnsi="Arial" w:cs="Arial"/>
+              </w:rPr>
+            </w:pPr>
+            <w:r>
+              <w:rPr>
+                <w:rFonts w:ascii="Arial" w:hAnsi="Arial" w:cs="Arial"/>
+              </w:rPr>
+              <w:t>Lavori svolti</w:t>
+            </w:r>
+          </w:p>
+        </w:tc>
+      </w:tr>
+      <w:tr>
+        <w:tc>
+          <w:tcPr>
+            <w:tcW w:w="1555" w:type="dxa"/>
+            <w:vAlign w:val="center"/>
+          </w:tcPr>
+          <w:p>
+            <w:pPr>
+              <w:jc w:val="center"/>
+              <w:rPr>
+                <w:rFonts w:ascii="Arial" w:hAnsi="Arial" w:cs="Arial"/>
+              </w:rPr>
+            </w:pPr>
+            <w:r>
+              <w:rPr>
+                <w:rFonts w:ascii="Arial" w:hAnsi="Arial" w:cs="Arial"/>
+              </w:rPr>
+              <w:t>8:20-9:35</w:t>
+            </w:r>
+          </w:p>
+        </w:tc>
+        <w:tc>
+          <w:tcPr>
+            <w:tcW w:w="8073" w:type="dxa"/>
+          </w:tcPr>
+          <w:p>
+            <w:pPr>
+              <w:jc w:val="both"/>
+              <w:rPr>
+                <w:rFonts w:ascii="Arial" w:hAnsi="Arial" w:cs="Arial"/>
+              </w:rPr>
+            </w:pPr>
+          </w:p>
+        </w:tc>
+      </w:tr>
+      <w:tr>
+        <w:tc>
+          <w:tcPr>
+            <w:tcW w:w="1555" w:type="dxa"/>
+            <w:vAlign w:val="center"/>
+          </w:tcPr>
+          <w:p>
+            <w:pPr>
+              <w:jc w:val="center"/>
+              <w:rPr>
+                <w:rFonts w:ascii="Arial" w:hAnsi="Arial" w:cs="Arial"/>
+              </w:rPr>
+            </w:pPr>
+            <w:r>
+              <w:rPr>
+                <w:rFonts w:ascii="Arial" w:hAnsi="Arial" w:cs="Arial"/>
+              </w:rPr>
+              <w:t>9:50-11:35</w:t>
+            </w:r>
+          </w:p>
+        </w:tc>
+        <w:tc>
+          <w:tcPr>
+            <w:tcW w:w="8073" w:type="dxa"/>
+          </w:tcPr>
+          <w:p>
+            <w:pPr>
+              <w:rPr>
+                <w:rFonts w:ascii="Arial" w:hAnsi="Arial" w:cs="Arial"/>
+              </w:rPr>
+            </w:pPr>
+          </w:p>
+        </w:tc>
+      </w:tr>
+      <w:tr>
+        <w:tc>
+          <w:tcPr>
+            <w:tcW w:w="1555" w:type="dxa"/>
+            <w:vAlign w:val="center"/>
+          </w:tcPr>
+          <w:p>
+            <w:pPr>
+              <w:jc w:val="center"/>
+              <w:rPr>
+                <w:rFonts w:ascii="Arial" w:hAnsi="Arial" w:cs="Arial"/>
+              </w:rPr>
+            </w:pPr>
+            <w:r>
+              <w:rPr>
+                <w:rFonts w:ascii="Arial" w:hAnsi="Arial" w:cs="Arial"/>
+              </w:rPr>
+              <w:t>12:30-14:00</w:t>
+            </w:r>
+          </w:p>
+        </w:tc>
+        <w:tc>
+          <w:tcPr>
+            <w:tcW w:w="8073" w:type="dxa"/>
+          </w:tcPr>
+          <w:p>
+            <w:pPr>
+              <w:jc w:val="both"/>
+              <w:rPr>
+                <w:rFonts w:ascii="Arial" w:hAnsi="Arial" w:cs="Arial"/>
+              </w:rPr>
+            </w:pPr>
+          </w:p>
+        </w:tc>
+      </w:tr>
+      <w:tr>
+        <w:tc>
+          <w:tcPr>
+            <w:tcW w:w="1555" w:type="dxa"/>
+            <w:vAlign w:val="center"/>
+          </w:tcPr>
+          <w:p>
+            <w:pPr>
+              <w:jc w:val="center"/>
+              <w:rPr>
+                <w:rFonts w:ascii="Arial" w:hAnsi="Arial" w:cs="Arial"/>
+              </w:rPr>
+            </w:pPr>
+            <w:r>
+              <w:rPr>
+                <w:rFonts w:ascii="Arial" w:hAnsi="Arial" w:cs="Arial"/>
+              </w:rPr>
+              <w:t>14:15-15:45</w:t>
+            </w:r>
+          </w:p>
+        </w:tc>
+        <w:tc>
+          <w:tcPr>
+            <w:tcW w:w="8073" w:type="dxa"/>
+          </w:tcPr>
+          <w:p>
+            <w:pPr>
+              <w:rPr>
+                <w:rFonts w:ascii="Arial" w:hAnsi="Arial" w:cs="Arial"/>
+              </w:rPr>
+            </w:pPr>
+          </w:p>
+        </w:tc>
+      </w:tr>
+    </w:tbl>
+    <w:p>
+      <w:pPr>
+        <w:rPr>
+          <w:rFonts w:ascii="Arial" w:hAnsi="Arial" w:cs="Arial"/>
+        </w:rPr>
+      </w:pPr>
+    </w:p>
+    <w:tbl>
+      <w:tblPr>
+        <w:tblStyle w:val="Grigliatabella"/>
+        <w:tblW w:w="0" w:type="auto"/>
+        <w:tblLook w:val="04A0" w:firstRow="1" w:lastRow="0" w:firstColumn="1" w:lastColumn="0" w:noHBand="0" w:noVBand="1"/>
+      </w:tblPr>
+      <w:tblGrid>
+        <w:gridCol w:w="9628"/>
+      </w:tblGrid>
+      <w:tr>
+        <w:tc>
+          <w:tcPr>
+            <w:tcW w:w="9854" w:type="dxa"/>
+            <w:tcBorders>
+              <w:top w:val="single" w:sz="4" w:space="0" w:color="auto"/>
+              <w:left w:val="single" w:sz="4" w:space="0" w:color="auto"/>
+              <w:bottom w:val="single" w:sz="4" w:space="0" w:color="auto"/>
+              <w:right w:val="single" w:sz="4" w:space="0" w:color="auto"/>
+            </w:tcBorders>
+            <w:shd w:val="clear" w:color="auto" w:fill="D9D9D9" w:themeFill="background1" w:themeFillShade="D9"/>
+            <w:hideMark/>
+          </w:tcPr>
+          <w:p>
+            <w:pPr>
+              <w:rPr>
+                <w:rFonts w:ascii="Arial" w:hAnsi="Arial" w:cs="Arial"/>
+              </w:rPr>
+            </w:pPr>
+            <w:r>
+              <w:rPr>
+                <w:rFonts w:ascii="Arial" w:hAnsi="Arial" w:cs="Arial"/>
+              </w:rPr>
+              <w:t>Problemi riscontrati e soluzioni adottate</w:t>
+            </w:r>
+          </w:p>
+        </w:tc>
+      </w:tr>
+      <w:tr>
+        <w:tc>
+          <w:tcPr>
+            <w:tcW w:w="9854" w:type="dxa"/>
+            <w:tcBorders>
+              <w:top w:val="single" w:sz="4" w:space="0" w:color="auto"/>
+              <w:left w:val="single" w:sz="4" w:space="0" w:color="auto"/>
+              <w:bottom w:val="single" w:sz="4" w:space="0" w:color="auto"/>
+              <w:right w:val="single" w:sz="4" w:space="0" w:color="auto"/>
+            </w:tcBorders>
+          </w:tcPr>
+          <w:p>
+            <w:pPr>
+              <w:rPr>
+                <w:rFonts w:ascii="Arial" w:hAnsi="Arial" w:cs="Arial"/>
+              </w:rPr>
+            </w:pPr>
+          </w:p>
+        </w:tc>
+      </w:tr>
+    </w:tbl>
+    <w:p>
+      <w:pPr>
+        <w:rPr>
+          <w:rFonts w:ascii="Arial" w:hAnsi="Arial" w:cs="Arial"/>
+        </w:rPr>
+      </w:pPr>
+    </w:p>
+    <w:tbl>
+      <w:tblPr>
+        <w:tblStyle w:val="Grigliatabella"/>
+        <w:tblW w:w="0" w:type="auto"/>
+        <w:tblLook w:val="04A0" w:firstRow="1" w:lastRow="0" w:firstColumn="1" w:lastColumn="0" w:noHBand="0" w:noVBand="1"/>
+      </w:tblPr>
+      <w:tblGrid>
+        <w:gridCol w:w="9628"/>
+      </w:tblGrid>
+      <w:tr>
+        <w:tc>
+          <w:tcPr>
+            <w:tcW w:w="9854" w:type="dxa"/>
+            <w:tcBorders>
+              <w:top w:val="single" w:sz="4" w:space="0" w:color="auto"/>
+              <w:left w:val="single" w:sz="4" w:space="0" w:color="auto"/>
+              <w:bottom w:val="single" w:sz="4" w:space="0" w:color="auto"/>
+              <w:right w:val="single" w:sz="4" w:space="0" w:color="auto"/>
+            </w:tcBorders>
+            <w:shd w:val="clear" w:color="auto" w:fill="D9D9D9" w:themeFill="background1" w:themeFillShade="D9"/>
+            <w:hideMark/>
+          </w:tcPr>
+          <w:p>
+            <w:pPr>
+              <w:rPr>
+                <w:rFonts w:ascii="Arial" w:hAnsi="Arial" w:cs="Arial"/>
+              </w:rPr>
+            </w:pPr>
+            <w:r>
+              <w:rPr>
+                <w:rFonts w:ascii="Arial" w:hAnsi="Arial" w:cs="Arial"/>
+              </w:rPr>
+              <w:t>Punto della situazione rispetto alla pianificazione</w:t>
+            </w:r>
+          </w:p>
+        </w:tc>
+      </w:tr>
+      <w:tr>
+        <w:tc>
+          <w:tcPr>
+            <w:tcW w:w="9854" w:type="dxa"/>
+            <w:tcBorders>
+              <w:top w:val="single" w:sz="4" w:space="0" w:color="auto"/>
+              <w:left w:val="single" w:sz="4" w:space="0" w:color="auto"/>
+              <w:bottom w:val="single" w:sz="4" w:space="0" w:color="auto"/>
+              <w:right w:val="single" w:sz="4" w:space="0" w:color="auto"/>
+            </w:tcBorders>
+          </w:tcPr>
+          <w:p>
+            <w:pPr>
+              <w:rPr>
+                <w:rFonts w:ascii="Arial" w:hAnsi="Arial" w:cs="Arial"/>
+              </w:rPr>
+            </w:pPr>
+          </w:p>
+        </w:tc>
+      </w:tr>
+    </w:tbl>
+    <w:p>
+      <w:pPr>
+        <w:rPr>
+          <w:rFonts w:ascii="Arial" w:hAnsi="Arial" w:cs="Arial"/>
+        </w:rPr>
+      </w:pPr>
+    </w:p>
+    <w:tbl>
+      <w:tblPr>
+        <w:tblStyle w:val="Grigliatabella"/>
+        <w:tblW w:w="0" w:type="auto"/>
+        <w:tblLook w:val="04A0" w:firstRow="1" w:lastRow="0" w:firstColumn="1" w:lastColumn="0" w:noHBand="0" w:noVBand="1"/>
+      </w:tblPr>
+      <w:tblGrid>
+        <w:gridCol w:w="9628"/>
+      </w:tblGrid>
+      <w:tr>
+        <w:tc>
+          <w:tcPr>
+            <w:tcW w:w="9854" w:type="dxa"/>
+            <w:tcBorders>
+              <w:top w:val="single" w:sz="4" w:space="0" w:color="auto"/>
+              <w:left w:val="single" w:sz="4" w:space="0" w:color="auto"/>
+              <w:bottom w:val="single" w:sz="4" w:space="0" w:color="auto"/>
+              <w:right w:val="single" w:sz="4" w:space="0" w:color="auto"/>
+            </w:tcBorders>
+            <w:shd w:val="clear" w:color="auto" w:fill="D9D9D9" w:themeFill="background1" w:themeFillShade="D9"/>
+            <w:hideMark/>
+          </w:tcPr>
+          <w:p>
+            <w:pPr>
+              <w:rPr>
+                <w:rFonts w:ascii="Arial" w:hAnsi="Arial" w:cs="Arial"/>
+              </w:rPr>
+            </w:pPr>
+            <w:r>
+              <w:rPr>
+                <w:rFonts w:ascii="Arial" w:hAnsi="Arial" w:cs="Arial"/>
+              </w:rPr>
+              <w:t>Programma di massima per la prossima giornata di lavoro</w:t>
+            </w:r>
+          </w:p>
+        </w:tc>
+      </w:tr>
+      <w:tr>
+        <w:tc>
+          <w:tcPr>
+            <w:tcW w:w="9854" w:type="dxa"/>
+            <w:tcBorders>
+              <w:top w:val="single" w:sz="4" w:space="0" w:color="auto"/>
+              <w:left w:val="single" w:sz="4" w:space="0" w:color="auto"/>
+              <w:bottom w:val="single" w:sz="4" w:space="0" w:color="auto"/>
+              <w:right w:val="single" w:sz="4" w:space="0" w:color="auto"/>
+            </w:tcBorders>
+          </w:tcPr>
+          <w:p>
+            <w:pPr>
+              <w:rPr>
+                <w:rFonts w:ascii="Arial" w:hAnsi="Arial" w:cs="Arial"/>
+              </w:rPr>
+            </w:pPr>
+          </w:p>
+        </w:tc>
+      </w:tr>
+    </w:tbl>
+    <w:p>
+      <w:pPr>
+        <w:rPr>
+          <w:rFonts w:ascii="Arial" w:hAnsi="Arial" w:cs="Arial"/>
+        </w:rPr>
+      </w:pPr>
+    </w:p>
+    <w:p>
+      <w:pPr>
+        <w:pStyle w:val="Titolo2"/>
+        <w:rPr>
+          <w:sz w:val="36"/>
+        </w:rPr>
+      </w:pPr>
+      <w:r>
+        <w:rPr>
+          <w:sz w:val="36"/>
+        </w:rPr>
+        <w:t>Agile - Resoconto</w:t>
+      </w:r>
+    </w:p>
+    <w:p/>
+    <w:tbl>
+      <w:tblPr>
+        <w:tblStyle w:val="Grigliatabella"/>
+        <w:tblW w:w="0" w:type="auto"/>
+        <w:tblLook w:val="04A0" w:firstRow="1" w:lastRow="0" w:firstColumn="1" w:lastColumn="0" w:noHBand="0" w:noVBand="1"/>
+      </w:tblPr>
+      <w:tblGrid>
+        <w:gridCol w:w="9628"/>
+      </w:tblGrid>
+      <w:tr>
+        <w:tc>
+          <w:tcPr>
+            <w:tcW w:w="9854" w:type="dxa"/>
+            <w:tcBorders>
+              <w:top w:val="single" w:sz="4" w:space="0" w:color="auto"/>
+              <w:left w:val="single" w:sz="4" w:space="0" w:color="auto"/>
+              <w:bottom w:val="single" w:sz="4" w:space="0" w:color="auto"/>
+              <w:right w:val="single" w:sz="4" w:space="0" w:color="auto"/>
+            </w:tcBorders>
+            <w:shd w:val="clear" w:color="auto" w:fill="D9D9D9" w:themeFill="background1" w:themeFillShade="D9"/>
+            <w:hideMark/>
+          </w:tcPr>
+          <w:p>
+            <w:pPr>
+              <w:rPr>
+                <w:rFonts w:ascii="Arial" w:hAnsi="Arial" w:cs="Arial"/>
+              </w:rPr>
+            </w:pPr>
+            <w:proofErr w:type="spellStart"/>
+            <w:r>
+              <w:rPr>
+                <w:rFonts w:ascii="Arial" w:hAnsi="Arial" w:cs="Arial"/>
+              </w:rPr>
+              <w:t>Daily</w:t>
+            </w:r>
+            <w:proofErr w:type="spellEnd"/>
+            <w:r>
+              <w:rPr>
+                <w:rFonts w:ascii="Arial" w:hAnsi="Arial" w:cs="Arial"/>
+              </w:rPr>
+              <w:t xml:space="preserve"> </w:t>
+            </w:r>
+            <w:proofErr w:type="spellStart"/>
+            <w:r>
+              <w:rPr>
+                <w:rFonts w:ascii="Arial" w:hAnsi="Arial" w:cs="Arial"/>
+              </w:rPr>
+              <w:t>Scrum</w:t>
+            </w:r>
+            <w:proofErr w:type="spellEnd"/>
+          </w:p>
+        </w:tc>
+      </w:tr>
+      <w:tr>
+        <w:tc>
+          <w:tcPr>
+            <w:tcW w:w="9854" w:type="dxa"/>
+            <w:tcBorders>
+              <w:top w:val="single" w:sz="4" w:space="0" w:color="auto"/>
+              <w:left w:val="single" w:sz="4" w:space="0" w:color="auto"/>
+              <w:bottom w:val="single" w:sz="4" w:space="0" w:color="auto"/>
+              <w:right w:val="single" w:sz="4" w:space="0" w:color="auto"/>
+            </w:tcBorders>
+          </w:tcPr>
+          <w:p>
+            <w:pPr>
+              <w:rPr>
+                <w:rFonts w:ascii="Arial" w:hAnsi="Arial" w:cs="Arial"/>
+              </w:rPr>
+            </w:pPr>
+          </w:p>
+        </w:tc>
+      </w:tr>
+    </w:tbl>
+    <w:p>
+      <w:pPr>
+        <w:rPr>
+          <w:rFonts w:ascii="Arial" w:hAnsi="Arial" w:cs="Arial"/>
+        </w:rPr>
+      </w:pPr>
+    </w:p>
+    <w:tbl>
+      <w:tblPr>
+        <w:tblStyle w:val="Grigliatabella"/>
+        <w:tblW w:w="0" w:type="auto"/>
+        <w:tblLook w:val="04A0" w:firstRow="1" w:lastRow="0" w:firstColumn="1" w:lastColumn="0" w:noHBand="0" w:noVBand="1"/>
+      </w:tblPr>
+      <w:tblGrid>
+        <w:gridCol w:w="9628"/>
+      </w:tblGrid>
+      <w:tr>
+        <w:tc>
+          <w:tcPr>
+            <w:tcW w:w="9854" w:type="dxa"/>
+            <w:tcBorders>
+              <w:top w:val="single" w:sz="4" w:space="0" w:color="auto"/>
+              <w:left w:val="single" w:sz="4" w:space="0" w:color="auto"/>
+              <w:bottom w:val="single" w:sz="4" w:space="0" w:color="auto"/>
+              <w:right w:val="single" w:sz="4" w:space="0" w:color="auto"/>
+            </w:tcBorders>
+            <w:shd w:val="clear" w:color="auto" w:fill="D9D9D9" w:themeFill="background1" w:themeFillShade="D9"/>
+            <w:hideMark/>
+          </w:tcPr>
+          <w:p>
+            <w:pPr>
+              <w:rPr>
+                <w:rFonts w:ascii="Arial" w:hAnsi="Arial" w:cs="Arial"/>
+              </w:rPr>
+            </w:pPr>
+            <w:r>
+              <w:rPr>
+                <w:rFonts w:ascii="Arial" w:hAnsi="Arial" w:cs="Arial"/>
+              </w:rPr>
+              <w:t>Sprint Planning</w:t>
+            </w:r>
+          </w:p>
+        </w:tc>
+      </w:tr>
+      <w:tr>
+        <w:tc>
+          <w:tcPr>
+            <w:tcW w:w="9854" w:type="dxa"/>
+            <w:tcBorders>
+              <w:top w:val="single" w:sz="4" w:space="0" w:color="auto"/>
+              <w:left w:val="single" w:sz="4" w:space="0" w:color="auto"/>
+              <w:bottom w:val="single" w:sz="4" w:space="0" w:color="auto"/>
+              <w:right w:val="single" w:sz="4" w:space="0" w:color="auto"/>
+            </w:tcBorders>
+          </w:tcPr>
+          <w:p>
+            <w:pPr>
+              <w:rPr>
+                <w:rFonts w:ascii="Arial" w:hAnsi="Arial" w:cs="Arial"/>
+              </w:rPr>
+            </w:pPr>
+          </w:p>
+        </w:tc>
+      </w:tr>
+    </w:tbl>
+    <w:p>
+      <w:pPr>
+        <w:rPr>
+          <w:rFonts w:ascii="Arial" w:hAnsi="Arial" w:cs="Arial"/>
+        </w:rPr>
+      </w:pPr>
+    </w:p>
+    <w:tbl>
+      <w:tblPr>
+        <w:tblStyle w:val="Grigliatabella"/>
+        <w:tblW w:w="0" w:type="auto"/>
+        <w:tblLook w:val="04A0" w:firstRow="1" w:lastRow="0" w:firstColumn="1" w:lastColumn="0" w:noHBand="0" w:noVBand="1"/>
+      </w:tblPr>
+      <w:tblGrid>
+        <w:gridCol w:w="9628"/>
+      </w:tblGrid>
+      <w:tr>
+        <w:tc>
+          <w:tcPr>
+            <w:tcW w:w="9854" w:type="dxa"/>
+            <w:tcBorders>
+              <w:top w:val="single" w:sz="4" w:space="0" w:color="auto"/>
+              <w:left w:val="single" w:sz="4" w:space="0" w:color="auto"/>
+              <w:bottom w:val="single" w:sz="4" w:space="0" w:color="auto"/>
+              <w:right w:val="single" w:sz="4" w:space="0" w:color="auto"/>
+            </w:tcBorders>
+            <w:shd w:val="clear" w:color="auto" w:fill="D9D9D9" w:themeFill="background1" w:themeFillShade="D9"/>
+            <w:hideMark/>
+          </w:tcPr>
+          <w:p>
+            <w:pPr>
+              <w:rPr>
+                <w:rFonts w:ascii="Arial" w:hAnsi="Arial" w:cs="Arial"/>
+              </w:rPr>
+            </w:pPr>
+            <w:r>
+              <w:rPr>
+                <w:rFonts w:ascii="Arial" w:hAnsi="Arial" w:cs="Arial"/>
+              </w:rPr>
+              <w:t>Sprint Review</w:t>
+            </w:r>
+          </w:p>
+        </w:tc>
+      </w:tr>
+      <w:tr>
+        <w:tc>
+          <w:tcPr>
+            <w:tcW w:w="9854" w:type="dxa"/>
+            <w:tcBorders>
+              <w:top w:val="single" w:sz="4" w:space="0" w:color="auto"/>
+              <w:left w:val="single" w:sz="4" w:space="0" w:color="auto"/>
+              <w:bottom w:val="single" w:sz="4" w:space="0" w:color="auto"/>
+              <w:right w:val="single" w:sz="4" w:space="0" w:color="auto"/>
+            </w:tcBorders>
+          </w:tcPr>
+          <w:p>
+            <w:pPr>
+              <w:rPr>
+                <w:rFonts w:ascii="Arial" w:hAnsi="Arial" w:cs="Arial"/>
+              </w:rPr>
+            </w:pPr>
+          </w:p>
+        </w:tc>
+      </w:tr>
+    </w:tbl>
+    <w:p>
+      <w:pPr>
+        <w:rPr>
+          <w:rFonts w:ascii="Arial" w:hAnsi="Arial" w:cs="Arial"/>
+        </w:rPr>
+      </w:pPr>
+    </w:p>
+    <w:tbl>
+      <w:tblPr>
+        <w:tblStyle w:val="Grigliatabella"/>
+        <w:tblW w:w="0" w:type="auto"/>
+        <w:tblLook w:val="04A0" w:firstRow="1" w:lastRow="0" w:firstColumn="1" w:lastColumn="0" w:noHBand="0" w:noVBand="1"/>
+      </w:tblPr>
+      <w:tblGrid>
+        <w:gridCol w:w="9628"/>
+      </w:tblGrid>
+      <w:tr>
+        <w:tc>
+          <w:tcPr>
+            <w:tcW w:w="9854" w:type="dxa"/>
+            <w:tcBorders>
+              <w:top w:val="single" w:sz="4" w:space="0" w:color="auto"/>
+              <w:left w:val="single" w:sz="4" w:space="0" w:color="auto"/>
+              <w:bottom w:val="single" w:sz="4" w:space="0" w:color="auto"/>
+              <w:right w:val="single" w:sz="4" w:space="0" w:color="auto"/>
+            </w:tcBorders>
+            <w:shd w:val="clear" w:color="auto" w:fill="D9D9D9" w:themeFill="background1" w:themeFillShade="D9"/>
+            <w:hideMark/>
+          </w:tcPr>
+          <w:p>
+            <w:pPr>
+              <w:rPr>
+                <w:rFonts w:ascii="Arial" w:hAnsi="Arial" w:cs="Arial"/>
+              </w:rPr>
+            </w:pPr>
+            <w:r>
+              <w:rPr>
+                <w:rFonts w:ascii="Arial" w:hAnsi="Arial" w:cs="Arial"/>
+              </w:rPr>
+              <w:t xml:space="preserve">Sprint </w:t>
+            </w:r>
+            <w:proofErr w:type="spellStart"/>
+            <w:r>
+              <w:rPr>
+                <w:rFonts w:ascii="Arial" w:hAnsi="Arial" w:cs="Arial"/>
+              </w:rPr>
+              <w:t>Retrospective</w:t>
+            </w:r>
+            <w:proofErr w:type="spellEnd"/>
+          </w:p>
+        </w:tc>
+      </w:tr>
+      <w:tr>
+        <w:tc>
+          <w:tcPr>
+            <w:tcW w:w="9854" w:type="dxa"/>
+            <w:tcBorders>
+              <w:top w:val="single" w:sz="4" w:space="0" w:color="auto"/>
+              <w:left w:val="single" w:sz="4" w:space="0" w:color="auto"/>
+              <w:bottom w:val="single" w:sz="4" w:space="0" w:color="auto"/>
+              <w:right w:val="single" w:sz="4" w:space="0" w:color="auto"/>
+            </w:tcBorders>
+          </w:tcPr>
+          <w:p>
+            <w:pPr>
+              <w:rPr>
+                <w:rFonts w:ascii="Arial" w:hAnsi="Arial" w:cs="Arial"/>
+              </w:rPr>
+            </w:pPr>
           </w:p>
         </w:tc>
       </w:tr>
@@ -5511,10 +7869,32 @@
     <w:qFormat/>
     <w:rsid w:val="00632B06"/>
   </w:style>
+  <w:style w:type="paragraph" w:styleId="Titolo2">
+    <w:name w:val="heading 2"/>
+    <w:basedOn w:val="Normale"/>
+    <w:next w:val="Normale"/>
+    <w:link w:val="Titolo2Carattere"/>
+    <w:uiPriority w:val="9"/>
+    <w:semiHidden/>
+    <w:unhideWhenUsed/>
+    <w:qFormat/>
+    <w:rsid w:val="00262506"/>
+    <w:pPr>
+      <w:keepNext/>
+      <w:keepLines/>
+      <w:spacing w:before="40" w:after="0"/>
+      <w:outlineLvl w:val="1"/>
+    </w:pPr>
+    <w:rPr>
+      <w:rFonts w:asciiTheme="majorHAnsi" w:eastAsiaTheme="majorEastAsia" w:hAnsiTheme="majorHAnsi" w:cstheme="majorBidi"/>
+      <w:color w:val="365F91" w:themeColor="accent1" w:themeShade="BF"/>
+      <w:sz w:val="26"/>
+      <w:szCs w:val="26"/>
+    </w:rPr>
+  </w:style>
   <w:style w:type="character" w:default="1" w:styleId="Carpredefinitoparagrafo">
     <w:name w:val="Default Paragraph Font"/>
     <w:uiPriority w:val="1"/>
-    <w:semiHidden/>
     <w:unhideWhenUsed/>
   </w:style>
   <w:style w:type="table" w:default="1" w:styleId="Tabellanormale">
@@ -5976,6 +8356,88 @@
     <w:rPr>
       <w:color w:val="605E5C"/>
       <w:shd w:val="clear" w:color="auto" w:fill="E1DFDD"/>
+    </w:rPr>
+  </w:style>
+  <w:style w:type="character" w:customStyle="1" w:styleId="Titolo2Carattere">
+    <w:name w:val="Titolo 2 Carattere"/>
+    <w:basedOn w:val="Carpredefinitoparagrafo"/>
+    <w:link w:val="Titolo2"/>
+    <w:uiPriority w:val="9"/>
+    <w:semiHidden/>
+    <w:rsid w:val="00262506"/>
+    <w:rPr>
+      <w:rFonts w:asciiTheme="majorHAnsi" w:eastAsiaTheme="majorEastAsia" w:hAnsiTheme="majorHAnsi" w:cstheme="majorBidi"/>
+      <w:color w:val="365F91" w:themeColor="accent1" w:themeShade="BF"/>
+      <w:sz w:val="26"/>
+      <w:szCs w:val="26"/>
+    </w:rPr>
+  </w:style>
+  <w:style w:type="character" w:styleId="Rimandocommento">
+    <w:name w:val="annotation reference"/>
+    <w:basedOn w:val="Carpredefinitoparagrafo"/>
+    <w:uiPriority w:val="99"/>
+    <w:semiHidden/>
+    <w:unhideWhenUsed/>
+    <w:rsid w:val="00784E54"/>
+    <w:rPr>
+      <w:sz w:val="16"/>
+      <w:szCs w:val="16"/>
+    </w:rPr>
+  </w:style>
+  <w:style w:type="paragraph" w:styleId="Testocommento">
+    <w:name w:val="annotation text"/>
+    <w:basedOn w:val="Normale"/>
+    <w:link w:val="TestocommentoCarattere"/>
+    <w:uiPriority w:val="99"/>
+    <w:semiHidden/>
+    <w:unhideWhenUsed/>
+    <w:rsid w:val="00784E54"/>
+    <w:pPr>
+      <w:spacing w:line="240" w:lineRule="auto"/>
+    </w:pPr>
+    <w:rPr>
+      <w:sz w:val="20"/>
+      <w:szCs w:val="20"/>
+    </w:rPr>
+  </w:style>
+  <w:style w:type="character" w:customStyle="1" w:styleId="TestocommentoCarattere">
+    <w:name w:val="Testo commento Carattere"/>
+    <w:basedOn w:val="Carpredefinitoparagrafo"/>
+    <w:link w:val="Testocommento"/>
+    <w:uiPriority w:val="99"/>
+    <w:semiHidden/>
+    <w:rsid w:val="00784E54"/>
+    <w:rPr>
+      <w:sz w:val="20"/>
+      <w:szCs w:val="20"/>
+    </w:rPr>
+  </w:style>
+  <w:style w:type="paragraph" w:styleId="Soggettocommento">
+    <w:name w:val="annotation subject"/>
+    <w:basedOn w:val="Testocommento"/>
+    <w:next w:val="Testocommento"/>
+    <w:link w:val="SoggettocommentoCarattere"/>
+    <w:uiPriority w:val="99"/>
+    <w:semiHidden/>
+    <w:unhideWhenUsed/>
+    <w:rsid w:val="00784E54"/>
+    <w:rPr>
+      <w:b/>
+      <w:bCs/>
+    </w:rPr>
+  </w:style>
+  <w:style w:type="character" w:customStyle="1" w:styleId="SoggettocommentoCarattere">
+    <w:name w:val="Soggetto commento Carattere"/>
+    <w:basedOn w:val="TestocommentoCarattere"/>
+    <w:link w:val="Soggettocommento"/>
+    <w:uiPriority w:val="99"/>
+    <w:semiHidden/>
+    <w:rsid w:val="00784E54"/>
+    <w:rPr>
+      <w:b/>
+      <w:bCs/>
+      <w:sz w:val="20"/>
+      <w:szCs w:val="20"/>
     </w:rPr>
   </w:style>
 </w:styles>
@@ -6267,6 +8729,27 @@
 </file>
 
 <file path=customXml/item1.xml><?xml version="1.0" encoding="utf-8"?>
+<?mso-contentType ?>
+<FormTemplates xmlns="http://schemas.microsoft.com/sharepoint/v3/contenttype/forms">
+  <Display>DocumentLibraryForm</Display>
+  <Edit>DocumentLibraryForm</Edit>
+  <New>DocumentLibraryForm</New>
+</FormTemplates>
+</file>
+
+<file path=customXml/item2.xml><?xml version="1.0" encoding="utf-8"?>
+<p:properties xmlns:p="http://schemas.microsoft.com/office/2006/metadata/properties" xmlns:xsi="http://www.w3.org/2001/XMLSchema-instance" xmlns:pc="http://schemas.microsoft.com/office/infopath/2007/PartnerControls">
+  <documentManagement>
+    <_activity xmlns="9a5989ba-1f3a-4074-8e62-988f1f5a6d91" xsi:nil="true"/>
+  </documentManagement>
+</p:properties>
+</file>
+
+<file path=customXml/item3.xml><?xml version="1.0" encoding="utf-8"?>
+<b:Sources xmlns:b="http://schemas.openxmlformats.org/officeDocument/2006/bibliography" xmlns="http://schemas.openxmlformats.org/officeDocument/2006/bibliography" SelectedStyle="\APA.XSL" StyleName="APA"/>
+</file>
+
+<file path=customXml/item4.xml><?xml version="1.0" encoding="utf-8"?>
 <ct:contentTypeSchema xmlns:ct="http://schemas.microsoft.com/office/2006/metadata/contentType" xmlns:ma="http://schemas.microsoft.com/office/2006/metadata/properties/metaAttributes" ct:_="" ma:_="" ma:contentTypeName="Documento" ma:contentTypeID="0x0101001D68984F87EC994ABE7B851987432E7B" ma:contentTypeVersion="13" ma:contentTypeDescription="Creare un nuovo documento." ma:contentTypeScope="" ma:versionID="9735a29966f8059e51308ea1cecd41eb">
   <xsd:schema xmlns:xsd="http://www.w3.org/2001/XMLSchema" xmlns:xs="http://www.w3.org/2001/XMLSchema" xmlns:p="http://schemas.microsoft.com/office/2006/metadata/properties" xmlns:ns3="d8eed4e0-1c4d-4eb7-9d5a-8c6be5a7f7cc" xmlns:ns4="9a5989ba-1f3a-4074-8e62-988f1f5a6d91" targetNamespace="http://schemas.microsoft.com/office/2006/metadata/properties" ma:root="true" ma:fieldsID="10fd3cb04b3c10d561cc1ece84de1cfd" ns3:_="" ns4:_="">
     <xsd:import namespace="d8eed4e0-1c4d-4eb7-9d5a-8c6be5a7f7cc"/>
@@ -6487,28 +8970,33 @@
 </ct:contentTypeSchema>
 </file>
 
-<file path=customXml/item2.xml><?xml version="1.0" encoding="utf-8"?>
-<b:Sources xmlns:b="http://schemas.openxmlformats.org/officeDocument/2006/bibliography" xmlns="http://schemas.openxmlformats.org/officeDocument/2006/bibliography" SelectedStyle="\APA.XSL" StyleName="APA"/>
+<file path=customXml/itemProps1.xml><?xml version="1.0" encoding="utf-8"?>
+<ds:datastoreItem xmlns:ds="http://schemas.openxmlformats.org/officeDocument/2006/customXml" ds:itemID="{F88632BD-6596-4D41-8033-40DE95A98259}">
+  <ds:schemaRefs>
+    <ds:schemaRef ds:uri="http://schemas.microsoft.com/sharepoint/v3/contenttype/forms"/>
+  </ds:schemaRefs>
+</ds:datastoreItem>
 </file>
 
-<file path=customXml/item3.xml><?xml version="1.0" encoding="utf-8"?>
-<p:properties xmlns:p="http://schemas.microsoft.com/office/2006/metadata/properties" xmlns:xsi="http://www.w3.org/2001/XMLSchema-instance" xmlns:pc="http://schemas.microsoft.com/office/infopath/2007/PartnerControls">
-  <documentManagement>
-    <_activity xmlns="9a5989ba-1f3a-4074-8e62-988f1f5a6d91" xsi:nil="true"/>
-  </documentManagement>
-</p:properties>
+<file path=customXml/itemProps2.xml><?xml version="1.0" encoding="utf-8"?>
+<ds:datastoreItem xmlns:ds="http://schemas.openxmlformats.org/officeDocument/2006/customXml" ds:itemID="{4C5564E7-A054-43C4-BF74-7A145474E87C}">
+  <ds:schemaRefs>
+    <ds:schemaRef ds:uri="http://schemas.microsoft.com/office/2006/metadata/properties"/>
+    <ds:schemaRef ds:uri="http://schemas.microsoft.com/office/infopath/2007/PartnerControls"/>
+    <ds:schemaRef ds:uri="9a5989ba-1f3a-4074-8e62-988f1f5a6d91"/>
+  </ds:schemaRefs>
+</ds:datastoreItem>
 </file>
 
-<file path=customXml/item4.xml><?xml version="1.0" encoding="utf-8"?>
-<?mso-contentType ?>
-<FormTemplates xmlns="http://schemas.microsoft.com/sharepoint/v3/contenttype/forms">
-  <Display>DocumentLibraryForm</Display>
-  <Edit>DocumentLibraryForm</Edit>
-  <New>DocumentLibraryForm</New>
-</FormTemplates>
+<file path=customXml/itemProps3.xml><?xml version="1.0" encoding="utf-8"?>
+<ds:datastoreItem xmlns:ds="http://schemas.openxmlformats.org/officeDocument/2006/customXml" ds:itemID="{A4D352A7-3801-4E51-8ED0-E5F8E4A7EC31}">
+  <ds:schemaRefs>
+    <ds:schemaRef ds:uri="http://schemas.openxmlformats.org/officeDocument/2006/bibliography"/>
+  </ds:schemaRefs>
+</ds:datastoreItem>
 </file>
 
-<file path=customXml/itemProps1.xml><?xml version="1.0" encoding="utf-8"?>
+<file path=customXml/itemProps4.xml><?xml version="1.0" encoding="utf-8"?>
 <ds:datastoreItem xmlns:ds="http://schemas.openxmlformats.org/officeDocument/2006/customXml" ds:itemID="{DF47FB3B-BE2E-4282-A583-D09F8A90D7A9}">
   <ds:schemaRefs>
     <ds:schemaRef ds:uri="http://schemas.microsoft.com/office/2006/metadata/contentType"/>
@@ -6525,30 +9013,4 @@
     <ds:schemaRef ds:uri="http://schemas.microsoft.com/internal/obd"/>
   </ds:schemaRefs>
 </ds:datastoreItem>
-</file>
-
-<file path=customXml/itemProps2.xml><?xml version="1.0" encoding="utf-8"?>
-<ds:datastoreItem xmlns:ds="http://schemas.openxmlformats.org/officeDocument/2006/customXml" ds:itemID="{A4D352A7-3801-4E51-8ED0-E5F8E4A7EC31}">
-  <ds:schemaRefs>
-    <ds:schemaRef ds:uri="http://schemas.openxmlformats.org/officeDocument/2006/bibliography"/>
-  </ds:schemaRefs>
-</ds:datastoreItem>
-</file>
-
-<file path=customXml/itemProps3.xml><?xml version="1.0" encoding="utf-8"?>
-<ds:datastoreItem xmlns:ds="http://schemas.openxmlformats.org/officeDocument/2006/customXml" ds:itemID="{4C5564E7-A054-43C4-BF74-7A145474E87C}">
-  <ds:schemaRefs>
-    <ds:schemaRef ds:uri="http://schemas.microsoft.com/office/2006/metadata/properties"/>
-    <ds:schemaRef ds:uri="http://schemas.microsoft.com/office/infopath/2007/PartnerControls"/>
-    <ds:schemaRef ds:uri="9a5989ba-1f3a-4074-8e62-988f1f5a6d91"/>
-  </ds:schemaRefs>
-</ds:datastoreItem>
-</file>
-
-<file path=customXml/itemProps4.xml><?xml version="1.0" encoding="utf-8"?>
-<ds:datastoreItem xmlns:ds="http://schemas.openxmlformats.org/officeDocument/2006/customXml" ds:itemID="{F88632BD-6596-4D41-8033-40DE95A98259}">
-  <ds:schemaRefs>
-    <ds:schemaRef ds:uri="http://schemas.microsoft.com/sharepoint/v3/contenttype/forms"/>
-  </ds:schemaRefs>
-</ds:datastoreItem>
 </file>
</xml_diff>

<commit_message>
Diaro del Giorno 06.03.2026
</commit_message>
<xml_diff>
--- a/4_Diari/Diario di Lavoro.docx
+++ b/4_Diari/Diario di Lavoro.docx
@@ -2041,21 +2041,7 @@
               <w:rPr>
                 <w:rFonts w:ascii="Arial" w:hAnsi="Arial" w:cs="Arial"/>
               </w:rPr>
-              <w:t xml:space="preserve">iniziato a documentare </w:t>
-            </w:r>
-            <w:proofErr w:type="gramStart"/>
-            <w:r>
-              <w:rPr>
-                <w:rFonts w:ascii="Arial" w:hAnsi="Arial" w:cs="Arial"/>
-              </w:rPr>
-              <w:t>i use</w:t>
-            </w:r>
-            <w:proofErr w:type="gramEnd"/>
-            <w:r>
-              <w:rPr>
-                <w:rFonts w:ascii="Arial" w:hAnsi="Arial" w:cs="Arial"/>
-              </w:rPr>
-              <w:t xml:space="preserve"> case e i diagrammi</w:t>
+              <w:t>iniziato a documentare i use case e i diagrammi</w:t>
             </w:r>
           </w:p>
         </w:tc>
@@ -4327,21 +4313,7 @@
               <w:rPr>
                 <w:rFonts w:ascii="Arial" w:hAnsi="Arial" w:cs="Arial"/>
               </w:rPr>
-              <w:t xml:space="preserve"> e </w:t>
-            </w:r>
-            <w:proofErr w:type="gramStart"/>
-            <w:r>
-              <w:rPr>
-                <w:rFonts w:ascii="Arial" w:hAnsi="Arial" w:cs="Arial"/>
-              </w:rPr>
-              <w:t>i use</w:t>
-            </w:r>
-            <w:proofErr w:type="gramEnd"/>
-            <w:r>
-              <w:rPr>
-                <w:rFonts w:ascii="Arial" w:hAnsi="Arial" w:cs="Arial"/>
-              </w:rPr>
-              <w:t xml:space="preserve"> case</w:t>
+              <w:t xml:space="preserve"> e i use case</w:t>
             </w:r>
           </w:p>
         </w:tc>
@@ -5084,25 +5056,7 @@
               <w:rPr>
                 <w:rFonts w:ascii="Arial" w:hAnsi="Arial" w:cs="Arial"/>
               </w:rPr>
-              <w:t>06</w:t>
-            </w:r>
-            <w:r>
-              <w:rPr>
-                <w:rFonts w:ascii="Arial" w:hAnsi="Arial" w:cs="Arial"/>
-              </w:rPr>
-              <w:t>.0</w:t>
-            </w:r>
-            <w:r>
-              <w:rPr>
-                <w:rFonts w:ascii="Arial" w:hAnsi="Arial" w:cs="Arial"/>
-              </w:rPr>
-              <w:t>3</w:t>
-            </w:r>
-            <w:r>
-              <w:rPr>
-                <w:rFonts w:ascii="Arial" w:hAnsi="Arial" w:cs="Arial"/>
-              </w:rPr>
-              <w:t>.2026</w:t>
+              <w:t>06.03.2026</w:t>
             </w:r>
           </w:p>
         </w:tc>
@@ -5179,11 +5133,45 @@
                 <w:rFonts w:ascii="Arial" w:hAnsi="Arial" w:cs="Arial"/>
               </w:rPr>
             </w:pPr>
-            <w:r>
-              <w:rPr>
-                <w:rFonts w:ascii="Arial" w:hAnsi="Arial" w:cs="Arial"/>
-              </w:rPr>
-              <w:t>Tutti: stati nell’aula della Cereda a vedere le presentazioni degli altri.</w:t>
+            <w:proofErr w:type="spellStart"/>
+            <w:r>
+              <w:rPr>
+                <w:rFonts w:ascii="Arial" w:hAnsi="Arial" w:cs="Arial"/>
+              </w:rPr>
+              <w:t>Sidon</w:t>
+            </w:r>
+            <w:proofErr w:type="spellEnd"/>
+            <w:r>
+              <w:rPr>
+                <w:rFonts w:ascii="Arial" w:hAnsi="Arial" w:cs="Arial"/>
+              </w:rPr>
+              <w:t xml:space="preserve"> Quan e Ivan</w:t>
+            </w:r>
+            <w:r>
+              <w:rPr>
+                <w:rFonts w:ascii="Arial" w:hAnsi="Arial" w:cs="Arial"/>
+              </w:rPr>
+              <w:t xml:space="preserve">: stati nell’aula della Cereda </w:t>
+            </w:r>
+            <w:r>
+              <w:rPr>
+                <w:rFonts w:ascii="Arial" w:hAnsi="Arial" w:cs="Arial"/>
+              </w:rPr>
+              <w:t xml:space="preserve">a fare la teoria su gli </w:t>
+            </w:r>
+            <w:proofErr w:type="spellStart"/>
+            <w:r>
+              <w:rPr>
+                <w:rFonts w:ascii="Arial" w:hAnsi="Arial" w:cs="Arial"/>
+              </w:rPr>
+              <w:t>UserStory</w:t>
+            </w:r>
+            <w:proofErr w:type="spellEnd"/>
+            <w:r>
+              <w:rPr>
+                <w:rFonts w:ascii="Arial" w:hAnsi="Arial" w:cs="Arial"/>
+              </w:rPr>
+              <w:t xml:space="preserve"> </w:t>
             </w:r>
           </w:p>
         </w:tc>
@@ -5223,83 +5211,88 @@
               <w:rPr>
                 <w:rFonts w:ascii="Arial" w:hAnsi="Arial" w:cs="Arial"/>
               </w:rPr>
-              <w:t xml:space="preserve">Quan: lavoro sulle </w:t>
+              <w:t xml:space="preserve">Quan: </w:t>
+            </w:r>
+            <w:r>
+              <w:rPr>
+                <w:rFonts w:ascii="Arial" w:hAnsi="Arial" w:cs="Arial"/>
+              </w:rPr>
+              <w:t xml:space="preserve">Corretto </w:t>
             </w:r>
             <w:proofErr w:type="spellStart"/>
             <w:r>
               <w:rPr>
                 <w:rFonts w:ascii="Arial" w:hAnsi="Arial" w:cs="Arial"/>
               </w:rPr>
-              <w:t>sprite</w:t>
+              <w:t>UseCase</w:t>
             </w:r>
             <w:proofErr w:type="spellEnd"/>
             <w:r>
               <w:rPr>
                 <w:rFonts w:ascii="Arial" w:hAnsi="Arial" w:cs="Arial"/>
               </w:rPr>
-              <w:t xml:space="preserve"> delle impostazioni</w:t>
-            </w:r>
-          </w:p>
-          <w:p>
-            <w:pPr>
-              <w:rPr>
-                <w:rFonts w:ascii="Arial" w:hAnsi="Arial" w:cs="Arial"/>
-              </w:rPr>
-            </w:pPr>
-            <w:r>
-              <w:rPr>
-                <w:rFonts w:ascii="Arial" w:hAnsi="Arial" w:cs="Arial"/>
-              </w:rPr>
-              <w:t xml:space="preserve">Yasser: lavoro sulle </w:t>
+              <w:t xml:space="preserve"> e </w:t>
             </w:r>
             <w:proofErr w:type="spellStart"/>
             <w:r>
               <w:rPr>
                 <w:rFonts w:ascii="Arial" w:hAnsi="Arial" w:cs="Arial"/>
               </w:rPr>
-              <w:t>sprite</w:t>
+              <w:t>Swimlane</w:t>
             </w:r>
             <w:proofErr w:type="spellEnd"/>
-            <w:r>
-              <w:rPr>
-                <w:rFonts w:ascii="Arial" w:hAnsi="Arial" w:cs="Arial"/>
-              </w:rPr>
-              <w:t xml:space="preserve"> delle schermate </w:t>
+          </w:p>
+          <w:p>
+            <w:pPr>
+              <w:rPr>
+                <w:rFonts w:ascii="Arial" w:hAnsi="Arial" w:cs="Arial"/>
+              </w:rPr>
+            </w:pPr>
+            <w:r>
+              <w:rPr>
+                <w:rFonts w:ascii="Arial" w:hAnsi="Arial" w:cs="Arial"/>
+              </w:rPr>
+              <w:t xml:space="preserve">Yasser: </w:t>
+            </w:r>
+            <w:r>
+              <w:rPr>
+                <w:rFonts w:ascii="Arial" w:hAnsi="Arial" w:cs="Arial"/>
+              </w:rPr>
+              <w:t xml:space="preserve">Teoria su gli </w:t>
             </w:r>
             <w:proofErr w:type="spellStart"/>
             <w:r>
               <w:rPr>
                 <w:rFonts w:ascii="Arial" w:hAnsi="Arial" w:cs="Arial"/>
               </w:rPr>
-              <w:t>pre</w:t>
+              <w:t>UserStory</w:t>
             </w:r>
             <w:proofErr w:type="spellEnd"/>
             <w:r>
               <w:rPr>
                 <w:rFonts w:ascii="Arial" w:hAnsi="Arial" w:cs="Arial"/>
               </w:rPr>
-              <w:t>-partita (scegliere mappa e personaggio)</w:t>
-            </w:r>
-          </w:p>
-          <w:p>
-            <w:pPr>
-              <w:rPr>
-                <w:rFonts w:ascii="Arial" w:hAnsi="Arial" w:cs="Arial"/>
-              </w:rPr>
-            </w:pPr>
-            <w:r>
-              <w:rPr>
-                <w:rFonts w:ascii="Arial" w:hAnsi="Arial" w:cs="Arial"/>
-              </w:rPr>
-              <w:t>Ivan: Finito schermata principale</w:t>
-            </w:r>
-          </w:p>
-          <w:p>
-            <w:pPr>
-              <w:rPr>
-                <w:rFonts w:ascii="Arial" w:hAnsi="Arial" w:cs="Arial"/>
-              </w:rPr>
-            </w:pPr>
+              <w:t xml:space="preserve"> da Petrini</w:t>
+            </w:r>
+          </w:p>
+          <w:p>
+            <w:pPr>
+              <w:rPr>
+                <w:rFonts w:ascii="Arial" w:hAnsi="Arial" w:cs="Arial"/>
+              </w:rPr>
+            </w:pPr>
+            <w:r>
+              <w:rPr>
+                <w:rFonts w:ascii="Arial" w:hAnsi="Arial" w:cs="Arial"/>
+              </w:rPr>
+              <w:t>Ivan</w:t>
+            </w:r>
+            <w:r>
+              <w:rPr>
+                <w:rFonts w:ascii="Arial" w:hAnsi="Arial" w:cs="Arial"/>
+              </w:rPr>
+              <w:t xml:space="preserve"> e </w:t>
+            </w:r>
             <w:proofErr w:type="spellStart"/>
             <w:r>
               <w:rPr>
@@ -5312,21 +5305,27 @@
               <w:rPr>
                 <w:rFonts w:ascii="Arial" w:hAnsi="Arial" w:cs="Arial"/>
               </w:rPr>
-              <w:t xml:space="preserve">: Miglioramento </w:t>
+              <w:t xml:space="preserve">: </w:t>
+            </w:r>
+            <w:r>
+              <w:rPr>
+                <w:rFonts w:ascii="Arial" w:hAnsi="Arial" w:cs="Arial"/>
+              </w:rPr>
+              <w:t xml:space="preserve">Fatto e finito le </w:t>
             </w:r>
             <w:proofErr w:type="spellStart"/>
             <w:r>
               <w:rPr>
                 <w:rFonts w:ascii="Arial" w:hAnsi="Arial" w:cs="Arial"/>
               </w:rPr>
-              <w:t>Gantt</w:t>
+              <w:t>UserStory</w:t>
             </w:r>
             <w:proofErr w:type="spellEnd"/>
             <w:r>
               <w:rPr>
                 <w:rFonts w:ascii="Arial" w:hAnsi="Arial" w:cs="Arial"/>
               </w:rPr>
-              <w:t xml:space="preserve"> e inizio schermata wiki</w:t>
+              <w:t xml:space="preserve"> e i criteri d’accettazione</w:t>
             </w:r>
           </w:p>
         </w:tc>
@@ -5367,85 +5366,7 @@
               <w:rPr>
                 <w:rFonts w:ascii="Arial" w:hAnsi="Arial" w:cs="Arial"/>
               </w:rPr>
-              <w:t>Ivan: Creazione delle mappe</w:t>
-            </w:r>
-          </w:p>
-          <w:p>
-            <w:pPr>
-              <w:jc w:val="both"/>
-              <w:rPr>
-                <w:rFonts w:ascii="Arial" w:hAnsi="Arial" w:cs="Arial"/>
-              </w:rPr>
-            </w:pPr>
-            <w:r>
-              <w:rPr>
-                <w:rFonts w:ascii="Arial" w:hAnsi="Arial" w:cs="Arial"/>
-              </w:rPr>
-              <w:t xml:space="preserve">Quan: Lavoro sulle </w:t>
-            </w:r>
-            <w:proofErr w:type="spellStart"/>
-            <w:r>
-              <w:rPr>
-                <w:rFonts w:ascii="Arial" w:hAnsi="Arial" w:cs="Arial"/>
-              </w:rPr>
-              <w:t>sprite</w:t>
-            </w:r>
-            <w:proofErr w:type="spellEnd"/>
-            <w:r>
-              <w:rPr>
-                <w:rFonts w:ascii="Arial" w:hAnsi="Arial" w:cs="Arial"/>
-              </w:rPr>
-              <w:t xml:space="preserve"> delle impostazioni</w:t>
-            </w:r>
-          </w:p>
-          <w:p>
-            <w:pPr>
-              <w:jc w:val="both"/>
-              <w:rPr>
-                <w:rFonts w:ascii="Arial" w:hAnsi="Arial" w:cs="Arial"/>
-              </w:rPr>
-            </w:pPr>
-            <w:r>
-              <w:rPr>
-                <w:rFonts w:ascii="Arial" w:hAnsi="Arial" w:cs="Arial"/>
-              </w:rPr>
-              <w:t xml:space="preserve">Yasser: Finito schermate </w:t>
-            </w:r>
-            <w:proofErr w:type="spellStart"/>
-            <w:r>
-              <w:rPr>
-                <w:rFonts w:ascii="Arial" w:hAnsi="Arial" w:cs="Arial"/>
-              </w:rPr>
-              <w:t>pre</w:t>
-            </w:r>
-            <w:proofErr w:type="spellEnd"/>
-            <w:r>
-              <w:rPr>
-                <w:rFonts w:ascii="Arial" w:hAnsi="Arial" w:cs="Arial"/>
-              </w:rPr>
-              <w:t>-partita</w:t>
-            </w:r>
-          </w:p>
-          <w:p>
-            <w:pPr>
-              <w:jc w:val="both"/>
-              <w:rPr>
-                <w:rFonts w:ascii="Arial" w:hAnsi="Arial" w:cs="Arial"/>
-              </w:rPr>
-            </w:pPr>
-            <w:proofErr w:type="spellStart"/>
-            <w:r>
-              <w:rPr>
-                <w:rFonts w:ascii="Arial" w:hAnsi="Arial" w:cs="Arial"/>
-              </w:rPr>
-              <w:t>Sidon</w:t>
-            </w:r>
-            <w:proofErr w:type="spellEnd"/>
-            <w:r>
-              <w:rPr>
-                <w:rFonts w:ascii="Arial" w:hAnsi="Arial" w:cs="Arial"/>
-              </w:rPr>
-              <w:t>: Lavoro sulla schermata wiki</w:t>
+              <w:t xml:space="preserve">Tutti: Fare gli Sprite </w:t>
             </w:r>
           </w:p>
         </w:tc>
@@ -5485,68 +5406,21 @@
               <w:rPr>
                 <w:rFonts w:ascii="Arial" w:hAnsi="Arial" w:cs="Arial"/>
               </w:rPr>
-              <w:t xml:space="preserve">Quan: Lavoro sulle </w:t>
+              <w:t xml:space="preserve">Tutti: Creato Progetto </w:t>
             </w:r>
             <w:proofErr w:type="spellStart"/>
             <w:r>
               <w:rPr>
                 <w:rFonts w:ascii="Arial" w:hAnsi="Arial" w:cs="Arial"/>
               </w:rPr>
-              <w:t>sprite</w:t>
+              <w:t>Unity</w:t>
             </w:r>
             <w:proofErr w:type="spellEnd"/>
             <w:r>
               <w:rPr>
                 <w:rFonts w:ascii="Arial" w:hAnsi="Arial" w:cs="Arial"/>
               </w:rPr>
-              <w:t xml:space="preserve"> delle impostazioni</w:t>
-            </w:r>
-          </w:p>
-          <w:p>
-            <w:pPr>
-              <w:rPr>
-                <w:rFonts w:ascii="Arial" w:hAnsi="Arial" w:cs="Arial"/>
-              </w:rPr>
-            </w:pPr>
-            <w:r>
-              <w:rPr>
-                <w:rFonts w:ascii="Arial" w:hAnsi="Arial" w:cs="Arial"/>
-              </w:rPr>
-              <w:t>Yasser: Scrittura documentazione</w:t>
-            </w:r>
-          </w:p>
-          <w:p>
-            <w:pPr>
-              <w:rPr>
-                <w:rFonts w:ascii="Arial" w:hAnsi="Arial" w:cs="Arial"/>
-              </w:rPr>
-            </w:pPr>
-            <w:r>
-              <w:rPr>
-                <w:rFonts w:ascii="Arial" w:hAnsi="Arial" w:cs="Arial"/>
-              </w:rPr>
-              <w:t>Ivan: Finito tutte le mappe</w:t>
-            </w:r>
-          </w:p>
-          <w:p>
-            <w:pPr>
-              <w:rPr>
-                <w:rFonts w:ascii="Arial" w:hAnsi="Arial" w:cs="Arial"/>
-              </w:rPr>
-            </w:pPr>
-            <w:proofErr w:type="spellStart"/>
-            <w:r>
-              <w:rPr>
-                <w:rFonts w:ascii="Arial" w:hAnsi="Arial" w:cs="Arial"/>
-              </w:rPr>
-              <w:t>Sidon</w:t>
-            </w:r>
-            <w:proofErr w:type="spellEnd"/>
-            <w:r>
-              <w:rPr>
-                <w:rFonts w:ascii="Arial" w:hAnsi="Arial" w:cs="Arial"/>
-              </w:rPr>
-              <w:t>: Lavoro sulla schermata wiki</w:t>
+              <w:t xml:space="preserve"> e capito come condividere su GitHub</w:t>
             </w:r>
           </w:p>
         </w:tc>
@@ -5613,64 +5487,26 @@
                 <w:rFonts w:ascii="Arial" w:hAnsi="Arial" w:cs="Arial"/>
               </w:rPr>
             </w:pPr>
+            <w:r>
+              <w:rPr>
+                <w:rFonts w:ascii="Arial" w:hAnsi="Arial" w:cs="Arial"/>
+              </w:rPr>
+              <w:t xml:space="preserve">Non riuscivamo a capire come si potesse lavorare contemporaneamente allo stesso progetto di </w:t>
+            </w:r>
             <w:proofErr w:type="spellStart"/>
-            <w:proofErr w:type="gramStart"/>
-            <w:r>
-              <w:rPr>
-                <w:rFonts w:ascii="Arial" w:hAnsi="Arial" w:cs="Arial"/>
-              </w:rPr>
-              <w:t>UserStory</w:t>
+            <w:r>
+              <w:rPr>
+                <w:rFonts w:ascii="Arial" w:hAnsi="Arial" w:cs="Arial"/>
+              </w:rPr>
+              <w:t>Unity</w:t>
             </w:r>
             <w:proofErr w:type="spellEnd"/>
             <w:r>
               <w:rPr>
                 <w:rFonts w:ascii="Arial" w:hAnsi="Arial" w:cs="Arial"/>
               </w:rPr>
-              <w:t xml:space="preserve"> :</w:t>
-            </w:r>
-            <w:proofErr w:type="gramEnd"/>
-            <w:r>
-              <w:rPr>
-                <w:rFonts w:ascii="Arial" w:hAnsi="Arial" w:cs="Arial"/>
-              </w:rPr>
-              <w:t xml:space="preserve"> tutti, Quan: </w:t>
-            </w:r>
-            <w:proofErr w:type="spellStart"/>
-            <w:r>
-              <w:rPr>
-                <w:rFonts w:ascii="Arial" w:hAnsi="Arial" w:cs="Arial"/>
-              </w:rPr>
-              <w:t>UseCase,Swimnlane</w:t>
-            </w:r>
-            <w:proofErr w:type="spellEnd"/>
-            <w:r>
-              <w:rPr>
-                <w:rFonts w:ascii="Arial" w:hAnsi="Arial" w:cs="Arial"/>
-              </w:rPr>
-              <w:t xml:space="preserve"> e altri </w:t>
-            </w:r>
-            <w:proofErr w:type="spellStart"/>
-            <w:r>
-              <w:rPr>
-                <w:rFonts w:ascii="Arial" w:hAnsi="Arial" w:cs="Arial"/>
-              </w:rPr>
-              <w:t>sprite</w:t>
-            </w:r>
-            <w:proofErr w:type="spellEnd"/>
-            <w:r>
-              <w:rPr>
-                <w:rFonts w:ascii="Arial" w:hAnsi="Arial" w:cs="Arial"/>
-              </w:rPr>
-              <w:t xml:space="preserve">. Bonus; iniziare </w:t>
-            </w:r>
-            <w:proofErr w:type="spellStart"/>
-            <w:r>
-              <w:rPr>
-                <w:rFonts w:ascii="Arial" w:hAnsi="Arial" w:cs="Arial"/>
-              </w:rPr>
-              <w:t>unity</w:t>
-            </w:r>
-            <w:proofErr w:type="spellEnd"/>
+              <w:t>. Alla fine abbiamo fatto un po’ di test per capire come lavorare al meglio e abbiamo trovato la nostra soluzione. Soluzione che consiste nel lavorare in diversi scenari.</w:t>
+            </w:r>
           </w:p>
         </w:tc>
       </w:tr>
@@ -5740,35 +5576,7 @@
               <w:rPr>
                 <w:rFonts w:ascii="Arial" w:hAnsi="Arial" w:cs="Arial"/>
               </w:rPr>
-              <w:t xml:space="preserve">Il punto della situazione è buono tranne per il fatto che dobbiamo ancora aggiustare la </w:t>
-            </w:r>
-            <w:proofErr w:type="spellStart"/>
-            <w:r>
-              <w:rPr>
-                <w:rFonts w:ascii="Arial" w:hAnsi="Arial" w:cs="Arial"/>
-              </w:rPr>
-              <w:t>swimlane</w:t>
-            </w:r>
-            <w:proofErr w:type="spellEnd"/>
-            <w:r>
-              <w:rPr>
-                <w:rFonts w:ascii="Arial" w:hAnsi="Arial" w:cs="Arial"/>
-              </w:rPr>
-              <w:t xml:space="preserve"> e </w:t>
-            </w:r>
-            <w:proofErr w:type="gramStart"/>
-            <w:r>
-              <w:rPr>
-                <w:rFonts w:ascii="Arial" w:hAnsi="Arial" w:cs="Arial"/>
-              </w:rPr>
-              <w:t>i use</w:t>
-            </w:r>
-            <w:proofErr w:type="gramEnd"/>
-            <w:r>
-              <w:rPr>
-                <w:rFonts w:ascii="Arial" w:hAnsi="Arial" w:cs="Arial"/>
-              </w:rPr>
-              <w:t xml:space="preserve"> case</w:t>
+              <w:t>Perfettamente in linea con la pianificazione</w:t>
             </w:r>
           </w:p>
         </w:tc>
@@ -5839,16 +5647,22 @@
               <w:rPr>
                 <w:rFonts w:ascii="Arial" w:hAnsi="Arial" w:cs="Arial"/>
               </w:rPr>
-              <w:t xml:space="preserve">Finire tutti gli </w:t>
+              <w:t xml:space="preserve">Presentare e iniziare su </w:t>
             </w:r>
             <w:proofErr w:type="spellStart"/>
             <w:r>
               <w:rPr>
                 <w:rFonts w:ascii="Arial" w:hAnsi="Arial" w:cs="Arial"/>
               </w:rPr>
-              <w:t>sprite</w:t>
+              <w:t>unity</w:t>
             </w:r>
             <w:proofErr w:type="spellEnd"/>
+            <w:r>
+              <w:rPr>
+                <w:rFonts w:ascii="Arial" w:hAnsi="Arial" w:cs="Arial"/>
+              </w:rPr>
+              <w:t xml:space="preserve"> i movimenti base del player</w:t>
+            </w:r>
           </w:p>
         </w:tc>
       </w:tr>
@@ -5949,193 +5763,63 @@
               <w:rPr>
                 <w:rFonts w:ascii="Arial" w:hAnsi="Arial" w:cs="Arial"/>
               </w:rPr>
-              <w:t xml:space="preserve">Oggi dobbiamo fare tutti i </w:t>
+              <w:t xml:space="preserve">Abbiamo deciso che oggi Quan dovrà correggere </w:t>
             </w:r>
             <w:proofErr w:type="spellStart"/>
             <w:r>
               <w:rPr>
                 <w:rFonts w:ascii="Arial" w:hAnsi="Arial" w:cs="Arial"/>
               </w:rPr>
-              <w:t>mockup</w:t>
+              <w:t>Swimlane</w:t>
             </w:r>
             <w:proofErr w:type="spellEnd"/>
             <w:r>
               <w:rPr>
                 <w:rFonts w:ascii="Arial" w:hAnsi="Arial" w:cs="Arial"/>
               </w:rPr>
-              <w:t xml:space="preserve"> e aggiustare i requisiti, test case, use case, </w:t>
+              <w:t xml:space="preserve"> e </w:t>
             </w:r>
             <w:proofErr w:type="spellStart"/>
             <w:r>
               <w:rPr>
                 <w:rFonts w:ascii="Arial" w:hAnsi="Arial" w:cs="Arial"/>
               </w:rPr>
-              <w:t>swimlane</w:t>
+              <w:t>UseCase</w:t>
             </w:r>
             <w:proofErr w:type="spellEnd"/>
             <w:r>
               <w:rPr>
                 <w:rFonts w:ascii="Arial" w:hAnsi="Arial" w:cs="Arial"/>
               </w:rPr>
-              <w:t xml:space="preserve"> e </w:t>
+              <w:t xml:space="preserve"> inerenti alle modifiche richieste, </w:t>
             </w:r>
             <w:proofErr w:type="spellStart"/>
             <w:r>
               <w:rPr>
                 <w:rFonts w:ascii="Arial" w:hAnsi="Arial" w:cs="Arial"/>
               </w:rPr>
-              <w:t>Gantt</w:t>
+              <w:t>Sidon</w:t>
             </w:r>
             <w:proofErr w:type="spellEnd"/>
             <w:r>
               <w:rPr>
                 <w:rFonts w:ascii="Arial" w:hAnsi="Arial" w:cs="Arial"/>
               </w:rPr>
+              <w:t xml:space="preserve"> e Ivan intanto dovranno fare gli User Story e Yasser recupererà la teoria da Petrini che gli altri hanno fatto prima. Una volta che tutti avremmo finito queste attività passeremmo insieme a fare gli </w:t>
+            </w:r>
+            <w:proofErr w:type="spellStart"/>
+            <w:r>
+              <w:rPr>
+                <w:rFonts w:ascii="Arial" w:hAnsi="Arial" w:cs="Arial"/>
+              </w:rPr>
+              <w:t>sprite</w:t>
+            </w:r>
+            <w:proofErr w:type="spellEnd"/>
+            <w:r>
+              <w:rPr>
+                <w:rFonts w:ascii="Arial" w:hAnsi="Arial" w:cs="Arial"/>
+              </w:rPr>
               <w:t>.</w:t>
-            </w:r>
-          </w:p>
-          <w:p>
-            <w:pPr>
-              <w:rPr>
-                <w:rFonts w:ascii="Arial" w:hAnsi="Arial" w:cs="Arial"/>
-              </w:rPr>
-            </w:pPr>
-            <w:r>
-              <w:rPr>
-                <w:rFonts w:ascii="Arial" w:hAnsi="Arial" w:cs="Arial"/>
-              </w:rPr>
-              <w:t xml:space="preserve">Quan: </w:t>
-            </w:r>
-            <w:proofErr w:type="spellStart"/>
-            <w:r>
-              <w:rPr>
-                <w:rFonts w:ascii="Arial" w:hAnsi="Arial" w:cs="Arial"/>
-              </w:rPr>
-              <w:t>mockup</w:t>
-            </w:r>
-            <w:proofErr w:type="spellEnd"/>
-            <w:r>
-              <w:rPr>
-                <w:rFonts w:ascii="Arial" w:hAnsi="Arial" w:cs="Arial"/>
-              </w:rPr>
-              <w:t xml:space="preserve"> impostazioni, aggiustare </w:t>
-            </w:r>
-            <w:proofErr w:type="spellStart"/>
-            <w:r>
-              <w:rPr>
-                <w:rFonts w:ascii="Arial" w:hAnsi="Arial" w:cs="Arial"/>
-              </w:rPr>
-              <w:t>swimlane</w:t>
-            </w:r>
-            <w:proofErr w:type="spellEnd"/>
-            <w:r>
-              <w:rPr>
-                <w:rFonts w:ascii="Arial" w:hAnsi="Arial" w:cs="Arial"/>
-              </w:rPr>
-              <w:t xml:space="preserve"> e use case</w:t>
-            </w:r>
-          </w:p>
-          <w:p>
-            <w:pPr>
-              <w:rPr>
-                <w:rFonts w:ascii="Arial" w:hAnsi="Arial" w:cs="Arial"/>
-              </w:rPr>
-            </w:pPr>
-            <w:proofErr w:type="spellStart"/>
-            <w:r>
-              <w:rPr>
-                <w:rFonts w:ascii="Arial" w:hAnsi="Arial" w:cs="Arial"/>
-              </w:rPr>
-              <w:t>Sidon</w:t>
-            </w:r>
-            <w:proofErr w:type="spellEnd"/>
-            <w:r>
-              <w:rPr>
-                <w:rFonts w:ascii="Arial" w:hAnsi="Arial" w:cs="Arial"/>
-              </w:rPr>
-              <w:t xml:space="preserve">: Aggiustare </w:t>
-            </w:r>
-            <w:proofErr w:type="spellStart"/>
-            <w:r>
-              <w:rPr>
-                <w:rFonts w:ascii="Arial" w:hAnsi="Arial" w:cs="Arial"/>
-              </w:rPr>
-              <w:t>gantt</w:t>
-            </w:r>
-            <w:proofErr w:type="spellEnd"/>
-            <w:r>
-              <w:rPr>
-                <w:rFonts w:ascii="Arial" w:hAnsi="Arial" w:cs="Arial"/>
-              </w:rPr>
-              <w:t xml:space="preserve">, fare </w:t>
-            </w:r>
-            <w:proofErr w:type="spellStart"/>
-            <w:r>
-              <w:rPr>
-                <w:rFonts w:ascii="Arial" w:hAnsi="Arial" w:cs="Arial"/>
-              </w:rPr>
-              <w:t>mockup</w:t>
-            </w:r>
-            <w:proofErr w:type="spellEnd"/>
-            <w:r>
-              <w:rPr>
-                <w:rFonts w:ascii="Arial" w:hAnsi="Arial" w:cs="Arial"/>
-              </w:rPr>
-              <w:t xml:space="preserve"> wiki e risultati</w:t>
-            </w:r>
-          </w:p>
-          <w:p>
-            <w:pPr>
-              <w:rPr>
-                <w:rFonts w:ascii="Arial" w:hAnsi="Arial" w:cs="Arial"/>
-              </w:rPr>
-            </w:pPr>
-            <w:r>
-              <w:rPr>
-                <w:rFonts w:ascii="Arial" w:hAnsi="Arial" w:cs="Arial"/>
-              </w:rPr>
-              <w:t>Ivan: tutte le mappe e schermata principale</w:t>
-            </w:r>
-          </w:p>
-          <w:p>
-            <w:pPr>
-              <w:rPr>
-                <w:rFonts w:ascii="Arial" w:hAnsi="Arial" w:cs="Arial"/>
-              </w:rPr>
-            </w:pPr>
-            <w:r>
-              <w:rPr>
-                <w:rFonts w:ascii="Arial" w:hAnsi="Arial" w:cs="Arial"/>
-              </w:rPr>
-              <w:t xml:space="preserve">Yasser: modificare requisiti, test case e fare </w:t>
-            </w:r>
-            <w:proofErr w:type="spellStart"/>
-            <w:r>
-              <w:rPr>
-                <w:rFonts w:ascii="Arial" w:hAnsi="Arial" w:cs="Arial"/>
-              </w:rPr>
-              <w:t>mockup</w:t>
-            </w:r>
-            <w:proofErr w:type="spellEnd"/>
-            <w:r>
-              <w:rPr>
-                <w:rFonts w:ascii="Arial" w:hAnsi="Arial" w:cs="Arial"/>
-              </w:rPr>
-              <w:t xml:space="preserve"> </w:t>
-            </w:r>
-            <w:proofErr w:type="spellStart"/>
-            <w:r>
-              <w:rPr>
-                <w:rFonts w:ascii="Arial" w:hAnsi="Arial" w:cs="Arial"/>
-              </w:rPr>
-              <w:t>pre</w:t>
-            </w:r>
-            <w:proofErr w:type="spellEnd"/>
-            <w:r>
-              <w:rPr>
-                <w:rFonts w:ascii="Arial" w:hAnsi="Arial" w:cs="Arial"/>
-              </w:rPr>
-              <w:t xml:space="preserve"> partita</w:t>
             </w:r>
           </w:p>
         </w:tc>
@@ -10715,6 +10399,27 @@
 </file>
 
 <file path=customXml/item1.xml><?xml version="1.0" encoding="utf-8"?>
+<?mso-contentType ?>
+<FormTemplates xmlns="http://schemas.microsoft.com/sharepoint/v3/contenttype/forms">
+  <Display>DocumentLibraryForm</Display>
+  <Edit>DocumentLibraryForm</Edit>
+  <New>DocumentLibraryForm</New>
+</FormTemplates>
+</file>
+
+<file path=customXml/item2.xml><?xml version="1.0" encoding="utf-8"?>
+<p:properties xmlns:p="http://schemas.microsoft.com/office/2006/metadata/properties" xmlns:xsi="http://www.w3.org/2001/XMLSchema-instance" xmlns:pc="http://schemas.microsoft.com/office/infopath/2007/PartnerControls">
+  <documentManagement>
+    <_activity xmlns="9a5989ba-1f3a-4074-8e62-988f1f5a6d91" xsi:nil="true"/>
+  </documentManagement>
+</p:properties>
+</file>
+
+<file path=customXml/item3.xml><?xml version="1.0" encoding="utf-8"?>
+<b:Sources xmlns:b="http://schemas.openxmlformats.org/officeDocument/2006/bibliography" xmlns="http://schemas.openxmlformats.org/officeDocument/2006/bibliography" SelectedStyle="\APA.XSL" StyleName="APA"/>
+</file>
+
+<file path=customXml/item4.xml><?xml version="1.0" encoding="utf-8"?>
 <ct:contentTypeSchema xmlns:ct="http://schemas.microsoft.com/office/2006/metadata/contentType" xmlns:ma="http://schemas.microsoft.com/office/2006/metadata/properties/metaAttributes" ct:_="" ma:_="" ma:contentTypeName="Documento" ma:contentTypeID="0x0101001D68984F87EC994ABE7B851987432E7B" ma:contentTypeVersion="13" ma:contentTypeDescription="Creare un nuovo documento." ma:contentTypeScope="" ma:versionID="9735a29966f8059e51308ea1cecd41eb">
   <xsd:schema xmlns:xsd="http://www.w3.org/2001/XMLSchema" xmlns:xs="http://www.w3.org/2001/XMLSchema" xmlns:p="http://schemas.microsoft.com/office/2006/metadata/properties" xmlns:ns3="d8eed4e0-1c4d-4eb7-9d5a-8c6be5a7f7cc" xmlns:ns4="9a5989ba-1f3a-4074-8e62-988f1f5a6d91" targetNamespace="http://schemas.microsoft.com/office/2006/metadata/properties" ma:root="true" ma:fieldsID="10fd3cb04b3c10d561cc1ece84de1cfd" ns3:_="" ns4:_="">
     <xsd:import namespace="d8eed4e0-1c4d-4eb7-9d5a-8c6be5a7f7cc"/>
@@ -10935,28 +10640,33 @@
 </ct:contentTypeSchema>
 </file>
 
-<file path=customXml/item2.xml><?xml version="1.0" encoding="utf-8"?>
-<b:Sources xmlns:b="http://schemas.openxmlformats.org/officeDocument/2006/bibliography" xmlns="http://schemas.openxmlformats.org/officeDocument/2006/bibliography" SelectedStyle="\APA.XSL" StyleName="APA"/>
+<file path=customXml/itemProps1.xml><?xml version="1.0" encoding="utf-8"?>
+<ds:datastoreItem xmlns:ds="http://schemas.openxmlformats.org/officeDocument/2006/customXml" ds:itemID="{F88632BD-6596-4D41-8033-40DE95A98259}">
+  <ds:schemaRefs>
+    <ds:schemaRef ds:uri="http://schemas.microsoft.com/sharepoint/v3/contenttype/forms"/>
+  </ds:schemaRefs>
+</ds:datastoreItem>
 </file>
 
-<file path=customXml/item3.xml><?xml version="1.0" encoding="utf-8"?>
-<p:properties xmlns:p="http://schemas.microsoft.com/office/2006/metadata/properties" xmlns:xsi="http://www.w3.org/2001/XMLSchema-instance" xmlns:pc="http://schemas.microsoft.com/office/infopath/2007/PartnerControls">
-  <documentManagement>
-    <_activity xmlns="9a5989ba-1f3a-4074-8e62-988f1f5a6d91" xsi:nil="true"/>
-  </documentManagement>
-</p:properties>
+<file path=customXml/itemProps2.xml><?xml version="1.0" encoding="utf-8"?>
+<ds:datastoreItem xmlns:ds="http://schemas.openxmlformats.org/officeDocument/2006/customXml" ds:itemID="{4C5564E7-A054-43C4-BF74-7A145474E87C}">
+  <ds:schemaRefs>
+    <ds:schemaRef ds:uri="http://schemas.microsoft.com/office/2006/metadata/properties"/>
+    <ds:schemaRef ds:uri="http://schemas.microsoft.com/office/infopath/2007/PartnerControls"/>
+    <ds:schemaRef ds:uri="9a5989ba-1f3a-4074-8e62-988f1f5a6d91"/>
+  </ds:schemaRefs>
+</ds:datastoreItem>
 </file>
 
-<file path=customXml/item4.xml><?xml version="1.0" encoding="utf-8"?>
-<?mso-contentType ?>
-<FormTemplates xmlns="http://schemas.microsoft.com/sharepoint/v3/contenttype/forms">
-  <Display>DocumentLibraryForm</Display>
-  <Edit>DocumentLibraryForm</Edit>
-  <New>DocumentLibraryForm</New>
-</FormTemplates>
+<file path=customXml/itemProps3.xml><?xml version="1.0" encoding="utf-8"?>
+<ds:datastoreItem xmlns:ds="http://schemas.openxmlformats.org/officeDocument/2006/customXml" ds:itemID="{A4D352A7-3801-4E51-8ED0-E5F8E4A7EC31}">
+  <ds:schemaRefs>
+    <ds:schemaRef ds:uri="http://schemas.openxmlformats.org/officeDocument/2006/bibliography"/>
+  </ds:schemaRefs>
+</ds:datastoreItem>
 </file>
 
-<file path=customXml/itemProps1.xml><?xml version="1.0" encoding="utf-8"?>
+<file path=customXml/itemProps4.xml><?xml version="1.0" encoding="utf-8"?>
 <ds:datastoreItem xmlns:ds="http://schemas.openxmlformats.org/officeDocument/2006/customXml" ds:itemID="{DF47FB3B-BE2E-4282-A583-D09F8A90D7A9}">
   <ds:schemaRefs>
     <ds:schemaRef ds:uri="http://schemas.microsoft.com/office/2006/metadata/contentType"/>
@@ -10973,30 +10683,4 @@
     <ds:schemaRef ds:uri="http://schemas.microsoft.com/internal/obd"/>
   </ds:schemaRefs>
 </ds:datastoreItem>
-</file>
-
-<file path=customXml/itemProps2.xml><?xml version="1.0" encoding="utf-8"?>
-<ds:datastoreItem xmlns:ds="http://schemas.openxmlformats.org/officeDocument/2006/customXml" ds:itemID="{A4D352A7-3801-4E51-8ED0-E5F8E4A7EC31}">
-  <ds:schemaRefs>
-    <ds:schemaRef ds:uri="http://schemas.openxmlformats.org/officeDocument/2006/bibliography"/>
-  </ds:schemaRefs>
-</ds:datastoreItem>
-</file>
-
-<file path=customXml/itemProps3.xml><?xml version="1.0" encoding="utf-8"?>
-<ds:datastoreItem xmlns:ds="http://schemas.openxmlformats.org/officeDocument/2006/customXml" ds:itemID="{4C5564E7-A054-43C4-BF74-7A145474E87C}">
-  <ds:schemaRefs>
-    <ds:schemaRef ds:uri="http://schemas.microsoft.com/office/2006/metadata/properties"/>
-    <ds:schemaRef ds:uri="http://schemas.microsoft.com/office/infopath/2007/PartnerControls"/>
-    <ds:schemaRef ds:uri="9a5989ba-1f3a-4074-8e62-988f1f5a6d91"/>
-  </ds:schemaRefs>
-</ds:datastoreItem>
-</file>
-
-<file path=customXml/itemProps4.xml><?xml version="1.0" encoding="utf-8"?>
-<ds:datastoreItem xmlns:ds="http://schemas.openxmlformats.org/officeDocument/2006/customXml" ds:itemID="{F88632BD-6596-4D41-8033-40DE95A98259}">
-  <ds:schemaRefs>
-    <ds:schemaRef ds:uri="http://schemas.microsoft.com/sharepoint/v3/contenttype/forms"/>
-  </ds:schemaRefs>
-</ds:datastoreItem>
 </file>
</xml_diff>